<commit_message>
add tag API  , AUTH  API"
</commit_message>
<xml_diff>
--- a/API Layer.docx
+++ b/API Layer.docx
@@ -3,8 +3,2543 @@
 <w:document xmlns:wpc="http://schemas.microsoft.com/office/word/2010/wordprocessingCanvas" xmlns:cx="http://schemas.microsoft.com/office/drawing/2014/chartex" xmlns:cx1="http://schemas.microsoft.com/office/drawing/2015/9/8/chartex" xmlns:mc="http://schemas.openxmlformats.org/markup-compatibility/2006" xmlns:o="urn:schemas-microsoft-com:office:office" xmlns:r="http://schemas.openxmlformats.org/officeDocument/2006/relationships" xmlns:m="http://schemas.openxmlformats.org/officeDocument/2006/math" xmlns:v="urn:schemas-microsoft-com:vml" xmlns:wp14="http://schemas.microsoft.com/office/word/2010/wordprocessingDrawing" xmlns:wp="http://schemas.openxmlformats.org/drawingml/2006/wordprocessingDrawing" xmlns:w10="urn:schemas-microsoft-com:office:word" xmlns:w="http://schemas.openxmlformats.org/wordprocessingml/2006/main" xmlns:w14="http://schemas.microsoft.com/office/word/2010/wordml" xmlns:w15="http://schemas.microsoft.com/office/word/2012/wordml" xmlns:w16se="http://schemas.microsoft.com/office/word/2015/wordml/symex" xmlns:wpg="http://schemas.microsoft.com/office/word/2010/wordprocessingGroup" xmlns:wpi="http://schemas.microsoft.com/office/word/2010/wordprocessingInk" xmlns:wne="http://schemas.microsoft.com/office/word/2006/wordml" xmlns:wps="http://schemas.microsoft.com/office/word/2010/wordprocessingShape" mc:Ignorable="w14 w15 w16se wp14">
   <w:body>
     <w:p>
+      <w:pPr>
+        <w:rPr>
+          <w:rtl/>
+        </w:rPr>
+      </w:pPr>
       <w:bookmarkStart w:id="0" w:name="_GoBack"/>
       <w:bookmarkEnd w:id="0"/>
+    </w:p>
+    <w:p>
+      <w:pPr>
+        <w:pStyle w:val="Heading1"/>
+        <w:bidi/>
+        <w:rPr>
+          <w:rtl/>
+        </w:rPr>
+      </w:pPr>
+    </w:p>
+    <w:p>
+      <w:pPr>
+        <w:pStyle w:val="Heading1"/>
+        <w:bidi/>
+        <w:rPr>
+          <w:rtl/>
+        </w:rPr>
+      </w:pPr>
+      <w:r>
+        <w:rPr>
+          <w:rtl/>
+        </w:rPr>
+        <w:t>وضع</w:t>
+      </w:r>
+      <w:r>
+        <w:rPr>
+          <w:rFonts w:hint="cs"/>
+          <w:rtl/>
+        </w:rPr>
+        <w:t>ی</w:t>
+      </w:r>
+      <w:r>
+        <w:rPr>
+          <w:rFonts w:hint="eastAsia"/>
+          <w:rtl/>
+        </w:rPr>
+        <w:t>ت</w:t>
+      </w:r>
+      <w:r>
+        <w:rPr>
+          <w:rtl/>
+        </w:rPr>
+        <w:t xml:space="preserve"> فعل</w:t>
+      </w:r>
+      <w:r>
+        <w:rPr>
+          <w:rFonts w:hint="cs"/>
+          <w:rtl/>
+        </w:rPr>
+        <w:t>ی</w:t>
+      </w:r>
+      <w:r>
+        <w:rPr>
+          <w:rtl/>
+        </w:rPr>
+        <w:t xml:space="preserve"> پروژه</w:t>
+      </w:r>
+    </w:p>
+    <w:p>
+      <w:pPr>
+        <w:bidi/>
+        <w:rPr>
+          <w:rFonts w:cs="Arial"/>
+          <w:rtl/>
+        </w:rPr>
+      </w:pPr>
+    </w:p>
+    <w:p>
+      <w:pPr>
+        <w:pStyle w:val="Heading1"/>
+        <w:bidi/>
+      </w:pPr>
+      <w:r>
+        <w:rPr>
+          <w:rFonts w:ascii="Segoe UI Symbol" w:hAnsi="Segoe UI Symbol" w:cs="Segoe UI Symbol" w:hint="cs"/>
+          <w:rtl/>
+        </w:rPr>
+        <w:t>✅</w:t>
+      </w:r>
+      <w:r>
+        <w:rPr>
+          <w:rtl/>
+        </w:rPr>
+        <w:t xml:space="preserve"> </w:t>
+      </w:r>
+      <w:r>
+        <w:rPr>
+          <w:rFonts w:hint="cs"/>
+          <w:rtl/>
+        </w:rPr>
+        <w:t>انجام</w:t>
+      </w:r>
+      <w:r>
+        <w:rPr>
+          <w:rtl/>
+        </w:rPr>
+        <w:t xml:space="preserve"> </w:t>
+      </w:r>
+      <w:r>
+        <w:rPr>
+          <w:rFonts w:hint="cs"/>
+          <w:rtl/>
+        </w:rPr>
+        <w:t>شده</w:t>
+      </w:r>
+    </w:p>
+    <w:p>
+      <w:pPr>
+        <w:pStyle w:val="Heading1"/>
+        <w:bidi/>
+      </w:pPr>
+      <w:r>
+        <w:rPr>
+          <w:rFonts w:cs="Arial"/>
+          <w:rtl/>
+        </w:rPr>
+        <w:t xml:space="preserve">مرحله </w:t>
+      </w:r>
+      <w:r>
+        <w:rPr>
+          <w:rFonts w:cs="Arial"/>
+          <w:rtl/>
+          <w:lang w:bidi="fa-IR"/>
+        </w:rPr>
+        <w:t xml:space="preserve">۱: </w:t>
+      </w:r>
+      <w:proofErr w:type="spellStart"/>
+      <w:r>
+        <w:t>WebSocket</w:t>
+      </w:r>
+      <w:proofErr w:type="spellEnd"/>
+      <w:r>
+        <w:t xml:space="preserve"> Server</w:t>
+      </w:r>
+    </w:p>
+    <w:p>
+      <w:pPr>
+        <w:bidi/>
+      </w:pPr>
+      <w:proofErr w:type="spellStart"/>
+      <w:r>
+        <w:t>WebSocket</w:t>
+      </w:r>
+      <w:proofErr w:type="spellEnd"/>
+      <w:r>
+        <w:t xml:space="preserve"> Server</w:t>
+      </w:r>
+      <w:r>
+        <w:rPr>
+          <w:rFonts w:cs="Arial"/>
+          <w:rtl/>
+        </w:rPr>
+        <w:t xml:space="preserve"> رو</w:t>
+      </w:r>
+      <w:r>
+        <w:rPr>
+          <w:rFonts w:cs="Arial" w:hint="cs"/>
+          <w:rtl/>
+        </w:rPr>
+        <w:t>ی</w:t>
+      </w:r>
+      <w:r>
+        <w:rPr>
+          <w:rFonts w:cs="Arial"/>
+          <w:rtl/>
+        </w:rPr>
+        <w:t xml:space="preserve"> پورت 8081</w:t>
+      </w:r>
+    </w:p>
+    <w:p>
+      <w:pPr>
+        <w:bidi/>
+      </w:pPr>
+      <w:r>
+        <w:rPr>
+          <w:rFonts w:cs="Arial" w:hint="eastAsia"/>
+          <w:rtl/>
+        </w:rPr>
+        <w:t>کانال‌ها</w:t>
+      </w:r>
+      <w:r>
+        <w:rPr>
+          <w:rFonts w:cs="Arial" w:hint="cs"/>
+          <w:rtl/>
+        </w:rPr>
+        <w:t>ی</w:t>
+      </w:r>
+      <w:r>
+        <w:rPr>
+          <w:rFonts w:cs="Arial"/>
+          <w:rtl/>
+        </w:rPr>
+        <w:t xml:space="preserve"> اختصاص</w:t>
+      </w:r>
+      <w:r>
+        <w:rPr>
+          <w:rFonts w:cs="Arial" w:hint="cs"/>
+          <w:rtl/>
+        </w:rPr>
+        <w:t>ی</w:t>
+      </w:r>
+      <w:r>
+        <w:rPr>
+          <w:rFonts w:cs="Arial"/>
+          <w:rtl/>
+        </w:rPr>
+        <w:t xml:space="preserve">: </w:t>
+      </w:r>
+      <w:r>
+        <w:t>alarms/analog, alarms/digital, tags/batch, dashboard/{id}, system/status</w:t>
+      </w:r>
+    </w:p>
+    <w:p>
+      <w:pPr>
+        <w:bidi/>
+      </w:pPr>
+      <w:r>
+        <w:t>Subscribe/Unsubscribe</w:t>
+      </w:r>
+      <w:r>
+        <w:rPr>
+          <w:rFonts w:cs="Arial"/>
+          <w:rtl/>
+        </w:rPr>
+        <w:t xml:space="preserve"> دا</w:t>
+      </w:r>
+      <w:r>
+        <w:rPr>
+          <w:rFonts w:cs="Arial" w:hint="cs"/>
+          <w:rtl/>
+        </w:rPr>
+        <w:t>ی</w:t>
+      </w:r>
+      <w:r>
+        <w:rPr>
+          <w:rFonts w:cs="Arial" w:hint="eastAsia"/>
+          <w:rtl/>
+        </w:rPr>
+        <w:t>نام</w:t>
+      </w:r>
+      <w:r>
+        <w:rPr>
+          <w:rFonts w:cs="Arial" w:hint="cs"/>
+          <w:rtl/>
+        </w:rPr>
+        <w:t>ی</w:t>
+      </w:r>
+      <w:r>
+        <w:rPr>
+          <w:rFonts w:cs="Arial" w:hint="eastAsia"/>
+          <w:rtl/>
+        </w:rPr>
+        <w:t>ک</w:t>
+      </w:r>
+      <w:r>
+        <w:rPr>
+          <w:rFonts w:cs="Arial"/>
+          <w:rtl/>
+        </w:rPr>
+        <w:t xml:space="preserve"> از </w:t>
+      </w:r>
+      <w:r>
+        <w:t>URL</w:t>
+      </w:r>
+      <w:r>
+        <w:rPr>
+          <w:rFonts w:cs="Arial"/>
+          <w:rtl/>
+        </w:rPr>
+        <w:t xml:space="preserve"> </w:t>
+      </w:r>
+      <w:r>
+        <w:rPr>
+          <w:rFonts w:cs="Arial" w:hint="cs"/>
+          <w:rtl/>
+        </w:rPr>
+        <w:t>ی</w:t>
+      </w:r>
+      <w:r>
+        <w:rPr>
+          <w:rFonts w:cs="Arial" w:hint="eastAsia"/>
+          <w:rtl/>
+        </w:rPr>
+        <w:t>ا</w:t>
+      </w:r>
+      <w:r>
+        <w:rPr>
+          <w:rFonts w:cs="Arial"/>
+          <w:rtl/>
+        </w:rPr>
+        <w:t xml:space="preserve"> </w:t>
+      </w:r>
+      <w:r>
+        <w:t>JSON</w:t>
+      </w:r>
+    </w:p>
+    <w:p>
+      <w:pPr>
+        <w:bidi/>
+      </w:pPr>
+      <w:r>
+        <w:rPr>
+          <w:rFonts w:cs="Arial" w:hint="eastAsia"/>
+          <w:rtl/>
+        </w:rPr>
+        <w:t>حالت</w:t>
+      </w:r>
+      <w:r>
+        <w:rPr>
+          <w:rFonts w:cs="Arial"/>
+          <w:rtl/>
+        </w:rPr>
+        <w:t xml:space="preserve"> </w:t>
+      </w:r>
+      <w:r>
+        <w:t>Event</w:t>
+      </w:r>
+      <w:r>
+        <w:rPr>
+          <w:rFonts w:cs="Arial"/>
+          <w:rtl/>
+        </w:rPr>
+        <w:t xml:space="preserve"> و </w:t>
+      </w:r>
+      <w:r>
+        <w:t>Batch delivery</w:t>
+      </w:r>
+    </w:p>
+    <w:p>
+      <w:pPr>
+        <w:bidi/>
+      </w:pPr>
+      <w:r>
+        <w:t>Snapshot</w:t>
+      </w:r>
+      <w:r>
+        <w:rPr>
+          <w:rFonts w:cs="Arial"/>
+          <w:rtl/>
+        </w:rPr>
+        <w:t xml:space="preserve"> اول</w:t>
+      </w:r>
+      <w:r>
+        <w:rPr>
+          <w:rFonts w:cs="Arial" w:hint="cs"/>
+          <w:rtl/>
+        </w:rPr>
+        <w:t>ی</w:t>
+      </w:r>
+      <w:r>
+        <w:rPr>
+          <w:rFonts w:cs="Arial" w:hint="eastAsia"/>
+          <w:rtl/>
+        </w:rPr>
+        <w:t>ه</w:t>
+      </w:r>
+      <w:r>
+        <w:rPr>
+          <w:rFonts w:cs="Arial"/>
+          <w:rtl/>
+        </w:rPr>
+        <w:t xml:space="preserve"> مقاد</w:t>
+      </w:r>
+      <w:r>
+        <w:rPr>
+          <w:rFonts w:cs="Arial" w:hint="cs"/>
+          <w:rtl/>
+        </w:rPr>
+        <w:t>ی</w:t>
+      </w:r>
+      <w:r>
+        <w:rPr>
+          <w:rFonts w:cs="Arial" w:hint="eastAsia"/>
+          <w:rtl/>
+        </w:rPr>
+        <w:t>ر</w:t>
+      </w:r>
+      <w:r>
+        <w:rPr>
+          <w:rFonts w:cs="Arial"/>
+          <w:rtl/>
+        </w:rPr>
+        <w:t xml:space="preserve"> فعل</w:t>
+      </w:r>
+      <w:r>
+        <w:rPr>
+          <w:rFonts w:cs="Arial" w:hint="cs"/>
+          <w:rtl/>
+        </w:rPr>
+        <w:t>ی</w:t>
+      </w:r>
+    </w:p>
+    <w:p>
+      <w:pPr>
+        <w:bidi/>
+      </w:pPr>
+      <w:r>
+        <w:t>Heartbeat</w:t>
+      </w:r>
+      <w:r>
+        <w:rPr>
+          <w:rFonts w:cs="Arial"/>
+          <w:rtl/>
+        </w:rPr>
+        <w:t xml:space="preserve"> و </w:t>
+      </w:r>
+      <w:r>
+        <w:t>ping/pong</w:t>
+      </w:r>
+    </w:p>
+    <w:p>
+      <w:pPr>
+        <w:bidi/>
+      </w:pPr>
+      <w:r>
+        <w:t>Bridge</w:t>
+      </w:r>
+      <w:r>
+        <w:rPr>
+          <w:rFonts w:cs="Arial"/>
+          <w:rtl/>
+        </w:rPr>
+        <w:t xml:space="preserve"> با </w:t>
+      </w:r>
+      <w:proofErr w:type="spellStart"/>
+      <w:r>
+        <w:t>TagBus</w:t>
+      </w:r>
+      <w:proofErr w:type="spellEnd"/>
+      <w:r>
+        <w:rPr>
+          <w:rFonts w:cs="Arial"/>
+          <w:rtl/>
+        </w:rPr>
+        <w:t xml:space="preserve"> برا</w:t>
+      </w:r>
+      <w:r>
+        <w:rPr>
+          <w:rFonts w:cs="Arial" w:hint="cs"/>
+          <w:rtl/>
+        </w:rPr>
+        <w:t>ی</w:t>
+      </w:r>
+      <w:r>
+        <w:rPr>
+          <w:rFonts w:cs="Arial"/>
+          <w:rtl/>
+        </w:rPr>
+        <w:t xml:space="preserve"> آپد</w:t>
+      </w:r>
+      <w:r>
+        <w:rPr>
+          <w:rFonts w:cs="Arial" w:hint="cs"/>
+          <w:rtl/>
+        </w:rPr>
+        <w:t>ی</w:t>
+      </w:r>
+      <w:r>
+        <w:rPr>
+          <w:rFonts w:cs="Arial" w:hint="eastAsia"/>
+          <w:rtl/>
+        </w:rPr>
+        <w:t>ت‌ها</w:t>
+      </w:r>
+      <w:r>
+        <w:rPr>
+          <w:rFonts w:cs="Arial"/>
+          <w:rtl/>
+        </w:rPr>
+        <w:t xml:space="preserve"> و آلارم‌ها</w:t>
+      </w:r>
+    </w:p>
+    <w:p>
+      <w:pPr>
+        <w:pStyle w:val="Heading1"/>
+        <w:bidi/>
+      </w:pPr>
+      <w:r>
+        <w:rPr>
+          <w:rFonts w:cs="Arial" w:hint="eastAsia"/>
+          <w:rtl/>
+        </w:rPr>
+        <w:t>مرحله</w:t>
+      </w:r>
+      <w:r>
+        <w:rPr>
+          <w:rFonts w:cs="Arial"/>
+          <w:rtl/>
+        </w:rPr>
+        <w:t xml:space="preserve"> </w:t>
+      </w:r>
+      <w:r>
+        <w:rPr>
+          <w:rFonts w:cs="Arial"/>
+          <w:rtl/>
+          <w:lang w:bidi="fa-IR"/>
+        </w:rPr>
+        <w:t xml:space="preserve">۲: </w:t>
+      </w:r>
+      <w:r>
+        <w:t>REST API Server</w:t>
+      </w:r>
+    </w:p>
+    <w:p>
+      <w:pPr>
+        <w:bidi/>
+      </w:pPr>
+      <w:r>
+        <w:t>HTTP Server</w:t>
+      </w:r>
+      <w:r>
+        <w:rPr>
+          <w:rFonts w:cs="Arial"/>
+          <w:rtl/>
+        </w:rPr>
+        <w:t xml:space="preserve"> رو</w:t>
+      </w:r>
+      <w:r>
+        <w:rPr>
+          <w:rFonts w:cs="Arial" w:hint="cs"/>
+          <w:rtl/>
+        </w:rPr>
+        <w:t>ی</w:t>
+      </w:r>
+      <w:r>
+        <w:rPr>
+          <w:rFonts w:cs="Arial"/>
+          <w:rtl/>
+        </w:rPr>
+        <w:t xml:space="preserve"> پورت 8082</w:t>
+      </w:r>
+    </w:p>
+    <w:p>
+      <w:pPr>
+        <w:bidi/>
+      </w:pPr>
+      <w:r>
+        <w:t>Endpoint</w:t>
+      </w:r>
+      <w:r>
+        <w:rPr>
+          <w:rFonts w:cs="Arial"/>
+          <w:rtl/>
+        </w:rPr>
+        <w:t xml:space="preserve"> ها</w:t>
+      </w:r>
+      <w:r>
+        <w:rPr>
+          <w:rFonts w:cs="Arial" w:hint="cs"/>
+          <w:rtl/>
+        </w:rPr>
+        <w:t>ی</w:t>
+      </w:r>
+      <w:r>
+        <w:rPr>
+          <w:rFonts w:cs="Arial"/>
+          <w:rtl/>
+        </w:rPr>
+        <w:t xml:space="preserve"> اصل</w:t>
+      </w:r>
+      <w:r>
+        <w:rPr>
+          <w:rFonts w:cs="Arial" w:hint="cs"/>
+          <w:rtl/>
+        </w:rPr>
+        <w:t>ی</w:t>
+      </w:r>
+      <w:r>
+        <w:rPr>
+          <w:rFonts w:cs="Arial"/>
+          <w:rtl/>
+        </w:rPr>
+        <w:t xml:space="preserve"> فعال:</w:t>
+      </w:r>
+    </w:p>
+    <w:p>
+      <w:pPr>
+        <w:bidi/>
+      </w:pPr>
+      <w:r>
+        <w:t>GET /</w:t>
+      </w:r>
+      <w:proofErr w:type="spellStart"/>
+      <w:r>
+        <w:t>api</w:t>
+      </w:r>
+      <w:proofErr w:type="spellEnd"/>
+      <w:r>
+        <w:t>/v1/tags</w:t>
+      </w:r>
+      <w:r>
+        <w:rPr>
+          <w:rFonts w:cs="Arial"/>
+          <w:rtl/>
+        </w:rPr>
+        <w:t xml:space="preserve"> - ل</w:t>
+      </w:r>
+      <w:r>
+        <w:rPr>
+          <w:rFonts w:cs="Arial" w:hint="cs"/>
+          <w:rtl/>
+        </w:rPr>
+        <w:t>ی</w:t>
+      </w:r>
+      <w:r>
+        <w:rPr>
+          <w:rFonts w:cs="Arial" w:hint="eastAsia"/>
+          <w:rtl/>
+        </w:rPr>
+        <w:t>ست</w:t>
+      </w:r>
+      <w:r>
+        <w:rPr>
+          <w:rFonts w:cs="Arial"/>
+          <w:rtl/>
+        </w:rPr>
+        <w:t xml:space="preserve"> تگ‌ها</w:t>
+      </w:r>
+    </w:p>
+    <w:p>
+      <w:pPr>
+        <w:bidi/>
+      </w:pPr>
+      <w:r>
+        <w:t>GET /</w:t>
+      </w:r>
+      <w:proofErr w:type="spellStart"/>
+      <w:r>
+        <w:t>api</w:t>
+      </w:r>
+      <w:proofErr w:type="spellEnd"/>
+      <w:r>
+        <w:t>/v1/tags/{id}</w:t>
+      </w:r>
+      <w:r>
+        <w:rPr>
+          <w:rFonts w:cs="Arial"/>
+          <w:rtl/>
+        </w:rPr>
+        <w:t xml:space="preserve"> - جزئ</w:t>
+      </w:r>
+      <w:r>
+        <w:rPr>
+          <w:rFonts w:cs="Arial" w:hint="cs"/>
+          <w:rtl/>
+        </w:rPr>
+        <w:t>ی</w:t>
+      </w:r>
+      <w:r>
+        <w:rPr>
+          <w:rFonts w:cs="Arial" w:hint="eastAsia"/>
+          <w:rtl/>
+        </w:rPr>
+        <w:t>ات</w:t>
+      </w:r>
+      <w:r>
+        <w:rPr>
+          <w:rFonts w:cs="Arial"/>
+          <w:rtl/>
+        </w:rPr>
+        <w:t xml:space="preserve"> تگ</w:t>
+      </w:r>
+    </w:p>
+    <w:p>
+      <w:pPr>
+        <w:bidi/>
+      </w:pPr>
+      <w:r>
+        <w:t>GET /</w:t>
+      </w:r>
+      <w:proofErr w:type="spellStart"/>
+      <w:r>
+        <w:t>api</w:t>
+      </w:r>
+      <w:proofErr w:type="spellEnd"/>
+      <w:r>
+        <w:t>/v1/tags/{id}/current</w:t>
+      </w:r>
+      <w:r>
+        <w:rPr>
+          <w:rFonts w:cs="Arial"/>
+          <w:rtl/>
+        </w:rPr>
+        <w:t xml:space="preserve"> - مقدار فعل</w:t>
+      </w:r>
+      <w:r>
+        <w:rPr>
+          <w:rFonts w:cs="Arial" w:hint="cs"/>
+          <w:rtl/>
+        </w:rPr>
+        <w:t>ی</w:t>
+      </w:r>
+    </w:p>
+    <w:p>
+      <w:pPr>
+        <w:bidi/>
+      </w:pPr>
+      <w:r>
+        <w:t>GET /</w:t>
+      </w:r>
+      <w:proofErr w:type="spellStart"/>
+      <w:r>
+        <w:t>api</w:t>
+      </w:r>
+      <w:proofErr w:type="spellEnd"/>
+      <w:r>
+        <w:t>/v1/alarms</w:t>
+      </w:r>
+      <w:r>
+        <w:rPr>
+          <w:rFonts w:cs="Arial"/>
+          <w:rtl/>
+        </w:rPr>
+        <w:t xml:space="preserve"> - ل</w:t>
+      </w:r>
+      <w:r>
+        <w:rPr>
+          <w:rFonts w:cs="Arial" w:hint="cs"/>
+          <w:rtl/>
+        </w:rPr>
+        <w:t>ی</w:t>
+      </w:r>
+      <w:r>
+        <w:rPr>
+          <w:rFonts w:cs="Arial" w:hint="eastAsia"/>
+          <w:rtl/>
+        </w:rPr>
+        <w:t>ست</w:t>
+      </w:r>
+      <w:r>
+        <w:rPr>
+          <w:rFonts w:cs="Arial"/>
+          <w:rtl/>
+        </w:rPr>
+        <w:t xml:space="preserve"> آلارم‌ها (با </w:t>
+      </w:r>
+      <w:r>
+        <w:t>pagination</w:t>
+      </w:r>
+      <w:r>
+        <w:rPr>
+          <w:rFonts w:cs="Arial"/>
+          <w:rtl/>
+        </w:rPr>
+        <w:t>)</w:t>
+      </w:r>
+    </w:p>
+    <w:p>
+      <w:pPr>
+        <w:bidi/>
+      </w:pPr>
+      <w:r>
+        <w:t>POST /</w:t>
+      </w:r>
+      <w:proofErr w:type="spellStart"/>
+      <w:r>
+        <w:t>api</w:t>
+      </w:r>
+      <w:proofErr w:type="spellEnd"/>
+      <w:r>
+        <w:t>/v1/alarms/{id}/</w:t>
+      </w:r>
+      <w:proofErr w:type="spellStart"/>
+      <w:r>
+        <w:t>ack</w:t>
+      </w:r>
+      <w:proofErr w:type="spellEnd"/>
+      <w:r>
+        <w:t xml:space="preserve"> - </w:t>
+      </w:r>
+      <w:proofErr w:type="spellStart"/>
+      <w:r>
+        <w:t>Ack</w:t>
+      </w:r>
+      <w:proofErr w:type="spellEnd"/>
+      <w:r>
+        <w:rPr>
+          <w:rFonts w:cs="Arial"/>
+          <w:rtl/>
+        </w:rPr>
+        <w:t xml:space="preserve"> کردن آلارم</w:t>
+      </w:r>
+    </w:p>
+    <w:p>
+      <w:pPr>
+        <w:bidi/>
+      </w:pPr>
+      <w:r>
+        <w:t>GET /</w:t>
+      </w:r>
+      <w:proofErr w:type="spellStart"/>
+      <w:r>
+        <w:t>api</w:t>
+      </w:r>
+      <w:proofErr w:type="spellEnd"/>
+      <w:r>
+        <w:t>/v1/drivers</w:t>
+      </w:r>
+      <w:r>
+        <w:rPr>
+          <w:rFonts w:cs="Arial"/>
+          <w:rtl/>
+        </w:rPr>
+        <w:t xml:space="preserve"> - ل</w:t>
+      </w:r>
+      <w:r>
+        <w:rPr>
+          <w:rFonts w:cs="Arial" w:hint="cs"/>
+          <w:rtl/>
+        </w:rPr>
+        <w:t>ی</w:t>
+      </w:r>
+      <w:r>
+        <w:rPr>
+          <w:rFonts w:cs="Arial" w:hint="eastAsia"/>
+          <w:rtl/>
+        </w:rPr>
+        <w:t>ست</w:t>
+      </w:r>
+      <w:r>
+        <w:rPr>
+          <w:rFonts w:cs="Arial"/>
+          <w:rtl/>
+        </w:rPr>
+        <w:t xml:space="preserve"> درا</w:t>
+      </w:r>
+      <w:r>
+        <w:rPr>
+          <w:rFonts w:cs="Arial" w:hint="cs"/>
+          <w:rtl/>
+        </w:rPr>
+        <w:t>ی</w:t>
+      </w:r>
+      <w:r>
+        <w:rPr>
+          <w:rFonts w:cs="Arial" w:hint="eastAsia"/>
+          <w:rtl/>
+        </w:rPr>
+        <w:t>ورها</w:t>
+      </w:r>
+    </w:p>
+    <w:p>
+      <w:pPr>
+        <w:bidi/>
+      </w:pPr>
+      <w:r>
+        <w:t>GET /</w:t>
+      </w:r>
+      <w:proofErr w:type="spellStart"/>
+      <w:r>
+        <w:t>api</w:t>
+      </w:r>
+      <w:proofErr w:type="spellEnd"/>
+      <w:r>
+        <w:t>/v1/system/status</w:t>
+      </w:r>
+      <w:r>
+        <w:rPr>
+          <w:rFonts w:cs="Arial"/>
+          <w:rtl/>
+        </w:rPr>
+        <w:t xml:space="preserve"> - وضع</w:t>
+      </w:r>
+      <w:r>
+        <w:rPr>
+          <w:rFonts w:cs="Arial" w:hint="cs"/>
+          <w:rtl/>
+        </w:rPr>
+        <w:t>ی</w:t>
+      </w:r>
+      <w:r>
+        <w:rPr>
+          <w:rFonts w:cs="Arial" w:hint="eastAsia"/>
+          <w:rtl/>
+        </w:rPr>
+        <w:t>ت</w:t>
+      </w:r>
+      <w:r>
+        <w:rPr>
+          <w:rFonts w:cs="Arial"/>
+          <w:rtl/>
+        </w:rPr>
+        <w:t xml:space="preserve"> س</w:t>
+      </w:r>
+      <w:r>
+        <w:rPr>
+          <w:rFonts w:cs="Arial" w:hint="cs"/>
+          <w:rtl/>
+        </w:rPr>
+        <w:t>ی</w:t>
+      </w:r>
+      <w:r>
+        <w:rPr>
+          <w:rFonts w:cs="Arial" w:hint="eastAsia"/>
+          <w:rtl/>
+        </w:rPr>
+        <w:t>ستم</w:t>
+      </w:r>
+    </w:p>
+    <w:p>
+      <w:pPr>
+        <w:bidi/>
+      </w:pPr>
+      <w:r>
+        <w:t>CORS headers</w:t>
+      </w:r>
+    </w:p>
+    <w:p>
+      <w:pPr>
+        <w:bidi/>
+      </w:pPr>
+      <w:r>
+        <w:t>JSON response</w:t>
+      </w:r>
+    </w:p>
+    <w:p>
+      <w:pPr>
+        <w:pStyle w:val="Heading1"/>
+        <w:bidi/>
+      </w:pPr>
+      <w:r>
+        <w:rPr>
+          <w:rFonts w:ascii="Segoe UI Symbol" w:hAnsi="Segoe UI Symbol" w:cs="Segoe UI Symbol" w:hint="cs"/>
+          <w:rtl/>
+        </w:rPr>
+        <w:lastRenderedPageBreak/>
+        <w:t>🔄</w:t>
+      </w:r>
+      <w:r>
+        <w:rPr>
+          <w:rtl/>
+        </w:rPr>
+        <w:t xml:space="preserve"> </w:t>
+      </w:r>
+      <w:r>
+        <w:rPr>
+          <w:rFonts w:ascii="Arial" w:hAnsi="Arial" w:hint="cs"/>
+          <w:rtl/>
+        </w:rPr>
+        <w:t>گام‌ها</w:t>
+      </w:r>
+      <w:r>
+        <w:rPr>
+          <w:rFonts w:hint="cs"/>
+          <w:rtl/>
+        </w:rPr>
+        <w:t>ی</w:t>
+      </w:r>
+      <w:r>
+        <w:rPr>
+          <w:rtl/>
+        </w:rPr>
+        <w:t xml:space="preserve"> بعد</w:t>
+      </w:r>
+      <w:r>
+        <w:rPr>
+          <w:rFonts w:hint="cs"/>
+          <w:rtl/>
+        </w:rPr>
+        <w:t>ی</w:t>
+      </w:r>
+    </w:p>
+    <w:p>
+      <w:pPr>
+        <w:pStyle w:val="Heading1"/>
+        <w:bidi/>
+      </w:pPr>
+      <w:r>
+        <w:rPr>
+          <w:rFonts w:hint="eastAsia"/>
+          <w:rtl/>
+        </w:rPr>
+        <w:t>چند</w:t>
+      </w:r>
+      <w:r>
+        <w:rPr>
+          <w:rtl/>
+        </w:rPr>
+        <w:t xml:space="preserve"> مس</w:t>
+      </w:r>
+      <w:r>
+        <w:rPr>
+          <w:rFonts w:hint="cs"/>
+          <w:rtl/>
+        </w:rPr>
+        <w:t>ی</w:t>
+      </w:r>
+      <w:r>
+        <w:rPr>
+          <w:rFonts w:hint="eastAsia"/>
+          <w:rtl/>
+        </w:rPr>
+        <w:t>ر</w:t>
+      </w:r>
+      <w:r>
+        <w:rPr>
+          <w:rtl/>
+        </w:rPr>
+        <w:t xml:space="preserve"> برا</w:t>
+      </w:r>
+      <w:r>
+        <w:rPr>
+          <w:rFonts w:hint="cs"/>
+          <w:rtl/>
+        </w:rPr>
+        <w:t>ی</w:t>
+      </w:r>
+      <w:r>
+        <w:rPr>
+          <w:rtl/>
+        </w:rPr>
+        <w:t xml:space="preserve"> ادامه دار</w:t>
+      </w:r>
+      <w:r>
+        <w:rPr>
+          <w:rFonts w:hint="cs"/>
+          <w:rtl/>
+        </w:rPr>
+        <w:t>ی</w:t>
+      </w:r>
+      <w:r>
+        <w:rPr>
+          <w:rFonts w:hint="eastAsia"/>
+          <w:rtl/>
+        </w:rPr>
+        <w:t>م</w:t>
+      </w:r>
+      <w:r>
+        <w:rPr>
+          <w:rtl/>
+        </w:rPr>
+        <w:t>:</w:t>
+      </w:r>
+    </w:p>
+    <w:p>
+      <w:pPr>
+        <w:pStyle w:val="Heading1"/>
+        <w:bidi/>
+      </w:pPr>
+      <w:r>
+        <w:rPr>
+          <w:rFonts w:hint="eastAsia"/>
+          <w:rtl/>
+        </w:rPr>
+        <w:t>مس</w:t>
+      </w:r>
+      <w:r>
+        <w:rPr>
+          <w:rFonts w:hint="cs"/>
+          <w:rtl/>
+        </w:rPr>
+        <w:t>ی</w:t>
+      </w:r>
+      <w:r>
+        <w:rPr>
+          <w:rFonts w:hint="eastAsia"/>
+          <w:rtl/>
+        </w:rPr>
+        <w:t>ر</w:t>
+      </w:r>
+      <w:r>
+        <w:rPr>
+          <w:rtl/>
+        </w:rPr>
+        <w:t xml:space="preserve"> </w:t>
+      </w:r>
+      <w:r>
+        <w:rPr>
+          <w:rtl/>
+          <w:lang w:bidi="fa-IR"/>
+        </w:rPr>
+        <w:t xml:space="preserve">۱: </w:t>
+      </w:r>
+      <w:r>
+        <w:rPr>
+          <w:rtl/>
+        </w:rPr>
+        <w:t>تکم</w:t>
+      </w:r>
+      <w:r>
+        <w:rPr>
+          <w:rFonts w:hint="cs"/>
+          <w:rtl/>
+        </w:rPr>
+        <w:t>ی</w:t>
+      </w:r>
+      <w:r>
+        <w:rPr>
+          <w:rFonts w:hint="eastAsia"/>
+          <w:rtl/>
+        </w:rPr>
+        <w:t>ل</w:t>
+      </w:r>
+      <w:r>
+        <w:rPr>
+          <w:rtl/>
+        </w:rPr>
+        <w:t xml:space="preserve"> </w:t>
+      </w:r>
+      <w:r>
+        <w:t>REST API</w:t>
+      </w:r>
+      <w:r>
+        <w:rPr>
+          <w:rtl/>
+        </w:rPr>
+        <w:t xml:space="preserve"> (</w:t>
+      </w:r>
+      <w:r>
+        <w:t>CRUD</w:t>
+      </w:r>
+      <w:r>
+        <w:rPr>
+          <w:rtl/>
+        </w:rPr>
+        <w:t xml:space="preserve"> و </w:t>
+      </w:r>
+      <w:r>
+        <w:t>Query</w:t>
+      </w:r>
+      <w:r>
+        <w:rPr>
+          <w:rtl/>
+        </w:rPr>
+        <w:t>)</w:t>
+      </w:r>
+    </w:p>
+    <w:p>
+      <w:pPr>
+        <w:bidi/>
+      </w:pPr>
+      <w:r>
+        <w:t>POST /</w:t>
+      </w:r>
+      <w:proofErr w:type="spellStart"/>
+      <w:r>
+        <w:t>api</w:t>
+      </w:r>
+      <w:proofErr w:type="spellEnd"/>
+      <w:r>
+        <w:t>/v1/tags</w:t>
+      </w:r>
+      <w:r>
+        <w:rPr>
+          <w:rFonts w:cs="Arial"/>
+          <w:rtl/>
+        </w:rPr>
+        <w:t xml:space="preserve"> - ساخت تگ جد</w:t>
+      </w:r>
+      <w:r>
+        <w:rPr>
+          <w:rFonts w:cs="Arial" w:hint="cs"/>
+          <w:rtl/>
+        </w:rPr>
+        <w:t>ی</w:t>
+      </w:r>
+      <w:r>
+        <w:rPr>
+          <w:rFonts w:cs="Arial" w:hint="eastAsia"/>
+          <w:rtl/>
+        </w:rPr>
+        <w:t>د</w:t>
+      </w:r>
+    </w:p>
+    <w:p>
+      <w:pPr>
+        <w:bidi/>
+      </w:pPr>
+      <w:r>
+        <w:t>PUT /</w:t>
+      </w:r>
+      <w:proofErr w:type="spellStart"/>
+      <w:r>
+        <w:t>api</w:t>
+      </w:r>
+      <w:proofErr w:type="spellEnd"/>
+      <w:r>
+        <w:t>/v1/tags/{id}</w:t>
+      </w:r>
+      <w:r>
+        <w:rPr>
+          <w:rFonts w:cs="Arial"/>
+          <w:rtl/>
+        </w:rPr>
+        <w:t xml:space="preserve"> - و</w:t>
+      </w:r>
+      <w:r>
+        <w:rPr>
+          <w:rFonts w:cs="Arial" w:hint="cs"/>
+          <w:rtl/>
+        </w:rPr>
+        <w:t>ی</w:t>
+      </w:r>
+      <w:r>
+        <w:rPr>
+          <w:rFonts w:cs="Arial" w:hint="eastAsia"/>
+          <w:rtl/>
+        </w:rPr>
+        <w:t>را</w:t>
+      </w:r>
+      <w:r>
+        <w:rPr>
+          <w:rFonts w:cs="Arial" w:hint="cs"/>
+          <w:rtl/>
+        </w:rPr>
+        <w:t>ی</w:t>
+      </w:r>
+      <w:r>
+        <w:rPr>
+          <w:rFonts w:cs="Arial" w:hint="eastAsia"/>
+          <w:rtl/>
+        </w:rPr>
+        <w:t>ش</w:t>
+      </w:r>
+      <w:r>
+        <w:rPr>
+          <w:rFonts w:cs="Arial"/>
+          <w:rtl/>
+        </w:rPr>
+        <w:t xml:space="preserve"> تگ</w:t>
+      </w:r>
+    </w:p>
+    <w:p>
+      <w:pPr>
+        <w:bidi/>
+      </w:pPr>
+      <w:r>
+        <w:t>DELETE /</w:t>
+      </w:r>
+      <w:proofErr w:type="spellStart"/>
+      <w:r>
+        <w:t>api</w:t>
+      </w:r>
+      <w:proofErr w:type="spellEnd"/>
+      <w:r>
+        <w:t>/v1/tags/{id}</w:t>
+      </w:r>
+      <w:r>
+        <w:rPr>
+          <w:rFonts w:cs="Arial"/>
+          <w:rtl/>
+        </w:rPr>
+        <w:t xml:space="preserve"> - حذف تگ</w:t>
+      </w:r>
+    </w:p>
+    <w:p>
+      <w:pPr>
+        <w:bidi/>
+      </w:pPr>
+      <w:r>
+        <w:t>GET /</w:t>
+      </w:r>
+      <w:proofErr w:type="spellStart"/>
+      <w:r>
+        <w:t>api</w:t>
+      </w:r>
+      <w:proofErr w:type="spellEnd"/>
+      <w:r>
+        <w:t>/v1/tags/{id}/history - Query</w:t>
+      </w:r>
+      <w:r>
+        <w:rPr>
+          <w:rFonts w:cs="Arial"/>
+          <w:rtl/>
+        </w:rPr>
+        <w:t xml:space="preserve"> داده‌ها</w:t>
+      </w:r>
+      <w:r>
+        <w:rPr>
+          <w:rFonts w:cs="Arial" w:hint="cs"/>
+          <w:rtl/>
+        </w:rPr>
+        <w:t>ی</w:t>
+      </w:r>
+      <w:r>
+        <w:rPr>
+          <w:rFonts w:cs="Arial"/>
+          <w:rtl/>
+        </w:rPr>
+        <w:t xml:space="preserve"> تار</w:t>
+      </w:r>
+      <w:r>
+        <w:rPr>
+          <w:rFonts w:cs="Arial" w:hint="cs"/>
+          <w:rtl/>
+        </w:rPr>
+        <w:t>ی</w:t>
+      </w:r>
+      <w:r>
+        <w:rPr>
+          <w:rFonts w:cs="Arial" w:hint="eastAsia"/>
+          <w:rtl/>
+        </w:rPr>
+        <w:t>خ</w:t>
+      </w:r>
+      <w:r>
+        <w:rPr>
+          <w:rFonts w:cs="Arial" w:hint="cs"/>
+          <w:rtl/>
+        </w:rPr>
+        <w:t>ی</w:t>
+      </w:r>
+      <w:r>
+        <w:rPr>
+          <w:rFonts w:cs="Arial"/>
+          <w:rtl/>
+        </w:rPr>
+        <w:t xml:space="preserve"> (با </w:t>
+      </w:r>
+      <w:r>
+        <w:t>interval</w:t>
+      </w:r>
+      <w:r>
+        <w:rPr>
+          <w:rFonts w:cs="Arial"/>
+          <w:rtl/>
+        </w:rPr>
+        <w:t xml:space="preserve">، </w:t>
+      </w:r>
+      <w:r>
+        <w:t>time range</w:t>
+      </w:r>
+      <w:r>
+        <w:rPr>
+          <w:rFonts w:cs="Arial"/>
+          <w:rtl/>
+        </w:rPr>
+        <w:t>)</w:t>
+      </w:r>
+    </w:p>
+    <w:p>
+      <w:pPr>
+        <w:bidi/>
+      </w:pPr>
+      <w:r>
+        <w:t>GET /</w:t>
+      </w:r>
+      <w:proofErr w:type="spellStart"/>
+      <w:r>
+        <w:t>api</w:t>
+      </w:r>
+      <w:proofErr w:type="spellEnd"/>
+      <w:r>
+        <w:t>/v1/tags/{id}/aggregates - Query</w:t>
+      </w:r>
+      <w:r>
+        <w:rPr>
+          <w:rFonts w:cs="Arial"/>
+          <w:rtl/>
+        </w:rPr>
+        <w:t xml:space="preserve"> از </w:t>
+      </w:r>
+      <w:r>
+        <w:t>Continuous Aggregates</w:t>
+      </w:r>
+    </w:p>
+    <w:p>
+      <w:pPr>
+        <w:bidi/>
+      </w:pPr>
+      <w:r>
+        <w:t>GET /</w:t>
+      </w:r>
+      <w:proofErr w:type="spellStart"/>
+      <w:r>
+        <w:t>api</w:t>
+      </w:r>
+      <w:proofErr w:type="spellEnd"/>
+      <w:r>
+        <w:t>/v1/rules</w:t>
+      </w:r>
+      <w:r>
+        <w:rPr>
+          <w:rFonts w:cs="Arial"/>
+          <w:rtl/>
+        </w:rPr>
+        <w:t xml:space="preserve"> - ل</w:t>
+      </w:r>
+      <w:r>
+        <w:rPr>
+          <w:rFonts w:cs="Arial" w:hint="cs"/>
+          <w:rtl/>
+        </w:rPr>
+        <w:t>ی</w:t>
+      </w:r>
+      <w:r>
+        <w:rPr>
+          <w:rFonts w:cs="Arial" w:hint="eastAsia"/>
+          <w:rtl/>
+        </w:rPr>
+        <w:t>ست</w:t>
+      </w:r>
+      <w:r>
+        <w:rPr>
+          <w:rFonts w:cs="Arial"/>
+          <w:rtl/>
+        </w:rPr>
+        <w:t xml:space="preserve"> </w:t>
+      </w:r>
+      <w:r>
+        <w:t>rule</w:t>
+      </w:r>
+      <w:r>
+        <w:rPr>
+          <w:rFonts w:cs="Arial"/>
+          <w:rtl/>
+        </w:rPr>
+        <w:t xml:space="preserve"> ها</w:t>
+      </w:r>
+    </w:p>
+    <w:p>
+      <w:pPr>
+        <w:bidi/>
+      </w:pPr>
+      <w:r>
+        <w:t>POST /</w:t>
+      </w:r>
+      <w:proofErr w:type="spellStart"/>
+      <w:r>
+        <w:t>api</w:t>
+      </w:r>
+      <w:proofErr w:type="spellEnd"/>
+      <w:r>
+        <w:t>/v1/rules</w:t>
+      </w:r>
+      <w:r>
+        <w:rPr>
+          <w:rFonts w:cs="Arial"/>
+          <w:rtl/>
+        </w:rPr>
+        <w:t xml:space="preserve"> - ساخت </w:t>
+      </w:r>
+      <w:r>
+        <w:t>rule</w:t>
+      </w:r>
+    </w:p>
+    <w:p>
+      <w:pPr>
+        <w:bidi/>
+      </w:pPr>
+      <w:r>
+        <w:t>Report Generation endpoints</w:t>
+      </w:r>
+    </w:p>
+    <w:p>
+      <w:pPr>
+        <w:pStyle w:val="Heading1"/>
+        <w:bidi/>
+      </w:pPr>
+      <w:r>
+        <w:rPr>
+          <w:rFonts w:cs="Arial" w:hint="eastAsia"/>
+          <w:rtl/>
+        </w:rPr>
+        <w:t>مس</w:t>
+      </w:r>
+      <w:r>
+        <w:rPr>
+          <w:rFonts w:cs="Arial" w:hint="cs"/>
+          <w:rtl/>
+        </w:rPr>
+        <w:t>ی</w:t>
+      </w:r>
+      <w:r>
+        <w:rPr>
+          <w:rFonts w:cs="Arial" w:hint="eastAsia"/>
+          <w:rtl/>
+        </w:rPr>
+        <w:t>ر</w:t>
+      </w:r>
+      <w:r>
+        <w:rPr>
+          <w:rFonts w:cs="Arial"/>
+          <w:rtl/>
+        </w:rPr>
+        <w:t xml:space="preserve"> </w:t>
+      </w:r>
+      <w:r>
+        <w:rPr>
+          <w:rFonts w:cs="Arial"/>
+          <w:rtl/>
+          <w:lang w:bidi="fa-IR"/>
+        </w:rPr>
+        <w:t xml:space="preserve">۲: </w:t>
+      </w:r>
+      <w:r>
+        <w:t>Authentication</w:t>
+      </w:r>
+      <w:r>
+        <w:rPr>
+          <w:rFonts w:cs="Arial"/>
+          <w:rtl/>
+        </w:rPr>
+        <w:t xml:space="preserve"> و </w:t>
+      </w:r>
+      <w:r>
+        <w:t>Authorization</w:t>
+      </w:r>
+    </w:p>
+    <w:p>
+      <w:pPr>
+        <w:bidi/>
+      </w:pPr>
+      <w:r>
+        <w:t>JWT Token</w:t>
+      </w:r>
+      <w:r>
+        <w:rPr>
+          <w:rFonts w:cs="Arial"/>
+          <w:rtl/>
+        </w:rPr>
+        <w:t xml:space="preserve"> </w:t>
+      </w:r>
+      <w:r>
+        <w:rPr>
+          <w:rFonts w:cs="Arial" w:hint="cs"/>
+          <w:rtl/>
+        </w:rPr>
+        <w:t>ی</w:t>
+      </w:r>
+      <w:r>
+        <w:rPr>
+          <w:rFonts w:cs="Arial" w:hint="eastAsia"/>
+          <w:rtl/>
+        </w:rPr>
+        <w:t>ا</w:t>
+      </w:r>
+      <w:r>
+        <w:rPr>
+          <w:rFonts w:cs="Arial"/>
+          <w:rtl/>
+        </w:rPr>
+        <w:t xml:space="preserve"> </w:t>
+      </w:r>
+      <w:r>
+        <w:t>API Key</w:t>
+      </w:r>
+    </w:p>
+    <w:p>
+      <w:pPr>
+        <w:bidi/>
+      </w:pPr>
+      <w:r>
+        <w:t>User management</w:t>
+      </w:r>
+    </w:p>
+    <w:p>
+      <w:pPr>
+        <w:bidi/>
+      </w:pPr>
+      <w:r>
+        <w:t>Role-based access control (RBAC)</w:t>
+      </w:r>
+    </w:p>
+    <w:p>
+      <w:pPr>
+        <w:bidi/>
+      </w:pPr>
+      <w:r>
+        <w:t>Token</w:t>
+      </w:r>
+      <w:r>
+        <w:rPr>
+          <w:rFonts w:cs="Arial"/>
+          <w:rtl/>
+        </w:rPr>
+        <w:t xml:space="preserve"> در </w:t>
+      </w:r>
+      <w:proofErr w:type="spellStart"/>
+      <w:r>
+        <w:t>WebSocket</w:t>
+      </w:r>
+      <w:proofErr w:type="spellEnd"/>
+      <w:r>
+        <w:rPr>
+          <w:rFonts w:cs="Arial"/>
+          <w:rtl/>
+        </w:rPr>
+        <w:t xml:space="preserve"> و </w:t>
+      </w:r>
+      <w:r>
+        <w:t>REST</w:t>
+      </w:r>
+    </w:p>
+    <w:p>
+      <w:pPr>
+        <w:pStyle w:val="Heading1"/>
+        <w:bidi/>
+      </w:pPr>
+      <w:r>
+        <w:rPr>
+          <w:rFonts w:cs="Arial" w:hint="eastAsia"/>
+          <w:rtl/>
+        </w:rPr>
+        <w:t>مس</w:t>
+      </w:r>
+      <w:r>
+        <w:rPr>
+          <w:rFonts w:cs="Arial" w:hint="cs"/>
+          <w:rtl/>
+        </w:rPr>
+        <w:t>ی</w:t>
+      </w:r>
+      <w:r>
+        <w:rPr>
+          <w:rFonts w:cs="Arial" w:hint="eastAsia"/>
+          <w:rtl/>
+        </w:rPr>
+        <w:t>ر</w:t>
+      </w:r>
+      <w:r>
+        <w:rPr>
+          <w:rFonts w:cs="Arial"/>
+          <w:rtl/>
+        </w:rPr>
+        <w:t xml:space="preserve"> </w:t>
+      </w:r>
+      <w:r>
+        <w:rPr>
+          <w:rFonts w:cs="Arial"/>
+          <w:rtl/>
+          <w:lang w:bidi="fa-IR"/>
+        </w:rPr>
+        <w:t xml:space="preserve">۳: </w:t>
+      </w:r>
+      <w:r>
+        <w:t>Dashboard API</w:t>
+      </w:r>
+    </w:p>
+    <w:p>
+      <w:pPr>
+        <w:bidi/>
+      </w:pPr>
+      <w:r>
+        <w:t>CRUD</w:t>
+      </w:r>
+      <w:r>
+        <w:rPr>
+          <w:rFonts w:cs="Arial"/>
+          <w:rtl/>
+        </w:rPr>
+        <w:t xml:space="preserve"> داشبوردها</w:t>
+      </w:r>
+    </w:p>
+    <w:p>
+      <w:pPr>
+        <w:bidi/>
+      </w:pPr>
+      <w:r>
+        <w:t>Save/Load dashboard configurations</w:t>
+      </w:r>
+    </w:p>
+    <w:p>
+      <w:pPr>
+        <w:bidi/>
+      </w:pPr>
+      <w:r>
+        <w:t xml:space="preserve">Dashboard-specific </w:t>
+      </w:r>
+      <w:proofErr w:type="spellStart"/>
+      <w:r>
+        <w:t>WebSocket</w:t>
+      </w:r>
+      <w:proofErr w:type="spellEnd"/>
+      <w:r>
+        <w:t xml:space="preserve"> channels</w:t>
+      </w:r>
+    </w:p>
+    <w:p>
+      <w:pPr>
+        <w:pStyle w:val="Heading1"/>
+        <w:bidi/>
+      </w:pPr>
+      <w:r>
+        <w:rPr>
+          <w:rFonts w:cs="Arial" w:hint="eastAsia"/>
+          <w:rtl/>
+        </w:rPr>
+        <w:t>مس</w:t>
+      </w:r>
+      <w:r>
+        <w:rPr>
+          <w:rFonts w:cs="Arial" w:hint="cs"/>
+          <w:rtl/>
+        </w:rPr>
+        <w:t>ی</w:t>
+      </w:r>
+      <w:r>
+        <w:rPr>
+          <w:rFonts w:cs="Arial" w:hint="eastAsia"/>
+          <w:rtl/>
+        </w:rPr>
+        <w:t>ر</w:t>
+      </w:r>
+      <w:r>
+        <w:rPr>
+          <w:rFonts w:cs="Arial"/>
+          <w:rtl/>
+        </w:rPr>
+        <w:t xml:space="preserve"> </w:t>
+      </w:r>
+      <w:r>
+        <w:rPr>
+          <w:rFonts w:cs="Arial"/>
+          <w:rtl/>
+          <w:lang w:bidi="fa-IR"/>
+        </w:rPr>
+        <w:t xml:space="preserve">۴: </w:t>
+      </w:r>
+      <w:proofErr w:type="spellStart"/>
+      <w:r>
+        <w:t>WebSocket</w:t>
+      </w:r>
+      <w:proofErr w:type="spellEnd"/>
+      <w:r>
+        <w:t xml:space="preserve"> Command Channel</w:t>
+      </w:r>
+    </w:p>
+    <w:p>
+      <w:pPr>
+        <w:bidi/>
+      </w:pPr>
+      <w:r>
+        <w:t>Write</w:t>
+      </w:r>
+      <w:r>
+        <w:rPr>
+          <w:rFonts w:cs="Arial"/>
+          <w:rtl/>
+        </w:rPr>
+        <w:t xml:space="preserve"> به تگ‌ها از طر</w:t>
+      </w:r>
+      <w:r>
+        <w:rPr>
+          <w:rFonts w:cs="Arial" w:hint="cs"/>
+          <w:rtl/>
+        </w:rPr>
+        <w:t>ی</w:t>
+      </w:r>
+      <w:r>
+        <w:rPr>
+          <w:rFonts w:cs="Arial" w:hint="eastAsia"/>
+          <w:rtl/>
+        </w:rPr>
+        <w:t>ق</w:t>
+      </w:r>
+      <w:r>
+        <w:rPr>
+          <w:rFonts w:cs="Arial"/>
+          <w:rtl/>
+        </w:rPr>
+        <w:t xml:space="preserve"> </w:t>
+      </w:r>
+      <w:proofErr w:type="spellStart"/>
+      <w:r>
+        <w:t>WebSocket</w:t>
+      </w:r>
+      <w:proofErr w:type="spellEnd"/>
+    </w:p>
+    <w:p>
+      <w:pPr>
+        <w:bidi/>
+      </w:pPr>
+      <w:proofErr w:type="spellStart"/>
+      <w:r>
+        <w:t>Ack</w:t>
+      </w:r>
+      <w:proofErr w:type="spellEnd"/>
+      <w:r>
+        <w:rPr>
+          <w:rFonts w:cs="Arial"/>
+          <w:rtl/>
+        </w:rPr>
+        <w:t xml:space="preserve"> کردن آلارم از </w:t>
+      </w:r>
+      <w:proofErr w:type="spellStart"/>
+      <w:r>
+        <w:t>WebSocket</w:t>
+      </w:r>
+      <w:proofErr w:type="spellEnd"/>
+    </w:p>
+    <w:p>
+      <w:pPr>
+        <w:bidi/>
+      </w:pPr>
+      <w:r>
+        <w:t>Control commands (start/stop drivers)</w:t>
+      </w:r>
+    </w:p>
+    <w:p>
+      <w:pPr>
+        <w:pStyle w:val="Heading1"/>
+        <w:bidi/>
+      </w:pPr>
+      <w:r>
+        <w:rPr>
+          <w:rFonts w:hint="eastAsia"/>
+          <w:rtl/>
+        </w:rPr>
+        <w:t>مس</w:t>
+      </w:r>
+      <w:r>
+        <w:rPr>
+          <w:rFonts w:hint="cs"/>
+          <w:rtl/>
+        </w:rPr>
+        <w:t>ی</w:t>
+      </w:r>
+      <w:r>
+        <w:rPr>
+          <w:rFonts w:hint="eastAsia"/>
+          <w:rtl/>
+        </w:rPr>
+        <w:t>ر</w:t>
+      </w:r>
+      <w:r>
+        <w:rPr>
+          <w:rtl/>
+        </w:rPr>
+        <w:t xml:space="preserve"> </w:t>
+      </w:r>
+      <w:r>
+        <w:rPr>
+          <w:rtl/>
+          <w:lang w:bidi="fa-IR"/>
+        </w:rPr>
+        <w:t xml:space="preserve">۵: </w:t>
+      </w:r>
+      <w:r>
+        <w:rPr>
+          <w:rtl/>
+        </w:rPr>
+        <w:t>بهبودها</w:t>
+      </w:r>
+      <w:r>
+        <w:rPr>
+          <w:rFonts w:hint="cs"/>
+          <w:rtl/>
+        </w:rPr>
+        <w:t>ی</w:t>
+      </w:r>
+      <w:r>
+        <w:rPr>
+          <w:rtl/>
+        </w:rPr>
+        <w:t xml:space="preserve"> فن</w:t>
+      </w:r>
+      <w:r>
+        <w:rPr>
+          <w:rFonts w:hint="cs"/>
+          <w:rtl/>
+        </w:rPr>
+        <w:t>ی</w:t>
+      </w:r>
+    </w:p>
+    <w:p>
+      <w:pPr>
+        <w:bidi/>
+      </w:pPr>
+      <w:r>
+        <w:t>SSL/TLS</w:t>
+      </w:r>
+      <w:r>
+        <w:rPr>
+          <w:rFonts w:cs="Arial"/>
+          <w:rtl/>
+        </w:rPr>
+        <w:t xml:space="preserve"> (</w:t>
+      </w:r>
+      <w:r>
+        <w:t>HTTPS</w:t>
+      </w:r>
+      <w:r>
+        <w:rPr>
+          <w:rFonts w:cs="Arial"/>
+          <w:rtl/>
+        </w:rPr>
+        <w:t xml:space="preserve"> و </w:t>
+      </w:r>
+      <w:r>
+        <w:t>WSS</w:t>
+      </w:r>
+      <w:r>
+        <w:rPr>
+          <w:rFonts w:cs="Arial"/>
+          <w:rtl/>
+        </w:rPr>
+        <w:t>)</w:t>
+      </w:r>
+    </w:p>
+    <w:p>
+      <w:pPr>
+        <w:bidi/>
+      </w:pPr>
+      <w:r>
+        <w:t>Rate limiting</w:t>
+      </w:r>
+    </w:p>
+    <w:p>
+      <w:pPr>
+        <w:bidi/>
+      </w:pPr>
+      <w:r>
+        <w:lastRenderedPageBreak/>
+        <w:t>Request logging</w:t>
+      </w:r>
+      <w:r>
+        <w:rPr>
+          <w:rFonts w:cs="Arial"/>
+          <w:rtl/>
+        </w:rPr>
+        <w:t xml:space="preserve"> و </w:t>
+      </w:r>
+      <w:r>
+        <w:t>monitoring</w:t>
+      </w:r>
+    </w:p>
+    <w:p>
+      <w:pPr>
+        <w:bidi/>
+      </w:pPr>
+      <w:r>
+        <w:t>Health check endpoints</w:t>
+      </w:r>
+    </w:p>
+    <w:p>
+      <w:pPr>
+        <w:bidi/>
+      </w:pPr>
+      <w:r>
+        <w:t>API documentation (</w:t>
+      </w:r>
+      <w:proofErr w:type="spellStart"/>
+      <w:r>
+        <w:t>OpenAPI</w:t>
+      </w:r>
+      <w:proofErr w:type="spellEnd"/>
+      <w:r>
+        <w:t>/Swagger)</w:t>
+      </w:r>
+    </w:p>
+    <w:p>
+      <w:pPr>
+        <w:pStyle w:val="Heading1"/>
+        <w:bidi/>
+      </w:pPr>
+      <w:r>
+        <w:rPr>
+          <w:rFonts w:hint="eastAsia"/>
+          <w:rtl/>
+        </w:rPr>
+        <w:t>پ</w:t>
+      </w:r>
+      <w:r>
+        <w:rPr>
+          <w:rFonts w:hint="cs"/>
+          <w:rtl/>
+        </w:rPr>
+        <w:t>ی</w:t>
+      </w:r>
+      <w:r>
+        <w:rPr>
+          <w:rFonts w:hint="eastAsia"/>
+          <w:rtl/>
+        </w:rPr>
+        <w:t>شنهاد</w:t>
+      </w:r>
+      <w:r>
+        <w:rPr>
+          <w:rtl/>
+        </w:rPr>
+        <w:t xml:space="preserve"> من برا</w:t>
+      </w:r>
+      <w:r>
+        <w:rPr>
+          <w:rFonts w:hint="cs"/>
+          <w:rtl/>
+        </w:rPr>
+        <w:t>ی</w:t>
+      </w:r>
+      <w:r>
+        <w:rPr>
+          <w:rtl/>
+        </w:rPr>
+        <w:t xml:space="preserve"> ادامه</w:t>
+      </w:r>
+    </w:p>
+    <w:p>
+      <w:pPr>
+        <w:pStyle w:val="Heading1"/>
+        <w:bidi/>
+      </w:pPr>
+      <w:r>
+        <w:rPr>
+          <w:rFonts w:hint="eastAsia"/>
+          <w:rtl/>
+        </w:rPr>
+        <w:t>ترک</w:t>
+      </w:r>
+      <w:r>
+        <w:rPr>
+          <w:rFonts w:hint="cs"/>
+          <w:rtl/>
+        </w:rPr>
+        <w:t>ی</w:t>
+      </w:r>
+      <w:r>
+        <w:rPr>
+          <w:rFonts w:hint="eastAsia"/>
+          <w:rtl/>
+        </w:rPr>
+        <w:t>ب</w:t>
+      </w:r>
+      <w:r>
+        <w:rPr>
+          <w:rtl/>
+        </w:rPr>
+        <w:t xml:space="preserve"> مس</w:t>
+      </w:r>
+      <w:r>
+        <w:rPr>
+          <w:rFonts w:hint="cs"/>
+          <w:rtl/>
+        </w:rPr>
+        <w:t>ی</w:t>
+      </w:r>
+      <w:r>
+        <w:rPr>
+          <w:rFonts w:hint="eastAsia"/>
+          <w:rtl/>
+        </w:rPr>
+        <w:t>ر</w:t>
+      </w:r>
+      <w:r>
+        <w:rPr>
+          <w:rtl/>
+        </w:rPr>
+        <w:t xml:space="preserve"> </w:t>
+      </w:r>
+      <w:r>
+        <w:rPr>
+          <w:rtl/>
+          <w:lang w:bidi="fa-IR"/>
+        </w:rPr>
+        <w:t>۱</w:t>
+      </w:r>
+      <w:r>
+        <w:rPr>
+          <w:rtl/>
+        </w:rPr>
+        <w:t xml:space="preserve"> و </w:t>
+      </w:r>
+      <w:r>
+        <w:rPr>
+          <w:rtl/>
+          <w:lang w:bidi="fa-IR"/>
+        </w:rPr>
+        <w:t>۲</w:t>
+      </w:r>
+      <w:r>
+        <w:rPr>
+          <w:rtl/>
+        </w:rPr>
+        <w:t xml:space="preserve"> به ا</w:t>
+      </w:r>
+      <w:r>
+        <w:rPr>
+          <w:rFonts w:hint="cs"/>
+          <w:rtl/>
+        </w:rPr>
+        <w:t>ی</w:t>
+      </w:r>
+      <w:r>
+        <w:rPr>
+          <w:rFonts w:hint="eastAsia"/>
+          <w:rtl/>
+        </w:rPr>
+        <w:t>ن</w:t>
+      </w:r>
+      <w:r>
+        <w:rPr>
+          <w:rtl/>
+        </w:rPr>
+        <w:t xml:space="preserve"> ترت</w:t>
+      </w:r>
+      <w:r>
+        <w:rPr>
+          <w:rFonts w:hint="cs"/>
+          <w:rtl/>
+        </w:rPr>
+        <w:t>ی</w:t>
+      </w:r>
+      <w:r>
+        <w:rPr>
+          <w:rFonts w:hint="eastAsia"/>
+          <w:rtl/>
+        </w:rPr>
+        <w:t>ب</w:t>
+      </w:r>
+      <w:r>
+        <w:rPr>
+          <w:rtl/>
+        </w:rPr>
+        <w:t>:</w:t>
+      </w:r>
+    </w:p>
+    <w:p>
+      <w:pPr>
+        <w:bidi/>
+      </w:pPr>
+      <w:r>
+        <w:rPr>
+          <w:rFonts w:cs="Arial" w:hint="eastAsia"/>
+          <w:rtl/>
+        </w:rPr>
+        <w:t>تکم</w:t>
+      </w:r>
+      <w:r>
+        <w:rPr>
+          <w:rFonts w:cs="Arial" w:hint="cs"/>
+          <w:rtl/>
+        </w:rPr>
+        <w:t>ی</w:t>
+      </w:r>
+      <w:r>
+        <w:rPr>
+          <w:rFonts w:cs="Arial" w:hint="eastAsia"/>
+          <w:rtl/>
+        </w:rPr>
+        <w:t>ل</w:t>
+      </w:r>
+      <w:r>
+        <w:rPr>
+          <w:rFonts w:cs="Arial"/>
+          <w:rtl/>
+        </w:rPr>
+        <w:t xml:space="preserve"> </w:t>
+      </w:r>
+      <w:r>
+        <w:t>CRUD</w:t>
+      </w:r>
+      <w:r>
+        <w:rPr>
+          <w:rFonts w:cs="Arial"/>
+          <w:rtl/>
+        </w:rPr>
+        <w:t xml:space="preserve"> تگ‌ها (</w:t>
+      </w:r>
+      <w:r>
+        <w:t>POST/PUT/DELETE</w:t>
+      </w:r>
+      <w:r>
+        <w:rPr>
+          <w:rFonts w:cs="Arial"/>
+          <w:rtl/>
+        </w:rPr>
+        <w:t>)</w:t>
+      </w:r>
+    </w:p>
+    <w:p>
+      <w:pPr>
+        <w:bidi/>
+      </w:pPr>
+      <w:r>
+        <w:t>History Query</w:t>
+      </w:r>
+      <w:r>
+        <w:rPr>
+          <w:rFonts w:cs="Arial"/>
+          <w:rtl/>
+        </w:rPr>
+        <w:t xml:space="preserve"> برا</w:t>
+      </w:r>
+      <w:r>
+        <w:rPr>
+          <w:rFonts w:cs="Arial" w:hint="cs"/>
+          <w:rtl/>
+        </w:rPr>
+        <w:t>ی</w:t>
+      </w:r>
+      <w:r>
+        <w:rPr>
+          <w:rFonts w:cs="Arial"/>
+          <w:rtl/>
+        </w:rPr>
+        <w:t xml:space="preserve"> داده‌ها</w:t>
+      </w:r>
+      <w:r>
+        <w:rPr>
+          <w:rFonts w:cs="Arial" w:hint="cs"/>
+          <w:rtl/>
+        </w:rPr>
+        <w:t>ی</w:t>
+      </w:r>
+      <w:r>
+        <w:rPr>
+          <w:rFonts w:cs="Arial"/>
+          <w:rtl/>
+        </w:rPr>
+        <w:t xml:space="preserve"> تار</w:t>
+      </w:r>
+      <w:r>
+        <w:rPr>
+          <w:rFonts w:cs="Arial" w:hint="cs"/>
+          <w:rtl/>
+        </w:rPr>
+        <w:t>ی</w:t>
+      </w:r>
+      <w:r>
+        <w:rPr>
+          <w:rFonts w:cs="Arial" w:hint="eastAsia"/>
+          <w:rtl/>
+        </w:rPr>
+        <w:t>خ</w:t>
+      </w:r>
+      <w:r>
+        <w:rPr>
+          <w:rFonts w:cs="Arial" w:hint="cs"/>
+          <w:rtl/>
+        </w:rPr>
+        <w:t>ی</w:t>
+      </w:r>
+    </w:p>
+    <w:p>
+      <w:pPr>
+        <w:bidi/>
+      </w:pPr>
+      <w:r>
+        <w:t>Authentication</w:t>
+      </w:r>
+      <w:r>
+        <w:rPr>
+          <w:rFonts w:cs="Arial"/>
+          <w:rtl/>
+        </w:rPr>
+        <w:t xml:space="preserve"> ساده با </w:t>
+      </w:r>
+      <w:r>
+        <w:t>API Key</w:t>
+      </w:r>
+    </w:p>
+    <w:p>
+      <w:pPr>
+        <w:bidi/>
+      </w:pPr>
+      <w:r>
+        <w:t>Dashboard API</w:t>
+      </w:r>
+      <w:r>
+        <w:rPr>
+          <w:rFonts w:cs="Arial"/>
+          <w:rtl/>
+        </w:rPr>
+        <w:t xml:space="preserve"> برا</w:t>
+      </w:r>
+      <w:r>
+        <w:rPr>
+          <w:rFonts w:cs="Arial" w:hint="cs"/>
+          <w:rtl/>
+        </w:rPr>
+        <w:t>ی</w:t>
+      </w:r>
+      <w:r>
+        <w:rPr>
+          <w:rFonts w:cs="Arial"/>
+          <w:rtl/>
+        </w:rPr>
+        <w:t xml:space="preserve"> صفحات </w:t>
+      </w:r>
+      <w:r>
+        <w:t>HMI</w:t>
+      </w:r>
+    </w:p>
+    <w:p>
+      <w:pPr>
+        <w:bidi/>
+      </w:pPr>
+      <w:r>
+        <w:rPr>
+          <w:rFonts w:cs="Arial" w:hint="eastAsia"/>
+          <w:rtl/>
+        </w:rPr>
+        <w:t>ا</w:t>
+      </w:r>
+      <w:r>
+        <w:rPr>
+          <w:rFonts w:cs="Arial" w:hint="cs"/>
+          <w:rtl/>
+        </w:rPr>
+        <w:t>ی</w:t>
+      </w:r>
+      <w:r>
+        <w:rPr>
+          <w:rFonts w:cs="Arial" w:hint="eastAsia"/>
+          <w:rtl/>
+        </w:rPr>
+        <w:t>ن</w:t>
+      </w:r>
+      <w:r>
+        <w:rPr>
+          <w:rFonts w:cs="Arial"/>
+          <w:rtl/>
+        </w:rPr>
+        <w:t xml:space="preserve"> ترک</w:t>
+      </w:r>
+      <w:r>
+        <w:rPr>
+          <w:rFonts w:cs="Arial" w:hint="cs"/>
+          <w:rtl/>
+        </w:rPr>
+        <w:t>ی</w:t>
+      </w:r>
+      <w:r>
+        <w:rPr>
+          <w:rFonts w:cs="Arial" w:hint="eastAsia"/>
+          <w:rtl/>
+        </w:rPr>
+        <w:t>ب</w:t>
+      </w:r>
+      <w:r>
+        <w:rPr>
+          <w:rFonts w:cs="Arial"/>
+          <w:rtl/>
+        </w:rPr>
+        <w:t xml:space="preserve"> باعث م</w:t>
+      </w:r>
+      <w:r>
+        <w:rPr>
+          <w:rFonts w:cs="Arial" w:hint="cs"/>
+          <w:rtl/>
+        </w:rPr>
+        <w:t>ی‌</w:t>
+      </w:r>
+      <w:r>
+        <w:rPr>
+          <w:rFonts w:cs="Arial" w:hint="eastAsia"/>
+          <w:rtl/>
+        </w:rPr>
+        <w:t>شود</w:t>
+      </w:r>
+      <w:r>
+        <w:rPr>
+          <w:rFonts w:cs="Arial"/>
+          <w:rtl/>
+        </w:rPr>
+        <w:t>:</w:t>
+      </w:r>
+    </w:p>
+    <w:p>
+      <w:pPr>
+        <w:bidi/>
+      </w:pPr>
+      <w:r>
+        <w:t>GUI</w:t>
+      </w:r>
+      <w:r>
+        <w:rPr>
+          <w:rFonts w:cs="Arial"/>
+          <w:rtl/>
+        </w:rPr>
+        <w:t xml:space="preserve"> مد</w:t>
+      </w:r>
+      <w:r>
+        <w:rPr>
+          <w:rFonts w:cs="Arial" w:hint="cs"/>
+          <w:rtl/>
+        </w:rPr>
+        <w:t>ی</w:t>
+      </w:r>
+      <w:r>
+        <w:rPr>
+          <w:rFonts w:cs="Arial" w:hint="eastAsia"/>
+          <w:rtl/>
+        </w:rPr>
+        <w:t>ر</w:t>
+      </w:r>
+      <w:r>
+        <w:rPr>
+          <w:rFonts w:cs="Arial" w:hint="cs"/>
+          <w:rtl/>
+        </w:rPr>
+        <w:t>ی</w:t>
+      </w:r>
+      <w:r>
+        <w:rPr>
+          <w:rFonts w:cs="Arial" w:hint="eastAsia"/>
+          <w:rtl/>
+        </w:rPr>
+        <w:t>ت</w:t>
+      </w:r>
+      <w:r>
+        <w:rPr>
+          <w:rFonts w:cs="Arial"/>
+          <w:rtl/>
+        </w:rPr>
+        <w:t xml:space="preserve"> تگ‌ها کامل شود</w:t>
+      </w:r>
+    </w:p>
+    <w:p>
+      <w:pPr>
+        <w:bidi/>
+      </w:pPr>
+      <w:r>
+        <w:t>GUI</w:t>
+      </w:r>
+      <w:r>
+        <w:rPr>
+          <w:rFonts w:cs="Arial"/>
+          <w:rtl/>
+        </w:rPr>
+        <w:t xml:space="preserve"> گزارش‌گ</w:t>
+      </w:r>
+      <w:r>
+        <w:rPr>
+          <w:rFonts w:cs="Arial" w:hint="cs"/>
+          <w:rtl/>
+        </w:rPr>
+        <w:t>ی</w:t>
+      </w:r>
+      <w:r>
+        <w:rPr>
+          <w:rFonts w:cs="Arial" w:hint="eastAsia"/>
+          <w:rtl/>
+        </w:rPr>
+        <w:t>ر</w:t>
+      </w:r>
+      <w:r>
+        <w:rPr>
+          <w:rFonts w:cs="Arial" w:hint="cs"/>
+          <w:rtl/>
+        </w:rPr>
+        <w:t>ی</w:t>
+      </w:r>
+      <w:r>
+        <w:rPr>
+          <w:rFonts w:cs="Arial"/>
+          <w:rtl/>
+        </w:rPr>
+        <w:t xml:space="preserve"> کار کند</w:t>
+      </w:r>
+    </w:p>
+    <w:p>
+      <w:pPr>
+        <w:bidi/>
+      </w:pPr>
+      <w:r>
+        <w:t>GUI</w:t>
+      </w:r>
+      <w:r>
+        <w:rPr>
+          <w:rFonts w:cs="Arial"/>
+          <w:rtl/>
+        </w:rPr>
+        <w:t xml:space="preserve"> صفحات آنلا</w:t>
+      </w:r>
+      <w:r>
+        <w:rPr>
+          <w:rFonts w:cs="Arial" w:hint="cs"/>
+          <w:rtl/>
+        </w:rPr>
+        <w:t>ی</w:t>
+      </w:r>
+      <w:r>
+        <w:rPr>
+          <w:rFonts w:cs="Arial" w:hint="eastAsia"/>
+          <w:rtl/>
+        </w:rPr>
+        <w:t>ن</w:t>
+      </w:r>
+      <w:r>
+        <w:rPr>
+          <w:rFonts w:cs="Arial"/>
+          <w:rtl/>
+        </w:rPr>
+        <w:t xml:space="preserve"> کاربر با امن</w:t>
+      </w:r>
+      <w:r>
+        <w:rPr>
+          <w:rFonts w:cs="Arial" w:hint="cs"/>
+          <w:rtl/>
+        </w:rPr>
+        <w:t>ی</w:t>
+      </w:r>
+      <w:r>
+        <w:rPr>
+          <w:rFonts w:cs="Arial" w:hint="eastAsia"/>
+          <w:rtl/>
+        </w:rPr>
+        <w:t>ت</w:t>
+      </w:r>
+      <w:r>
+        <w:rPr>
+          <w:rFonts w:cs="Arial"/>
+          <w:rtl/>
+        </w:rPr>
+        <w:t xml:space="preserve"> کار کند</w:t>
+      </w:r>
+    </w:p>
+    <w:p>
+      <w:pPr>
+        <w:bidi/>
+      </w:pPr>
+      <w:r>
+        <w:rPr>
+          <w:rFonts w:cs="Arial" w:hint="eastAsia"/>
+          <w:rtl/>
+        </w:rPr>
+        <w:t>کنترل</w:t>
+      </w:r>
+      <w:r>
+        <w:rPr>
+          <w:rFonts w:cs="Arial"/>
+          <w:rtl/>
+        </w:rPr>
+        <w:t xml:space="preserve"> پنل مرکز</w:t>
+      </w:r>
+      <w:r>
+        <w:rPr>
+          <w:rFonts w:cs="Arial" w:hint="cs"/>
+          <w:rtl/>
+        </w:rPr>
+        <w:t>ی</w:t>
+      </w:r>
+      <w:r>
+        <w:rPr>
+          <w:rFonts w:cs="Arial"/>
+          <w:rtl/>
+        </w:rPr>
+        <w:t xml:space="preserve"> کامل شود</w:t>
+      </w:r>
     </w:p>
     <w:sectPr>
       <w:pgSz w:w="12240" w:h="15840"/>
@@ -410,6 +2945,27 @@
     <w:name w:val="Normal"/>
     <w:qFormat/>
   </w:style>
+  <w:style w:type="paragraph" w:styleId="Heading1">
+    <w:name w:val="heading 1"/>
+    <w:basedOn w:val="Normal"/>
+    <w:next w:val="Normal"/>
+    <w:link w:val="Heading1Char"/>
+    <w:uiPriority w:val="9"/>
+    <w:qFormat/>
+    <w:rsid w:val="003D5AA9"/>
+    <w:pPr>
+      <w:keepNext/>
+      <w:keepLines/>
+      <w:spacing w:before="240" w:after="0"/>
+      <w:outlineLvl w:val="0"/>
+    </w:pPr>
+    <w:rPr>
+      <w:rFonts w:asciiTheme="majorHAnsi" w:eastAsiaTheme="majorEastAsia" w:hAnsiTheme="majorHAnsi" w:cstheme="majorBidi"/>
+      <w:color w:val="2E74B5" w:themeColor="accent1" w:themeShade="BF"/>
+      <w:sz w:val="32"/>
+      <w:szCs w:val="32"/>
+    </w:rPr>
+  </w:style>
   <w:style w:type="character" w:default="1" w:styleId="DefaultParagraphFont">
     <w:name w:val="Default Paragraph Font"/>
     <w:uiPriority w:val="1"/>
@@ -436,6 +2992,19 @@
     <w:uiPriority w:val="99"/>
     <w:semiHidden/>
     <w:unhideWhenUsed/>
+  </w:style>
+  <w:style w:type="character" w:customStyle="1" w:styleId="Heading1Char">
+    <w:name w:val="Heading 1 Char"/>
+    <w:basedOn w:val="DefaultParagraphFont"/>
+    <w:link w:val="Heading1"/>
+    <w:uiPriority w:val="9"/>
+    <w:rsid w:val="003D5AA9"/>
+    <w:rPr>
+      <w:rFonts w:asciiTheme="majorHAnsi" w:eastAsiaTheme="majorEastAsia" w:hAnsiTheme="majorHAnsi" w:cstheme="majorBidi"/>
+      <w:color w:val="2E74B5" w:themeColor="accent1" w:themeShade="BF"/>
+      <w:sz w:val="32"/>
+      <w:szCs w:val="32"/>
+    </w:rPr>
   </w:style>
 </w:styles>
 </file>

</xml_diff>

<commit_message>
add start/stop driver APi
</commit_message>
<xml_diff>
--- a/API Layer.docx
+++ b/API Layer.docx
@@ -3058,6 +3058,14 @@
           </wp:inline>
         </w:drawing>
       </w:r>
+    </w:p>
+    <w:p>
+      <w:pPr>
+        <w:bidi/>
+        <w:rPr>
+          <w:lang w:bidi="fa-IR"/>
+        </w:rPr>
+      </w:pPr>
       <w:bookmarkStart w:id="0" w:name="_GoBack"/>
       <w:bookmarkEnd w:id="0"/>
     </w:p>

</xml_diff>

<commit_message>
add alarm ack . add user manager
</commit_message>
<xml_diff>
--- a/API Layer.docx
+++ b/API Layer.docx
@@ -134,26 +134,16 @@
         </w:rPr>
         <w:t xml:space="preserve">۱: </w:t>
       </w:r>
-      <w:proofErr w:type="spellStart"/>
-      <w:r>
-        <w:t>WebSocket</w:t>
-      </w:r>
-      <w:proofErr w:type="spellEnd"/>
-      <w:r>
-        <w:t xml:space="preserve"> Server</w:t>
-      </w:r>
-    </w:p>
-    <w:p>
-      <w:pPr>
-        <w:bidi/>
-      </w:pPr>
-      <w:proofErr w:type="spellStart"/>
-      <w:r>
-        <w:t>WebSocket</w:t>
-      </w:r>
-      <w:proofErr w:type="spellEnd"/>
-      <w:r>
-        <w:t xml:space="preserve"> Server</w:t>
+      <w:r>
+        <w:t>WebSocket Server</w:t>
+      </w:r>
+    </w:p>
+    <w:p>
+      <w:pPr>
+        <w:bidi/>
+      </w:pPr>
+      <w:r>
+        <w:t>WebSocket Server</w:t>
       </w:r>
       <w:r>
         <w:rPr>
@@ -432,11 +422,9 @@
         </w:rPr>
         <w:t xml:space="preserve"> با </w:t>
       </w:r>
-      <w:proofErr w:type="spellStart"/>
       <w:r>
         <w:t>TagBus</w:t>
       </w:r>
-      <w:proofErr w:type="spellEnd"/>
       <w:r>
         <w:rPr>
           <w:rFonts w:cs="Arial"/>
@@ -588,15 +576,7 @@
         <w:bidi/>
       </w:pPr>
       <w:r>
-        <w:t>GET /</w:t>
-      </w:r>
-      <w:proofErr w:type="spellStart"/>
-      <w:r>
-        <w:t>api</w:t>
-      </w:r>
-      <w:proofErr w:type="spellEnd"/>
-      <w:r>
-        <w:t>/v1/tags</w:t>
+        <w:t>GET /api/v1/tags</w:t>
       </w:r>
       <w:r>
         <w:rPr>
@@ -632,15 +612,7 @@
         <w:bidi/>
       </w:pPr>
       <w:r>
-        <w:t>GET /</w:t>
-      </w:r>
-      <w:proofErr w:type="spellStart"/>
-      <w:r>
-        <w:t>api</w:t>
-      </w:r>
-      <w:proofErr w:type="spellEnd"/>
-      <w:r>
-        <w:t>/v1/tags/{id}</w:t>
+        <w:t>GET /api/v1/tags/{id}</w:t>
       </w:r>
       <w:r>
         <w:rPr>
@@ -676,15 +648,7 @@
         <w:bidi/>
       </w:pPr>
       <w:r>
-        <w:t>GET /</w:t>
-      </w:r>
-      <w:proofErr w:type="spellStart"/>
-      <w:r>
-        <w:t>api</w:t>
-      </w:r>
-      <w:proofErr w:type="spellEnd"/>
-      <w:r>
-        <w:t>/v1/tags/{id}/current</w:t>
+        <w:t>GET /api/v1/tags/{id}/current</w:t>
       </w:r>
       <w:r>
         <w:rPr>
@@ -706,15 +670,7 @@
         <w:bidi/>
       </w:pPr>
       <w:r>
-        <w:t>GET /</w:t>
-      </w:r>
-      <w:proofErr w:type="spellStart"/>
-      <w:r>
-        <w:t>api</w:t>
-      </w:r>
-      <w:proofErr w:type="spellEnd"/>
-      <w:r>
-        <w:t>/v1/alarms</w:t>
+        <w:t>GET /api/v1/alarms</w:t>
       </w:r>
       <w:r>
         <w:rPr>
@@ -760,29 +716,8 @@
         <w:bidi/>
       </w:pPr>
       <w:r>
-        <w:t>POST /</w:t>
-      </w:r>
-      <w:proofErr w:type="spellStart"/>
-      <w:r>
-        <w:t>api</w:t>
-      </w:r>
-      <w:proofErr w:type="spellEnd"/>
-      <w:r>
-        <w:t>/v1/alarms/{id}/</w:t>
-      </w:r>
-      <w:proofErr w:type="spellStart"/>
-      <w:r>
-        <w:t>ack</w:t>
-      </w:r>
-      <w:proofErr w:type="spellEnd"/>
-      <w:r>
-        <w:t xml:space="preserve"> - </w:t>
-      </w:r>
-      <w:proofErr w:type="spellStart"/>
-      <w:r>
-        <w:t>Ack</w:t>
-      </w:r>
-      <w:proofErr w:type="spellEnd"/>
+        <w:t>POST /api/v1/alarms/{id}/ack - Ack</w:t>
+      </w:r>
       <w:r>
         <w:rPr>
           <w:rFonts w:cs="Arial"/>
@@ -796,15 +731,7 @@
         <w:bidi/>
       </w:pPr>
       <w:r>
-        <w:t>GET /</w:t>
-      </w:r>
-      <w:proofErr w:type="spellStart"/>
-      <w:r>
-        <w:t>api</w:t>
-      </w:r>
-      <w:proofErr w:type="spellEnd"/>
-      <w:r>
-        <w:t>/v1/drivers</w:t>
+        <w:t>GET /api/v1/drivers</w:t>
       </w:r>
       <w:r>
         <w:rPr>
@@ -854,15 +781,7 @@
         <w:bidi/>
       </w:pPr>
       <w:r>
-        <w:t>GET /</w:t>
-      </w:r>
-      <w:proofErr w:type="spellStart"/>
-      <w:r>
-        <w:t>api</w:t>
-      </w:r>
-      <w:proofErr w:type="spellEnd"/>
-      <w:r>
-        <w:t>/v1/system/status</w:t>
+        <w:t>GET /api/v1/system/status</w:t>
       </w:r>
       <w:r>
         <w:rPr>
@@ -1140,15 +1059,7 @@
         <w:bidi/>
       </w:pPr>
       <w:r>
-        <w:t>POST /</w:t>
-      </w:r>
-      <w:proofErr w:type="spellStart"/>
-      <w:r>
-        <w:t>api</w:t>
-      </w:r>
-      <w:proofErr w:type="spellEnd"/>
-      <w:r>
-        <w:t>/v1/tags</w:t>
+        <w:t>POST /api/v1/tags</w:t>
       </w:r>
       <w:r>
         <w:rPr>
@@ -1177,15 +1088,7 @@
         <w:bidi/>
       </w:pPr>
       <w:r>
-        <w:t>PUT /</w:t>
-      </w:r>
-      <w:proofErr w:type="spellStart"/>
-      <w:r>
-        <w:t>api</w:t>
-      </w:r>
-      <w:proofErr w:type="spellEnd"/>
-      <w:r>
-        <w:t>/v1/tags/{id}</w:t>
+        <w:t>PUT /api/v1/tags/{id}</w:t>
       </w:r>
       <w:r>
         <w:rPr>
@@ -1235,15 +1138,7 @@
         <w:bidi/>
       </w:pPr>
       <w:r>
-        <w:t>DELETE /</w:t>
-      </w:r>
-      <w:proofErr w:type="spellStart"/>
-      <w:r>
-        <w:t>api</w:t>
-      </w:r>
-      <w:proofErr w:type="spellEnd"/>
-      <w:r>
-        <w:t>/v1/tags/{id}</w:t>
+        <w:t>DELETE /api/v1/tags/{id}</w:t>
       </w:r>
       <w:r>
         <w:rPr>
@@ -1258,15 +1153,7 @@
         <w:bidi/>
       </w:pPr>
       <w:r>
-        <w:t>GET /</w:t>
-      </w:r>
-      <w:proofErr w:type="spellStart"/>
-      <w:r>
-        <w:t>api</w:t>
-      </w:r>
-      <w:proofErr w:type="spellEnd"/>
-      <w:r>
-        <w:t>/v1/tags/{id}/history - Query</w:t>
+        <w:t>GET /api/v1/tags/{id}/history - Query</w:t>
       </w:r>
       <w:r>
         <w:rPr>
@@ -1343,15 +1230,7 @@
         <w:bidi/>
       </w:pPr>
       <w:r>
-        <w:t>GET /</w:t>
-      </w:r>
-      <w:proofErr w:type="spellStart"/>
-      <w:r>
-        <w:t>api</w:t>
-      </w:r>
-      <w:proofErr w:type="spellEnd"/>
-      <w:r>
-        <w:t>/v1/tags/{id}/aggregates - Query</w:t>
+        <w:t>GET /api/v1/tags/{id}/aggregates - Query</w:t>
       </w:r>
       <w:r>
         <w:rPr>
@@ -1369,15 +1248,7 @@
         <w:bidi/>
       </w:pPr>
       <w:r>
-        <w:t>GET /</w:t>
-      </w:r>
-      <w:proofErr w:type="spellStart"/>
-      <w:r>
-        <w:t>api</w:t>
-      </w:r>
-      <w:proofErr w:type="spellEnd"/>
-      <w:r>
-        <w:t>/v1/rules</w:t>
+        <w:t>GET /api/v1/rules</w:t>
       </w:r>
       <w:r>
         <w:rPr>
@@ -1423,15 +1294,7 @@
         <w:bidi/>
       </w:pPr>
       <w:r>
-        <w:t>POST /</w:t>
-      </w:r>
-      <w:proofErr w:type="spellStart"/>
-      <w:r>
-        <w:t>api</w:t>
-      </w:r>
-      <w:proofErr w:type="spellEnd"/>
-      <w:r>
-        <w:t>/v1/rules</w:t>
+        <w:t>POST /api/v1/rules</w:t>
       </w:r>
       <w:r>
         <w:rPr>
@@ -1576,11 +1439,9 @@
         </w:rPr>
         <w:t xml:space="preserve"> در </w:t>
       </w:r>
-      <w:proofErr w:type="spellStart"/>
       <w:r>
         <w:t>WebSocket</w:t>
       </w:r>
-      <w:proofErr w:type="spellEnd"/>
       <w:r>
         <w:rPr>
           <w:rFonts w:cs="Arial"/>
@@ -1665,129 +1526,110 @@
         <w:bidi/>
       </w:pPr>
       <w:r>
-        <w:t xml:space="preserve">Dashboard-specific </w:t>
-      </w:r>
-      <w:proofErr w:type="spellStart"/>
+        <w:t>Dashboard-specific WebSocket channels</w:t>
+      </w:r>
+    </w:p>
+    <w:p>
+      <w:pPr>
+        <w:pStyle w:val="Heading1"/>
+        <w:bidi/>
+      </w:pPr>
+      <w:r>
+        <w:rPr>
+          <w:rFonts w:cs="Arial" w:hint="eastAsia"/>
+          <w:rtl/>
+        </w:rPr>
+        <w:t>مس</w:t>
+      </w:r>
+      <w:r>
+        <w:rPr>
+          <w:rFonts w:cs="Arial" w:hint="cs"/>
+          <w:rtl/>
+        </w:rPr>
+        <w:t>ی</w:t>
+      </w:r>
+      <w:r>
+        <w:rPr>
+          <w:rFonts w:cs="Arial" w:hint="eastAsia"/>
+          <w:rtl/>
+        </w:rPr>
+        <w:t>ر</w:t>
+      </w:r>
+      <w:r>
+        <w:rPr>
+          <w:rFonts w:cs="Arial"/>
+          <w:rtl/>
+        </w:rPr>
+        <w:t xml:space="preserve"> </w:t>
+      </w:r>
+      <w:r>
+        <w:rPr>
+          <w:rFonts w:cs="Arial"/>
+          <w:rtl/>
+          <w:lang w:bidi="fa-IR"/>
+        </w:rPr>
+        <w:t xml:space="preserve">۴: </w:t>
+      </w:r>
+      <w:r>
+        <w:t>WebSocket Command Channel</w:t>
+      </w:r>
+    </w:p>
+    <w:p>
+      <w:pPr>
+        <w:bidi/>
+      </w:pPr>
+      <w:r>
+        <w:t>Write</w:t>
+      </w:r>
+      <w:r>
+        <w:rPr>
+          <w:rFonts w:cs="Arial"/>
+          <w:rtl/>
+        </w:rPr>
+        <w:t xml:space="preserve"> به تگ‌ها از طر</w:t>
+      </w:r>
+      <w:r>
+        <w:rPr>
+          <w:rFonts w:cs="Arial" w:hint="cs"/>
+          <w:rtl/>
+        </w:rPr>
+        <w:t>ی</w:t>
+      </w:r>
+      <w:r>
+        <w:rPr>
+          <w:rFonts w:cs="Arial" w:hint="eastAsia"/>
+          <w:rtl/>
+        </w:rPr>
+        <w:t>ق</w:t>
+      </w:r>
+      <w:r>
+        <w:rPr>
+          <w:rFonts w:cs="Arial"/>
+          <w:rtl/>
+        </w:rPr>
+        <w:t xml:space="preserve"> </w:t>
+      </w:r>
       <w:r>
         <w:t>WebSocket</w:t>
       </w:r>
-      <w:proofErr w:type="spellEnd"/>
-      <w:r>
-        <w:t xml:space="preserve"> channels</w:t>
-      </w:r>
-    </w:p>
-    <w:p>
-      <w:pPr>
-        <w:pStyle w:val="Heading1"/>
-        <w:bidi/>
-      </w:pPr>
-      <w:r>
-        <w:rPr>
-          <w:rFonts w:cs="Arial" w:hint="eastAsia"/>
-          <w:rtl/>
-        </w:rPr>
-        <w:t>مس</w:t>
-      </w:r>
-      <w:r>
-        <w:rPr>
-          <w:rFonts w:cs="Arial" w:hint="cs"/>
-          <w:rtl/>
-        </w:rPr>
-        <w:t>ی</w:t>
-      </w:r>
-      <w:r>
-        <w:rPr>
-          <w:rFonts w:cs="Arial" w:hint="eastAsia"/>
-          <w:rtl/>
-        </w:rPr>
-        <w:t>ر</w:t>
-      </w:r>
-      <w:r>
-        <w:rPr>
-          <w:rFonts w:cs="Arial"/>
-          <w:rtl/>
-        </w:rPr>
-        <w:t xml:space="preserve"> </w:t>
-      </w:r>
-      <w:r>
-        <w:rPr>
-          <w:rFonts w:cs="Arial"/>
-          <w:rtl/>
-          <w:lang w:bidi="fa-IR"/>
-        </w:rPr>
-        <w:t xml:space="preserve">۴: </w:t>
-      </w:r>
-      <w:proofErr w:type="spellStart"/>
+    </w:p>
+    <w:p>
+      <w:pPr>
+        <w:bidi/>
+      </w:pPr>
+      <w:r>
+        <w:t>Ack</w:t>
+      </w:r>
+      <w:r>
+        <w:rPr>
+          <w:rFonts w:cs="Arial"/>
+          <w:rtl/>
+        </w:rPr>
+        <w:t xml:space="preserve"> کردن آلارم از </w:t>
+      </w:r>
       <w:r>
         <w:t>WebSocket</w:t>
       </w:r>
-      <w:proofErr w:type="spellEnd"/>
-      <w:r>
-        <w:t xml:space="preserve"> Command Channel</w:t>
-      </w:r>
-    </w:p>
-    <w:p>
-      <w:pPr>
-        <w:bidi/>
-      </w:pPr>
-      <w:r>
-        <w:t>Write</w:t>
-      </w:r>
-      <w:r>
-        <w:rPr>
-          <w:rFonts w:cs="Arial"/>
-          <w:rtl/>
-        </w:rPr>
-        <w:t xml:space="preserve"> به تگ‌ها از طر</w:t>
-      </w:r>
-      <w:r>
-        <w:rPr>
-          <w:rFonts w:cs="Arial" w:hint="cs"/>
-          <w:rtl/>
-        </w:rPr>
-        <w:t>ی</w:t>
-      </w:r>
-      <w:r>
-        <w:rPr>
-          <w:rFonts w:cs="Arial" w:hint="eastAsia"/>
-          <w:rtl/>
-        </w:rPr>
-        <w:t>ق</w:t>
-      </w:r>
-      <w:r>
-        <w:rPr>
-          <w:rFonts w:cs="Arial"/>
-          <w:rtl/>
-        </w:rPr>
-        <w:t xml:space="preserve"> </w:t>
-      </w:r>
-      <w:proofErr w:type="spellStart"/>
-      <w:r>
-        <w:t>WebSocket</w:t>
-      </w:r>
-      <w:proofErr w:type="spellEnd"/>
-    </w:p>
-    <w:p>
-      <w:pPr>
-        <w:bidi/>
-      </w:pPr>
-      <w:proofErr w:type="spellStart"/>
-      <w:r>
-        <w:t>Ack</w:t>
-      </w:r>
-      <w:proofErr w:type="spellEnd"/>
-      <w:r>
-        <w:rPr>
-          <w:rFonts w:cs="Arial"/>
-          <w:rtl/>
-        </w:rPr>
-        <w:t xml:space="preserve"> کردن آلارم از </w:t>
-      </w:r>
-      <w:proofErr w:type="spellStart"/>
-      <w:r>
-        <w:t>WebSocket</w:t>
-      </w:r>
-      <w:proofErr w:type="spellEnd"/>
     </w:p>
     <w:p>
       <w:pPr>
@@ -1938,15 +1780,7 @@
         <w:bidi/>
       </w:pPr>
       <w:r>
-        <w:t>API documentation (</w:t>
-      </w:r>
-      <w:proofErr w:type="spellStart"/>
-      <w:r>
-        <w:t>OpenAPI</w:t>
-      </w:r>
-      <w:proofErr w:type="spellEnd"/>
-      <w:r>
-        <w:t>/Swagger)</w:t>
+        <w:t>API documentation (OpenAPI/Swagger)</w:t>
       </w:r>
     </w:p>
     <w:p>
@@ -2581,7 +2415,6 @@
         </w:rPr>
         <w:t xml:space="preserve">وقتی یک آلارم </w:t>
       </w:r>
-      <w:proofErr w:type="spellStart"/>
       <w:r>
         <w:rPr>
           <w:rFonts w:ascii="Arial" w:eastAsia="Times New Roman" w:hAnsi="Arial" w:cs="Arial"/>
@@ -2592,7 +2425,6 @@
         </w:rPr>
         <w:t>ack</w:t>
       </w:r>
-      <w:proofErr w:type="spellEnd"/>
       <w:r>
         <w:rPr>
           <w:rFonts w:ascii="Arial" w:eastAsia="Times New Roman" w:hAnsi="Arial" w:cs="Arial"/>
@@ -2625,7 +2457,6 @@
         </w:rPr>
         <w:t xml:space="preserve"> روی </w:t>
       </w:r>
-      <w:proofErr w:type="spellStart"/>
       <w:r>
         <w:rPr>
           <w:rFonts w:ascii="Arial" w:eastAsia="Times New Roman" w:hAnsi="Arial" w:cs="Arial"/>
@@ -2634,18 +2465,7 @@
           <w:szCs w:val="24"/>
           <w:bdr w:val="single" w:sz="2" w:space="0" w:color="E3E3E3" w:frame="1"/>
         </w:rPr>
-        <w:t>TagBus</w:t>
-      </w:r>
-      <w:proofErr w:type="spellEnd"/>
-      <w:r>
-        <w:rPr>
-          <w:rFonts w:ascii="Arial" w:eastAsia="Times New Roman" w:hAnsi="Arial" w:cs="Arial"/>
-          <w:color w:val="1D1D1F"/>
-          <w:sz w:val="24"/>
-          <w:szCs w:val="24"/>
-          <w:bdr w:val="single" w:sz="2" w:space="0" w:color="E3E3E3" w:frame="1"/>
-        </w:rPr>
-        <w:t xml:space="preserve"> publish</w:t>
+        <w:t>TagBus publish</w:t>
       </w:r>
       <w:r>
         <w:rPr>
@@ -2722,9 +2542,9 @@
             <o:lock v:ext="edit" aspectratio="t"/>
           </v:shapetype>
           <v:shape id="_x0000_i1029" type="#_x0000_t75" style="width:150.6pt;height:57pt" o:ole="">
-            <v:imagedata r:id="rId5" o:title=""/>
+            <v:imagedata r:id="rId8" o:title=""/>
           </v:shape>
-          <w:control r:id="rId6" w:name="DefaultOcxName" w:shapeid="_x0000_i1029"/>
+          <w:control r:id="rId9" w:name="DefaultOcxName" w:shapeid="_x0000_i1029"/>
         </w:object>
       </w:r>
     </w:p>
@@ -2771,29 +2591,7 @@
           <w:szCs w:val="21"/>
           <w:bdr w:val="single" w:sz="2" w:space="0" w:color="E3E3E3" w:frame="1"/>
         </w:rPr>
-        <w:t>alarms/{</w:t>
-      </w:r>
-      <w:proofErr w:type="spellStart"/>
-      <w:r>
-        <w:rPr>
-          <w:rFonts w:ascii="Consolas" w:eastAsia="Times New Roman" w:hAnsi="Consolas" w:cs="Segoe UI"/>
-          <w:color w:val="383A42"/>
-          <w:sz w:val="21"/>
-          <w:szCs w:val="21"/>
-          <w:bdr w:val="single" w:sz="2" w:space="0" w:color="E3E3E3" w:frame="1"/>
-        </w:rPr>
-        <w:t>alarm_id</w:t>
-      </w:r>
-      <w:proofErr w:type="spellEnd"/>
-      <w:r>
-        <w:rPr>
-          <w:rFonts w:ascii="Consolas" w:eastAsia="Times New Roman" w:hAnsi="Consolas" w:cs="Segoe UI"/>
-          <w:color w:val="383A42"/>
-          <w:sz w:val="21"/>
-          <w:szCs w:val="21"/>
-          <w:bdr w:val="single" w:sz="2" w:space="0" w:color="E3E3E3" w:frame="1"/>
-        </w:rPr>
-        <w:t>}/acknowledged</w:t>
+        <w:t>alarms/{alarm_id}/acknowledged</w:t>
       </w:r>
     </w:p>
     <w:p>
@@ -2840,7 +2638,6 @@
         </w:rPr>
         <w:t xml:space="preserve"> ها هم مطلع شوند، باید در </w:t>
       </w:r>
-      <w:proofErr w:type="spellStart"/>
       <w:r>
         <w:rPr>
           <w:rFonts w:ascii="Courier New" w:eastAsia="Times New Roman" w:hAnsi="Courier New" w:cs="Courier New"/>
@@ -2852,7 +2649,6 @@
         </w:rPr>
         <w:t>startApiLayer</w:t>
       </w:r>
-      <w:proofErr w:type="spellEnd"/>
       <w:r>
         <w:rPr>
           <w:rFonts w:ascii="Arial" w:eastAsia="Times New Roman" w:hAnsi="Arial" w:cs="Arial"/>
@@ -3038,7 +2834,7 @@
                     <pic:cNvPicPr/>
                   </pic:nvPicPr>
                   <pic:blipFill>
-                    <a:blip r:embed="rId7"/>
+                    <a:blip r:embed="rId10"/>
                     <a:stretch>
                       <a:fillRect/>
                     </a:stretch>
@@ -3063,594 +2859,1962 @@
       <w:pPr>
         <w:bidi/>
         <w:rPr>
-          <w:lang w:bidi="fa-IR"/>
-        </w:rPr>
-      </w:pPr>
-      <w:r>
-        <w:rPr>
-          <w:noProof/>
-        </w:rPr>
-        <mc:AlternateContent>
-          <mc:Choice Requires="wps">
-            <w:drawing>
-              <wp:anchor distT="0" distB="0" distL="114300" distR="114300" simplePos="0" relativeHeight="251659264" behindDoc="1" locked="0" layoutInCell="1" allowOverlap="1" wp14:anchorId="4C7673E3" wp14:editId="7748A60D">
-                <wp:simplePos x="0" y="0"/>
-                <wp:positionH relativeFrom="margin">
-                  <wp:align>center</wp:align>
-                </wp:positionH>
-                <wp:positionV relativeFrom="page">
-                  <wp:posOffset>5006340</wp:posOffset>
-                </wp:positionV>
-                <wp:extent cx="5059680" cy="4777740"/>
-                <wp:effectExtent l="0" t="0" r="26670" b="22860"/>
-                <wp:wrapTight wrapText="bothSides">
-                  <wp:wrapPolygon edited="0">
-                    <wp:start x="0" y="0"/>
-                    <wp:lineTo x="0" y="21617"/>
-                    <wp:lineTo x="21633" y="21617"/>
-                    <wp:lineTo x="21633" y="0"/>
-                    <wp:lineTo x="0" y="0"/>
-                  </wp:wrapPolygon>
-                </wp:wrapTight>
-                <wp:docPr id="2" name="Text Box 2"/>
-                <wp:cNvGraphicFramePr/>
-                <a:graphic xmlns:a="http://schemas.openxmlformats.org/drawingml/2006/main">
-                  <a:graphicData uri="http://schemas.microsoft.com/office/word/2010/wordprocessingShape">
-                    <wps:wsp>
-                      <wps:cNvSpPr txBox="1"/>
-                      <wps:spPr>
-                        <a:xfrm>
-                          <a:off x="0" y="0"/>
-                          <a:ext cx="5059680" cy="4777740"/>
-                        </a:xfrm>
-                        <a:prstGeom prst="rect">
-                          <a:avLst/>
-                        </a:prstGeom>
-                        <a:solidFill>
-                          <a:schemeClr val="lt1"/>
-                        </a:solidFill>
-                        <a:ln w="6350">
-                          <a:solidFill>
-                            <a:prstClr val="black"/>
-                          </a:solidFill>
-                        </a:ln>
-                      </wps:spPr>
-                      <wps:txbx>
-                        <w:txbxContent>
-                          <w:p>
-                            <w:pPr>
-                              <w:rPr>
-                                <w:rFonts w:ascii="Consolas" w:hAnsi="Consolas"/>
-                              </w:rPr>
-                            </w:pPr>
-                          </w:p>
-                          <w:p>
-                            <w:pPr>
-                              <w:bidi/>
-                              <w:rPr>
-                                <w:b/>
-                                <w:bCs/>
-                              </w:rPr>
-                            </w:pPr>
-                            <w:r>
-                              <w:rPr>
-                                <w:b/>
-                                <w:bCs/>
-                                <w:rtl/>
-                              </w:rPr>
-                              <w:t>تست</w:t>
-                            </w:r>
-                            <w:r>
-                              <w:rPr>
-                                <w:b/>
-                                <w:bCs/>
-                              </w:rPr>
-                              <w:t xml:space="preserve"> </w:t>
-                            </w:r>
-                            <w:r>
-                              <w:rPr>
-                                <w:rFonts w:hint="cs"/>
-                                <w:b/>
-                                <w:bCs/>
-                                <w:rtl/>
-                                <w:lang w:bidi="fa-IR"/>
-                              </w:rPr>
-                              <w:t>گزارش</w:t>
-                            </w:r>
-                            <w:r>
-                              <w:rPr>
-                                <w:b/>
-                                <w:bCs/>
-                                <w:rtl/>
-                              </w:rPr>
-                              <w:t xml:space="preserve"> با </w:t>
-                            </w:r>
-                            <w:r>
-                              <w:rPr>
-                                <w:b/>
-                                <w:bCs/>
-                              </w:rPr>
-                              <w:t>PowerShell</w:t>
-                            </w:r>
-                          </w:p>
-                          <w:p>
-                            <w:pPr>
-                              <w:bidi/>
-                              <w:rPr>
-                                <w:rFonts w:ascii="Consolas" w:hAnsi="Consolas"/>
-                              </w:rPr>
-                            </w:pPr>
-                          </w:p>
-                          <w:p>
-                            <w:pPr>
-                              <w:rPr>
-                                <w:rFonts w:ascii="Consolas" w:hAnsi="Consolas"/>
-                              </w:rPr>
-                            </w:pPr>
-                            <w:r>
-                              <w:rPr>
-                                <w:rFonts w:ascii="Consolas" w:hAnsi="Consolas"/>
-                              </w:rPr>
-                              <w:t xml:space="preserve"># </w:t>
-                            </w:r>
-                            <w:r>
-                              <w:rPr>
-                                <w:rFonts w:ascii="Consolas" w:hAnsi="Consolas" w:cs="Arial"/>
-                                <w:rtl/>
-                                <w:lang w:bidi="fa-IR"/>
-                              </w:rPr>
-                              <w:t>۱</w:t>
-                            </w:r>
-                            <w:r>
-                              <w:rPr>
-                                <w:rFonts w:ascii="Consolas" w:hAnsi="Consolas"/>
-                              </w:rPr>
-                              <w:t xml:space="preserve"> </w:t>
-                            </w:r>
-                            <w:r>
-                              <w:rPr>
-                                <w:rFonts w:ascii="Consolas" w:hAnsi="Consolas" w:cs="Arial"/>
-                                <w:rtl/>
-                              </w:rPr>
-                              <w:t xml:space="preserve">ساعت اخیر، </w:t>
-                            </w:r>
-                            <w:r>
-                              <w:rPr>
-                                <w:rFonts w:ascii="Consolas" w:hAnsi="Consolas"/>
-                              </w:rPr>
-                              <w:t>raw data</w:t>
-                            </w:r>
-                          </w:p>
-                          <w:p>
-                            <w:pPr>
-                              <w:rPr>
-                                <w:rFonts w:ascii="Consolas" w:hAnsi="Consolas"/>
-                              </w:rPr>
-                            </w:pPr>
-                            <w:r>
-                              <w:rPr>
-                                <w:rFonts w:ascii="Consolas" w:hAnsi="Consolas"/>
-                              </w:rPr>
-                              <w:t>$uri = "http://127.0.0.1:8082/api/v1/reports/tag-history?tag_ids=1,2,3&amp;interval=raw&amp;format=json"</w:t>
-                            </w:r>
-                          </w:p>
-                          <w:p>
-                            <w:pPr>
-                              <w:rPr>
-                                <w:rFonts w:ascii="Consolas" w:hAnsi="Consolas"/>
-                              </w:rPr>
-                            </w:pPr>
-                            <w:r>
-                              <w:rPr>
-                                <w:rFonts w:ascii="Consolas" w:hAnsi="Consolas"/>
-                              </w:rPr>
-                              <w:t>Invoke-RestMethod -Uri $uri | ConvertTo-Json -Depth 10</w:t>
-                            </w:r>
-                          </w:p>
-                          <w:p>
-                            <w:pPr>
-                              <w:rPr>
-                                <w:rFonts w:ascii="Consolas" w:hAnsi="Consolas"/>
-                              </w:rPr>
-                            </w:pPr>
-                          </w:p>
-                          <w:p>
-                            <w:pPr>
-                              <w:rPr>
-                                <w:rFonts w:ascii="Consolas" w:hAnsi="Consolas"/>
-                              </w:rPr>
-                            </w:pPr>
-                            <w:r>
-                              <w:rPr>
-                                <w:rFonts w:ascii="Consolas" w:hAnsi="Consolas"/>
-                              </w:rPr>
-                              <w:t xml:space="preserve"># </w:t>
-                            </w:r>
-                            <w:r>
-                              <w:rPr>
-                                <w:rFonts w:ascii="Consolas" w:hAnsi="Consolas" w:cs="Arial"/>
-                                <w:rtl/>
-                              </w:rPr>
-                              <w:t>با</w:t>
-                            </w:r>
-                            <w:r>
-                              <w:rPr>
-                                <w:rFonts w:ascii="Consolas" w:hAnsi="Consolas"/>
-                              </w:rPr>
-                              <w:t xml:space="preserve"> interval 1 minute</w:t>
-                            </w:r>
-                          </w:p>
-                          <w:p>
-                            <w:pPr>
-                              <w:rPr>
-                                <w:rFonts w:ascii="Consolas" w:hAnsi="Consolas"/>
-                              </w:rPr>
-                            </w:pPr>
-                            <w:r>
-                              <w:rPr>
-                                <w:rFonts w:ascii="Consolas" w:hAnsi="Consolas"/>
-                              </w:rPr>
-                              <w:t>$uri = "http://127.0.0.1:8082/api/v1/reports/tag-histor</w:t>
-                            </w:r>
-                            <w:bookmarkStart w:id="0" w:name="_GoBack"/>
-                            <w:bookmarkEnd w:id="0"/>
-                            <w:r>
-                              <w:rPr>
-                                <w:rFonts w:ascii="Consolas" w:hAnsi="Consolas"/>
-                              </w:rPr>
-                              <w:t>y?tag_ids=1,2,3&amp;interval=1 minute&amp;format=json"</w:t>
-                            </w:r>
-                          </w:p>
-                          <w:p>
-                            <w:pPr>
-                              <w:rPr>
-                                <w:rFonts w:ascii="Consolas" w:hAnsi="Consolas"/>
-                              </w:rPr>
-                            </w:pPr>
-                            <w:r>
-                              <w:rPr>
-                                <w:rFonts w:ascii="Consolas" w:hAnsi="Consolas"/>
-                              </w:rPr>
-                              <w:t>Invoke-RestMethod -Uri $uri | ConvertTo-Json -Depth 10</w:t>
-                            </w:r>
-                          </w:p>
-                          <w:p>
-                            <w:pPr>
-                              <w:rPr>
-                                <w:rFonts w:ascii="Consolas" w:hAnsi="Consolas"/>
-                              </w:rPr>
-                            </w:pPr>
-                          </w:p>
-                          <w:p>
-                            <w:pPr>
-                              <w:rPr>
-                                <w:rFonts w:ascii="Consolas" w:hAnsi="Consolas"/>
-                              </w:rPr>
-                            </w:pPr>
-                            <w:r>
-                              <w:rPr>
-                                <w:rFonts w:ascii="Consolas" w:hAnsi="Consolas"/>
-                              </w:rPr>
-                              <w:t xml:space="preserve"># </w:t>
-                            </w:r>
-                            <w:r>
-                              <w:rPr>
-                                <w:rFonts w:ascii="Consolas" w:hAnsi="Consolas" w:cs="Arial"/>
-                                <w:rtl/>
-                              </w:rPr>
-                              <w:t>با محدوده زمانی</w:t>
-                            </w:r>
-                          </w:p>
-                          <w:p>
-                            <w:pPr>
-                              <w:rPr>
-                                <w:rFonts w:ascii="Consolas" w:hAnsi="Consolas"/>
-                              </w:rPr>
-                            </w:pPr>
-                            <w:r>
-                              <w:rPr>
-                                <w:rFonts w:ascii="Consolas" w:hAnsi="Consolas"/>
-                              </w:rPr>
-                              <w:t>$uri = "http://127.0.0.1:8082/api/v1/reports/tag-history?tag_ids=1&amp;from=2026-08-11T00:00:00Z&amp;to=2026-08-11T23:59:59Z&amp;interval=5 minutes&amp;format=json"</w:t>
-                            </w:r>
-                          </w:p>
-                          <w:p>
-                            <w:pPr>
-                              <w:rPr>
-                                <w:rFonts w:ascii="Consolas" w:hAnsi="Consolas"/>
-                              </w:rPr>
-                            </w:pPr>
-                            <w:r>
-                              <w:rPr>
-                                <w:rFonts w:ascii="Consolas" w:hAnsi="Consolas"/>
-                              </w:rPr>
-                              <w:t>Invoke-RestMethod -Uri $uri | ConvertTo-Json -Depth 10</w:t>
-                            </w:r>
-                          </w:p>
-                        </w:txbxContent>
-                      </wps:txbx>
-                      <wps:bodyPr rot="0" spcFirstLastPara="0" vertOverflow="overflow" horzOverflow="overflow" vert="horz" wrap="square" lIns="91440" tIns="45720" rIns="91440" bIns="45720" numCol="1" spcCol="0" rtlCol="0" fromWordArt="0" anchor="t" anchorCtr="0" forceAA="0" compatLnSpc="1">
-                        <a:prstTxWarp prst="textNoShape">
-                          <a:avLst/>
-                        </a:prstTxWarp>
-                        <a:noAutofit/>
-                      </wps:bodyPr>
-                    </wps:wsp>
-                  </a:graphicData>
-                </a:graphic>
-                <wp14:sizeRelV relativeFrom="margin">
-                  <wp14:pctHeight>0</wp14:pctHeight>
-                </wp14:sizeRelV>
-              </wp:anchor>
-            </w:drawing>
-          </mc:Choice>
-          <mc:Fallback>
-            <w:pict>
-              <v:shapetype w14:anchorId="4C7673E3" id="_x0000_t202" coordsize="21600,21600" o:spt="202" path="m,l,21600r21600,l21600,xe">
-                <v:stroke joinstyle="miter"/>
-                <v:path gradientshapeok="t" o:connecttype="rect"/>
-              </v:shapetype>
-              <v:shape id="Text Box 2" o:spid="_x0000_s1026" type="#_x0000_t202" style="position:absolute;left:0;text-align:left;margin-left:0;margin-top:394.2pt;width:398.4pt;height:376.2pt;z-index:-251657216;visibility:visible;mso-wrap-style:square;mso-height-percent:0;mso-wrap-distance-left:9pt;mso-wrap-distance-top:0;mso-wrap-distance-right:9pt;mso-wrap-distance-bottom:0;mso-position-horizontal:center;mso-position-horizontal-relative:margin;mso-position-vertical:absolute;mso-position-vertical-relative:page;mso-height-percent:0;mso-height-relative:margin;v-text-anchor:top" o:gfxdata="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" fillcolor="white [3201]" strokeweight=".5pt">
-                <v:textbox>
-                  <w:txbxContent>
-                    <w:p>
-                      <w:pPr>
-                        <w:rPr>
-                          <w:rFonts w:ascii="Consolas" w:hAnsi="Consolas"/>
-                        </w:rPr>
-                      </w:pPr>
-                    </w:p>
-                    <w:p>
-                      <w:pPr>
-                        <w:bidi/>
-                        <w:rPr>
-                          <w:b/>
-                          <w:bCs/>
-                        </w:rPr>
-                      </w:pPr>
-                      <w:r>
-                        <w:rPr>
-                          <w:b/>
-                          <w:bCs/>
-                          <w:rtl/>
-                        </w:rPr>
-                        <w:t>تست</w:t>
-                      </w:r>
-                      <w:r>
-                        <w:rPr>
-                          <w:b/>
-                          <w:bCs/>
-                        </w:rPr>
-                        <w:t xml:space="preserve"> </w:t>
-                      </w:r>
-                      <w:r>
-                        <w:rPr>
-                          <w:rFonts w:hint="cs"/>
-                          <w:b/>
-                          <w:bCs/>
-                          <w:rtl/>
-                          <w:lang w:bidi="fa-IR"/>
-                        </w:rPr>
-                        <w:t>گزارش</w:t>
-                      </w:r>
-                      <w:r>
-                        <w:rPr>
-                          <w:b/>
-                          <w:bCs/>
-                          <w:rtl/>
-                        </w:rPr>
-                        <w:t xml:space="preserve"> با </w:t>
-                      </w:r>
-                      <w:r>
-                        <w:rPr>
-                          <w:b/>
-                          <w:bCs/>
-                        </w:rPr>
-                        <w:t>PowerShell</w:t>
-                      </w:r>
-                    </w:p>
-                    <w:p>
-                      <w:pPr>
-                        <w:bidi/>
-                        <w:rPr>
-                          <w:rFonts w:ascii="Consolas" w:hAnsi="Consolas"/>
-                        </w:rPr>
-                      </w:pPr>
-                    </w:p>
-                    <w:p>
-                      <w:pPr>
-                        <w:rPr>
-                          <w:rFonts w:ascii="Consolas" w:hAnsi="Consolas"/>
-                        </w:rPr>
-                      </w:pPr>
-                      <w:r>
-                        <w:rPr>
-                          <w:rFonts w:ascii="Consolas" w:hAnsi="Consolas"/>
-                        </w:rPr>
-                        <w:t xml:space="preserve"># </w:t>
-                      </w:r>
-                      <w:r>
-                        <w:rPr>
-                          <w:rFonts w:ascii="Consolas" w:hAnsi="Consolas" w:cs="Arial"/>
-                          <w:rtl/>
-                          <w:lang w:bidi="fa-IR"/>
-                        </w:rPr>
-                        <w:t>۱</w:t>
-                      </w:r>
-                      <w:r>
-                        <w:rPr>
-                          <w:rFonts w:ascii="Consolas" w:hAnsi="Consolas"/>
-                        </w:rPr>
-                        <w:t xml:space="preserve"> </w:t>
-                      </w:r>
-                      <w:r>
-                        <w:rPr>
-                          <w:rFonts w:ascii="Consolas" w:hAnsi="Consolas" w:cs="Arial"/>
-                          <w:rtl/>
-                        </w:rPr>
-                        <w:t xml:space="preserve">ساعت اخیر، </w:t>
-                      </w:r>
-                      <w:r>
-                        <w:rPr>
-                          <w:rFonts w:ascii="Consolas" w:hAnsi="Consolas"/>
-                        </w:rPr>
-                        <w:t>raw data</w:t>
-                      </w:r>
-                    </w:p>
-                    <w:p>
-                      <w:pPr>
-                        <w:rPr>
-                          <w:rFonts w:ascii="Consolas" w:hAnsi="Consolas"/>
-                        </w:rPr>
-                      </w:pPr>
-                      <w:r>
-                        <w:rPr>
-                          <w:rFonts w:ascii="Consolas" w:hAnsi="Consolas"/>
-                        </w:rPr>
-                        <w:t>$uri = "http://127.0.0.1:8082/api/v1/reports/tag-history?tag_ids=1,2,3&amp;interval=raw&amp;format=json"</w:t>
-                      </w:r>
-                    </w:p>
-                    <w:p>
-                      <w:pPr>
-                        <w:rPr>
-                          <w:rFonts w:ascii="Consolas" w:hAnsi="Consolas"/>
-                        </w:rPr>
-                      </w:pPr>
-                      <w:r>
-                        <w:rPr>
-                          <w:rFonts w:ascii="Consolas" w:hAnsi="Consolas"/>
-                        </w:rPr>
-                        <w:t>Invoke-RestMethod -Uri $uri | ConvertTo-Json -Depth 10</w:t>
-                      </w:r>
-                    </w:p>
-                    <w:p>
-                      <w:pPr>
-                        <w:rPr>
-                          <w:rFonts w:ascii="Consolas" w:hAnsi="Consolas"/>
-                        </w:rPr>
-                      </w:pPr>
-                    </w:p>
-                    <w:p>
-                      <w:pPr>
-                        <w:rPr>
-                          <w:rFonts w:ascii="Consolas" w:hAnsi="Consolas"/>
-                        </w:rPr>
-                      </w:pPr>
-                      <w:r>
-                        <w:rPr>
-                          <w:rFonts w:ascii="Consolas" w:hAnsi="Consolas"/>
-                        </w:rPr>
-                        <w:t xml:space="preserve"># </w:t>
-                      </w:r>
-                      <w:r>
-                        <w:rPr>
-                          <w:rFonts w:ascii="Consolas" w:hAnsi="Consolas" w:cs="Arial"/>
-                          <w:rtl/>
-                        </w:rPr>
-                        <w:t>با</w:t>
-                      </w:r>
-                      <w:r>
-                        <w:rPr>
-                          <w:rFonts w:ascii="Consolas" w:hAnsi="Consolas"/>
-                        </w:rPr>
-                        <w:t xml:space="preserve"> interval 1 minute</w:t>
-                      </w:r>
-                    </w:p>
-                    <w:p>
-                      <w:pPr>
-                        <w:rPr>
-                          <w:rFonts w:ascii="Consolas" w:hAnsi="Consolas"/>
-                        </w:rPr>
-                      </w:pPr>
-                      <w:r>
-                        <w:rPr>
-                          <w:rFonts w:ascii="Consolas" w:hAnsi="Consolas"/>
-                        </w:rPr>
-                        <w:t>$uri = "http://127.0.0.1:8082/api/v1/reports/tag-histor</w:t>
-                      </w:r>
-                      <w:bookmarkStart w:id="1" w:name="_GoBack"/>
-                      <w:bookmarkEnd w:id="1"/>
-                      <w:r>
-                        <w:rPr>
-                          <w:rFonts w:ascii="Consolas" w:hAnsi="Consolas"/>
-                        </w:rPr>
-                        <w:t>y?tag_ids=1,2,3&amp;interval=1 minute&amp;format=json"</w:t>
-                      </w:r>
-                    </w:p>
-                    <w:p>
-                      <w:pPr>
-                        <w:rPr>
-                          <w:rFonts w:ascii="Consolas" w:hAnsi="Consolas"/>
-                        </w:rPr>
-                      </w:pPr>
-                      <w:r>
-                        <w:rPr>
-                          <w:rFonts w:ascii="Consolas" w:hAnsi="Consolas"/>
-                        </w:rPr>
-                        <w:t>Invoke-RestMethod -Uri $uri | ConvertTo-Json -Depth 10</w:t>
-                      </w:r>
-                    </w:p>
-                    <w:p>
-                      <w:pPr>
-                        <w:rPr>
-                          <w:rFonts w:ascii="Consolas" w:hAnsi="Consolas"/>
-                        </w:rPr>
-                      </w:pPr>
-                    </w:p>
-                    <w:p>
-                      <w:pPr>
-                        <w:rPr>
-                          <w:rFonts w:ascii="Consolas" w:hAnsi="Consolas"/>
-                        </w:rPr>
-                      </w:pPr>
-                      <w:r>
-                        <w:rPr>
-                          <w:rFonts w:ascii="Consolas" w:hAnsi="Consolas"/>
-                        </w:rPr>
-                        <w:t xml:space="preserve"># </w:t>
-                      </w:r>
-                      <w:r>
-                        <w:rPr>
-                          <w:rFonts w:ascii="Consolas" w:hAnsi="Consolas" w:cs="Arial"/>
-                          <w:rtl/>
-                        </w:rPr>
-                        <w:t>با محدوده زمانی</w:t>
-                      </w:r>
-                    </w:p>
-                    <w:p>
-                      <w:pPr>
-                        <w:rPr>
-                          <w:rFonts w:ascii="Consolas" w:hAnsi="Consolas"/>
-                        </w:rPr>
-                      </w:pPr>
-                      <w:r>
-                        <w:rPr>
-                          <w:rFonts w:ascii="Consolas" w:hAnsi="Consolas"/>
-                        </w:rPr>
-                        <w:t>$uri = "http://127.0.0.1:8082/api/v1/reports/tag-history?tag_ids=1&amp;from=2026-08-11T00:00:00Z&amp;to=2026-08-11T23:59:59Z&amp;interval=5 minutes&amp;format=json"</w:t>
-                      </w:r>
-                    </w:p>
-                    <w:p>
-                      <w:pPr>
-                        <w:rPr>
-                          <w:rFonts w:ascii="Consolas" w:hAnsi="Consolas"/>
-                        </w:rPr>
-                      </w:pPr>
-                      <w:r>
-                        <w:rPr>
-                          <w:rFonts w:ascii="Consolas" w:hAnsi="Consolas"/>
-                        </w:rPr>
-                        <w:t>Invoke-RestMethod -Uri $uri | ConvertTo-Json -Depth 10</w:t>
-                      </w:r>
-                    </w:p>
-                  </w:txbxContent>
-                </v:textbox>
-                <w10:wrap type="tight" anchorx="margin" anchory="page"/>
-              </v:shape>
-            </w:pict>
-          </mc:Fallback>
-        </mc:AlternateContent>
-      </w:r>
+          <w:rtl/>
+          <w:lang w:bidi="fa-IR"/>
+        </w:rPr>
+      </w:pPr>
+    </w:p>
+    <w:p>
+      <w:pPr>
+        <w:bidi/>
+        <w:rPr>
+          <w:rtl/>
+          <w:lang w:bidi="fa-IR"/>
+        </w:rPr>
+      </w:pPr>
+    </w:p>
+    <w:p>
+      <w:pPr>
+        <w:bidi/>
+        <w:rPr>
+          <w:rtl/>
+          <w:lang w:bidi="fa-IR"/>
+        </w:rPr>
+      </w:pPr>
+    </w:p>
+    <w:p>
+      <w:pPr>
+        <w:bidi/>
+        <w:rPr>
+          <w:rtl/>
+          <w:lang w:bidi="fa-IR"/>
+        </w:rPr>
+      </w:pPr>
+    </w:p>
+    <w:p>
+      <w:pPr>
+        <w:rPr>
+          <w:rFonts w:ascii="Consolas" w:hAnsi="Consolas"/>
+        </w:rPr>
+      </w:pPr>
+    </w:p>
+    <w:p>
+      <w:pPr>
+        <w:bidi/>
+        <w:rPr>
+          <w:b/>
+          <w:bCs/>
+        </w:rPr>
+      </w:pPr>
+      <w:r>
+        <w:rPr>
+          <w:b/>
+          <w:bCs/>
+          <w:rtl/>
+        </w:rPr>
+        <w:t>تست</w:t>
+      </w:r>
+      <w:r>
+        <w:rPr>
+          <w:b/>
+          <w:bCs/>
+        </w:rPr>
+        <w:t xml:space="preserve"> </w:t>
+      </w:r>
+      <w:r>
+        <w:rPr>
+          <w:rFonts w:hint="cs"/>
+          <w:b/>
+          <w:bCs/>
+          <w:rtl/>
+          <w:lang w:bidi="fa-IR"/>
+        </w:rPr>
+        <w:t>گزارش</w:t>
+      </w:r>
+      <w:r>
+        <w:rPr>
+          <w:b/>
+          <w:bCs/>
+          <w:rtl/>
+        </w:rPr>
+        <w:t xml:space="preserve"> با </w:t>
+      </w:r>
+      <w:r>
+        <w:rPr>
+          <w:b/>
+          <w:bCs/>
+        </w:rPr>
+        <w:t>PowerShell</w:t>
+      </w:r>
+    </w:p>
+    <w:p>
+      <w:pPr>
+        <w:bidi/>
+        <w:rPr>
+          <w:rFonts w:ascii="Consolas" w:hAnsi="Consolas"/>
+        </w:rPr>
+      </w:pPr>
+    </w:p>
+    <w:p>
+      <w:pPr>
+        <w:rPr>
+          <w:rFonts w:ascii="Consolas" w:hAnsi="Consolas"/>
+        </w:rPr>
+      </w:pPr>
+      <w:r>
+        <w:rPr>
+          <w:rFonts w:ascii="Consolas" w:hAnsi="Consolas"/>
+        </w:rPr>
+        <w:t xml:space="preserve"># </w:t>
+      </w:r>
+      <w:r>
+        <w:rPr>
+          <w:rFonts w:ascii="Consolas" w:hAnsi="Consolas" w:cs="Arial"/>
+          <w:rtl/>
+          <w:lang w:bidi="fa-IR"/>
+        </w:rPr>
+        <w:t>۱</w:t>
+      </w:r>
+      <w:r>
+        <w:rPr>
+          <w:rFonts w:ascii="Consolas" w:hAnsi="Consolas"/>
+        </w:rPr>
+        <w:t xml:space="preserve"> </w:t>
+      </w:r>
+      <w:r>
+        <w:rPr>
+          <w:rFonts w:ascii="Consolas" w:hAnsi="Consolas" w:cs="Arial"/>
+          <w:rtl/>
+        </w:rPr>
+        <w:t xml:space="preserve">ساعت اخیر، </w:t>
+      </w:r>
+      <w:r>
+        <w:rPr>
+          <w:rFonts w:ascii="Consolas" w:hAnsi="Consolas"/>
+        </w:rPr>
+        <w:t>raw data</w:t>
+      </w:r>
+    </w:p>
+    <w:p>
+      <w:pPr>
+        <w:rPr>
+          <w:rFonts w:ascii="Consolas" w:hAnsi="Consolas"/>
+        </w:rPr>
+      </w:pPr>
+      <w:r>
+        <w:rPr>
+          <w:rFonts w:ascii="Consolas" w:hAnsi="Consolas"/>
+        </w:rPr>
+        <w:t>$uri = "http://127.0.0.1:8082/api/v1/reports/tag-history?tag_ids=1,2,3&amp;interval=raw&amp;format=json"</w:t>
+      </w:r>
+    </w:p>
+    <w:p>
+      <w:pPr>
+        <w:rPr>
+          <w:rFonts w:ascii="Consolas" w:hAnsi="Consolas"/>
+        </w:rPr>
+      </w:pPr>
+      <w:r>
+        <w:rPr>
+          <w:rFonts w:ascii="Consolas" w:hAnsi="Consolas"/>
+        </w:rPr>
+        <w:t>Invoke-RestMethod -Uri $uri | ConvertTo-Json -Depth 10</w:t>
+      </w:r>
+    </w:p>
+    <w:p>
+      <w:pPr>
+        <w:rPr>
+          <w:rFonts w:ascii="Consolas" w:hAnsi="Consolas"/>
+        </w:rPr>
+      </w:pPr>
+    </w:p>
+    <w:p>
+      <w:pPr>
+        <w:rPr>
+          <w:rFonts w:ascii="Consolas" w:hAnsi="Consolas"/>
+        </w:rPr>
+      </w:pPr>
+      <w:r>
+        <w:rPr>
+          <w:rFonts w:ascii="Consolas" w:hAnsi="Consolas"/>
+        </w:rPr>
+        <w:t xml:space="preserve"># </w:t>
+      </w:r>
+      <w:r>
+        <w:rPr>
+          <w:rFonts w:ascii="Consolas" w:hAnsi="Consolas" w:cs="Arial"/>
+          <w:rtl/>
+        </w:rPr>
+        <w:t>با</w:t>
+      </w:r>
+      <w:r>
+        <w:rPr>
+          <w:rFonts w:ascii="Consolas" w:hAnsi="Consolas"/>
+        </w:rPr>
+        <w:t xml:space="preserve"> interval 1 minute</w:t>
+      </w:r>
+    </w:p>
+    <w:p>
+      <w:pPr>
+        <w:rPr>
+          <w:rFonts w:ascii="Consolas" w:hAnsi="Consolas"/>
+        </w:rPr>
+      </w:pPr>
+      <w:r>
+        <w:rPr>
+          <w:rFonts w:ascii="Consolas" w:hAnsi="Consolas"/>
+        </w:rPr>
+        <w:t>$uri = "http://127.0.0.1:8082/api/v1/reports/tag-history?tag_ids=1,2,3&amp;interval=1 minute&amp;format=json"</w:t>
+      </w:r>
+    </w:p>
+    <w:p>
+      <w:pPr>
+        <w:rPr>
+          <w:rFonts w:ascii="Consolas" w:hAnsi="Consolas"/>
+        </w:rPr>
+      </w:pPr>
+      <w:r>
+        <w:rPr>
+          <w:rFonts w:ascii="Consolas" w:hAnsi="Consolas"/>
+        </w:rPr>
+        <w:t>Invoke-RestMethod -Uri $uri | ConvertTo-Json -Depth 10</w:t>
+      </w:r>
+    </w:p>
+    <w:p>
+      <w:pPr>
+        <w:rPr>
+          <w:rFonts w:ascii="Consolas" w:hAnsi="Consolas"/>
+        </w:rPr>
+      </w:pPr>
+    </w:p>
+    <w:p>
+      <w:pPr>
+        <w:rPr>
+          <w:rFonts w:ascii="Consolas" w:hAnsi="Consolas"/>
+        </w:rPr>
+      </w:pPr>
+      <w:r>
+        <w:rPr>
+          <w:rFonts w:ascii="Consolas" w:hAnsi="Consolas"/>
+        </w:rPr>
+        <w:t xml:space="preserve"># </w:t>
+      </w:r>
+      <w:r>
+        <w:rPr>
+          <w:rFonts w:ascii="Consolas" w:hAnsi="Consolas" w:cs="Arial"/>
+          <w:rtl/>
+        </w:rPr>
+        <w:t>با محدوده زمانی</w:t>
+      </w:r>
+    </w:p>
+    <w:p>
+      <w:pPr>
+        <w:rPr>
+          <w:rFonts w:ascii="Consolas" w:hAnsi="Consolas"/>
+        </w:rPr>
+      </w:pPr>
+      <w:r>
+        <w:rPr>
+          <w:rFonts w:ascii="Consolas" w:hAnsi="Consolas"/>
+        </w:rPr>
+        <w:t>$uri = "http://127.0.0.1:8082/api/v1/reports/tag-history?tag_ids=1&amp;from=2026-08-11T00:00:00Z&amp;to=2026-08-11T23:59:59Z&amp;interval=5 minutes&amp;format=json"</w:t>
+      </w:r>
+    </w:p>
+    <w:p>
+      <w:pPr>
+        <w:rPr>
+          <w:rFonts w:ascii="Consolas" w:hAnsi="Consolas"/>
+          <w:rtl/>
+        </w:rPr>
+      </w:pPr>
+      <w:r>
+        <w:rPr>
+          <w:rFonts w:ascii="Consolas" w:hAnsi="Consolas"/>
+        </w:rPr>
+        <w:t>Invoke-RestMethod -Uri $uri | ConvertTo-Json -Depth 10</w:t>
+      </w:r>
+    </w:p>
+    <w:p>
+      <w:pPr>
+        <w:rPr>
+          <w:rFonts w:ascii="Consolas" w:hAnsi="Consolas"/>
+          <w:rtl/>
+        </w:rPr>
+      </w:pPr>
+    </w:p>
+    <w:p>
+      <w:pPr>
+        <w:rPr>
+          <w:rFonts w:ascii="Consolas" w:hAnsi="Consolas"/>
+        </w:rPr>
+      </w:pPr>
+      <w:r>
+        <w:rPr>
+          <w:rFonts w:ascii="Consolas" w:hAnsi="Consolas"/>
+        </w:rPr>
+        <w:t xml:space="preserve"># </w:t>
+      </w:r>
+      <w:r>
+        <w:rPr>
+          <w:rFonts w:ascii="Consolas" w:hAnsi="Consolas" w:cs="Arial" w:hint="cs"/>
+          <w:rtl/>
+        </w:rPr>
+        <w:t>دانلود</w:t>
+      </w:r>
+      <w:r>
+        <w:rPr>
+          <w:rFonts w:ascii="Consolas" w:hAnsi="Consolas"/>
+        </w:rPr>
+        <w:t xml:space="preserve"> CSV</w:t>
+      </w:r>
+    </w:p>
+    <w:p>
+      <w:pPr>
+        <w:rPr>
+          <w:rFonts w:ascii="Consolas" w:hAnsi="Consolas"/>
+        </w:rPr>
+      </w:pPr>
+      <w:r>
+        <w:rPr>
+          <w:rFonts w:ascii="Consolas" w:hAnsi="Consolas"/>
+        </w:rPr>
+        <w:t>$uri = "http://127.0.0.1:8082/api/v1/reports/tag-history?tag_ids=1,2,3&amp;interval=raw&amp;format=csv"</w:t>
+      </w:r>
+    </w:p>
+    <w:p>
+      <w:pPr>
+        <w:rPr>
+          <w:rFonts w:ascii="Consolas" w:hAnsi="Consolas"/>
+        </w:rPr>
+      </w:pPr>
+      <w:r>
+        <w:rPr>
+          <w:rFonts w:ascii="Consolas" w:hAnsi="Consolas"/>
+        </w:rPr>
+        <w:t>Invoke-WebRequest -Uri $uri -OutFile "tag_history.csv"</w:t>
+      </w:r>
+    </w:p>
+    <w:p>
+      <w:pPr>
+        <w:rPr>
+          <w:rFonts w:ascii="Consolas" w:hAnsi="Consolas"/>
+        </w:rPr>
+      </w:pPr>
+    </w:p>
+    <w:p>
+      <w:pPr>
+        <w:rPr>
+          <w:rFonts w:ascii="Consolas" w:hAnsi="Consolas"/>
+        </w:rPr>
+      </w:pPr>
+      <w:r>
+        <w:rPr>
+          <w:rFonts w:ascii="Consolas" w:hAnsi="Consolas"/>
+        </w:rPr>
+        <w:t xml:space="preserve"># </w:t>
+      </w:r>
+      <w:r>
+        <w:rPr>
+          <w:rFonts w:ascii="Consolas" w:hAnsi="Consolas" w:cs="Arial" w:hint="cs"/>
+          <w:rtl/>
+        </w:rPr>
+        <w:t>باز</w:t>
+      </w:r>
+      <w:r>
+        <w:rPr>
+          <w:rFonts w:ascii="Consolas" w:hAnsi="Consolas" w:cs="Arial"/>
+          <w:rtl/>
+        </w:rPr>
+        <w:t xml:space="preserve"> </w:t>
+      </w:r>
+      <w:r>
+        <w:rPr>
+          <w:rFonts w:ascii="Consolas" w:hAnsi="Consolas" w:cs="Arial" w:hint="cs"/>
+          <w:rtl/>
+        </w:rPr>
+        <w:t>کردن</w:t>
+      </w:r>
+      <w:r>
+        <w:rPr>
+          <w:rFonts w:ascii="Consolas" w:hAnsi="Consolas" w:cs="Arial"/>
+          <w:rtl/>
+        </w:rPr>
+        <w:t xml:space="preserve"> </w:t>
+      </w:r>
+      <w:r>
+        <w:rPr>
+          <w:rFonts w:ascii="Consolas" w:hAnsi="Consolas" w:cs="Arial" w:hint="cs"/>
+          <w:rtl/>
+        </w:rPr>
+        <w:t>در</w:t>
+      </w:r>
+      <w:r>
+        <w:rPr>
+          <w:rFonts w:ascii="Consolas" w:hAnsi="Consolas"/>
+        </w:rPr>
+        <w:t xml:space="preserve"> Excel</w:t>
+      </w:r>
+    </w:p>
+    <w:p>
+      <w:pPr>
+        <w:rPr>
+          <w:rFonts w:ascii="Consolas" w:hAnsi="Consolas"/>
+          <w:rtl/>
+        </w:rPr>
+      </w:pPr>
+      <w:r>
+        <w:rPr>
+          <w:rFonts w:ascii="Consolas" w:hAnsi="Consolas"/>
+        </w:rPr>
+        <w:t>Start-Process "tag_history.csv"</w:t>
+      </w:r>
+    </w:p>
+    <w:p>
+      <w:pPr>
+        <w:rPr>
+          <w:rFonts w:ascii="Consolas" w:hAnsi="Consolas"/>
+        </w:rPr>
+      </w:pPr>
+      <w:r>
+        <w:rPr>
+          <w:rFonts w:ascii="Consolas" w:hAnsi="Consolas"/>
+        </w:rPr>
+        <w:t xml:space="preserve"># </w:t>
+      </w:r>
+      <w:r>
+        <w:rPr>
+          <w:rFonts w:ascii="Consolas" w:hAnsi="Consolas" w:cs="Arial" w:hint="cs"/>
+          <w:rtl/>
+        </w:rPr>
+        <w:t>آلارم‌های</w:t>
+      </w:r>
+      <w:r>
+        <w:rPr>
+          <w:rFonts w:ascii="Consolas" w:hAnsi="Consolas" w:cs="Arial"/>
+          <w:rtl/>
+        </w:rPr>
+        <w:t xml:space="preserve"> </w:t>
+      </w:r>
+      <w:r>
+        <w:rPr>
+          <w:rFonts w:ascii="Consolas" w:hAnsi="Consolas" w:cs="Arial"/>
+          <w:rtl/>
+          <w:lang w:bidi="fa-IR"/>
+        </w:rPr>
+        <w:t>۲۴</w:t>
+      </w:r>
+      <w:r>
+        <w:rPr>
+          <w:rFonts w:ascii="Consolas" w:hAnsi="Consolas" w:cs="Arial"/>
+          <w:rtl/>
+        </w:rPr>
+        <w:t xml:space="preserve"> </w:t>
+      </w:r>
+      <w:r>
+        <w:rPr>
+          <w:rFonts w:ascii="Consolas" w:hAnsi="Consolas" w:cs="Arial" w:hint="cs"/>
+          <w:rtl/>
+        </w:rPr>
+        <w:t>ساعت</w:t>
+      </w:r>
+      <w:r>
+        <w:rPr>
+          <w:rFonts w:ascii="Consolas" w:hAnsi="Consolas" w:cs="Arial"/>
+          <w:rtl/>
+        </w:rPr>
+        <w:t xml:space="preserve"> </w:t>
+      </w:r>
+      <w:r>
+        <w:rPr>
+          <w:rFonts w:ascii="Consolas" w:hAnsi="Consolas" w:cs="Arial" w:hint="cs"/>
+          <w:rtl/>
+        </w:rPr>
+        <w:t>اخیر</w:t>
+      </w:r>
+    </w:p>
+    <w:p>
+      <w:pPr>
+        <w:rPr>
+          <w:rFonts w:ascii="Consolas" w:hAnsi="Consolas"/>
+        </w:rPr>
+      </w:pPr>
+      <w:r>
+        <w:rPr>
+          <w:rFonts w:ascii="Consolas" w:hAnsi="Consolas"/>
+        </w:rPr>
+        <w:t>$uri = "http://127.0.0.1:8082/api/v1/reports/alarms?format=json"</w:t>
+      </w:r>
+    </w:p>
+    <w:p>
+      <w:pPr>
+        <w:rPr>
+          <w:rFonts w:ascii="Consolas" w:hAnsi="Consolas"/>
+          <w:rtl/>
+        </w:rPr>
+      </w:pPr>
+      <w:r>
+        <w:rPr>
+          <w:rFonts w:ascii="Consolas" w:hAnsi="Consolas"/>
+        </w:rPr>
+        <w:t>Invoke-RestMethod -Uri $uri | ConvertTo-Json -Depth 10</w:t>
+      </w:r>
+    </w:p>
+    <w:p>
+      <w:pPr>
+        <w:rPr>
+          <w:rFonts w:ascii="Consolas" w:hAnsi="Consolas"/>
+          <w:rtl/>
+        </w:rPr>
+      </w:pPr>
+    </w:p>
+    <w:p>
+      <w:pPr>
+        <w:rPr>
+          <w:rFonts w:ascii="Consolas" w:hAnsi="Consolas"/>
+        </w:rPr>
+      </w:pPr>
+      <w:r>
+        <w:rPr>
+          <w:rFonts w:ascii="Consolas" w:hAnsi="Consolas"/>
+        </w:rPr>
+        <w:t>$uri = "http://127.0.0.1:8082/api/v1/reports/alarms?severity=critical&amp;format=csv"</w:t>
+      </w:r>
+    </w:p>
+    <w:p>
+      <w:pPr>
+        <w:rPr>
+          <w:rFonts w:ascii="Consolas" w:hAnsi="Consolas"/>
+        </w:rPr>
+      </w:pPr>
+      <w:r>
+        <w:rPr>
+          <w:rFonts w:ascii="Consolas" w:hAnsi="Consolas"/>
+        </w:rPr>
+        <w:t>Invoke-WebRequest -Uri $uri -OutFile "alarm_report.csv"</w:t>
+      </w:r>
+    </w:p>
+    <w:p>
+      <w:pPr>
+        <w:rPr>
+          <w:rFonts w:ascii="Consolas" w:hAnsi="Consolas"/>
+        </w:rPr>
+      </w:pPr>
+    </w:p>
+    <w:p>
+      <w:pPr>
+        <w:rPr>
+          <w:rFonts w:ascii="Consolas" w:hAnsi="Consolas"/>
+        </w:rPr>
+      </w:pPr>
+      <w:r>
+        <w:rPr>
+          <w:rFonts w:ascii="Consolas" w:hAnsi="Consolas"/>
+        </w:rPr>
+        <w:t xml:space="preserve"># </w:t>
+      </w:r>
+      <w:r>
+        <w:rPr>
+          <w:rFonts w:ascii="Consolas" w:hAnsi="Consolas" w:cs="Arial" w:hint="cs"/>
+          <w:rtl/>
+        </w:rPr>
+        <w:t>فیلتر</w:t>
+      </w:r>
+      <w:r>
+        <w:rPr>
+          <w:rFonts w:ascii="Consolas" w:hAnsi="Consolas" w:cs="Arial"/>
+          <w:rtl/>
+        </w:rPr>
+        <w:t xml:space="preserve"> </w:t>
+      </w:r>
+      <w:r>
+        <w:rPr>
+          <w:rFonts w:ascii="Consolas" w:hAnsi="Consolas" w:cs="Arial" w:hint="cs"/>
+          <w:rtl/>
+        </w:rPr>
+        <w:t>بر</w:t>
+      </w:r>
+      <w:r>
+        <w:rPr>
+          <w:rFonts w:ascii="Consolas" w:hAnsi="Consolas" w:cs="Arial"/>
+          <w:rtl/>
+        </w:rPr>
+        <w:t xml:space="preserve"> </w:t>
+      </w:r>
+      <w:r>
+        <w:rPr>
+          <w:rFonts w:ascii="Consolas" w:hAnsi="Consolas" w:cs="Arial" w:hint="cs"/>
+          <w:rtl/>
+        </w:rPr>
+        <w:t>اساس</w:t>
+      </w:r>
+      <w:r>
+        <w:rPr>
+          <w:rFonts w:ascii="Consolas" w:hAnsi="Consolas"/>
+        </w:rPr>
+        <w:t xml:space="preserve"> severity</w:t>
+      </w:r>
+    </w:p>
+    <w:p>
+      <w:pPr>
+        <w:rPr>
+          <w:rFonts w:ascii="Consolas" w:hAnsi="Consolas"/>
+        </w:rPr>
+      </w:pPr>
+      <w:r>
+        <w:rPr>
+          <w:rFonts w:ascii="Consolas" w:hAnsi="Consolas"/>
+        </w:rPr>
+        <w:t>$uri = "http://127.0.0.1:8082/api/v1/reports/alarms?severity=critical&amp;format=json"</w:t>
+      </w:r>
+    </w:p>
+    <w:p>
+      <w:pPr>
+        <w:rPr>
+          <w:rFonts w:ascii="Consolas" w:hAnsi="Consolas"/>
+        </w:rPr>
+      </w:pPr>
+      <w:r>
+        <w:rPr>
+          <w:rFonts w:ascii="Consolas" w:hAnsi="Consolas"/>
+        </w:rPr>
+        <w:t>Invoke-RestMethod -Uri $uri | ConvertTo-Json -Depth 10</w:t>
+      </w:r>
+    </w:p>
+    <w:p>
+      <w:pPr>
+        <w:rPr>
+          <w:rFonts w:ascii="Consolas" w:hAnsi="Consolas"/>
+        </w:rPr>
+      </w:pPr>
+    </w:p>
+    <w:p>
+      <w:pPr>
+        <w:rPr>
+          <w:rFonts w:ascii="Consolas" w:hAnsi="Consolas"/>
+        </w:rPr>
+      </w:pPr>
+      <w:r>
+        <w:rPr>
+          <w:rFonts w:ascii="Consolas" w:hAnsi="Consolas"/>
+        </w:rPr>
+        <w:t xml:space="preserve"># </w:t>
+      </w:r>
+      <w:r>
+        <w:rPr>
+          <w:rFonts w:ascii="Consolas" w:hAnsi="Consolas" w:cs="Arial" w:hint="cs"/>
+          <w:rtl/>
+        </w:rPr>
+        <w:t>فیلتر</w:t>
+      </w:r>
+      <w:r>
+        <w:rPr>
+          <w:rFonts w:ascii="Consolas" w:hAnsi="Consolas" w:cs="Arial"/>
+          <w:rtl/>
+        </w:rPr>
+        <w:t xml:space="preserve"> </w:t>
+      </w:r>
+      <w:r>
+        <w:rPr>
+          <w:rFonts w:ascii="Consolas" w:hAnsi="Consolas" w:cs="Arial" w:hint="cs"/>
+          <w:rtl/>
+        </w:rPr>
+        <w:t>بر</w:t>
+      </w:r>
+      <w:r>
+        <w:rPr>
+          <w:rFonts w:ascii="Consolas" w:hAnsi="Consolas" w:cs="Arial"/>
+          <w:rtl/>
+        </w:rPr>
+        <w:t xml:space="preserve"> </w:t>
+      </w:r>
+      <w:r>
+        <w:rPr>
+          <w:rFonts w:ascii="Consolas" w:hAnsi="Consolas" w:cs="Arial" w:hint="cs"/>
+          <w:rtl/>
+        </w:rPr>
+        <w:t>اساس</w:t>
+      </w:r>
+      <w:r>
+        <w:rPr>
+          <w:rFonts w:ascii="Consolas" w:hAnsi="Consolas"/>
+        </w:rPr>
+        <w:t xml:space="preserve"> state</w:t>
+      </w:r>
+    </w:p>
+    <w:p>
+      <w:pPr>
+        <w:rPr>
+          <w:rFonts w:ascii="Consolas" w:hAnsi="Consolas"/>
+        </w:rPr>
+      </w:pPr>
+      <w:r>
+        <w:rPr>
+          <w:rFonts w:ascii="Consolas" w:hAnsi="Consolas"/>
+        </w:rPr>
+        <w:t>$uri = "http://127.0.0.1:8082/api/v1/reports/alarms?state=active&amp;format=json"</w:t>
+      </w:r>
+    </w:p>
+    <w:p>
+      <w:pPr>
+        <w:rPr>
+          <w:rFonts w:ascii="Consolas" w:hAnsi="Consolas"/>
+        </w:rPr>
+      </w:pPr>
+      <w:r>
+        <w:rPr>
+          <w:rFonts w:ascii="Consolas" w:hAnsi="Consolas"/>
+        </w:rPr>
+        <w:t>Invoke-RestMethod -Uri $uri | ConvertTo-Json -Depth 10</w:t>
+      </w:r>
+    </w:p>
+    <w:p>
+      <w:pPr>
+        <w:rPr>
+          <w:rFonts w:ascii="Consolas" w:hAnsi="Consolas"/>
+        </w:rPr>
+      </w:pPr>
+    </w:p>
+    <w:p>
+      <w:pPr>
+        <w:rPr>
+          <w:rFonts w:ascii="Consolas" w:hAnsi="Consolas"/>
+        </w:rPr>
+      </w:pPr>
+      <w:r>
+        <w:rPr>
+          <w:rFonts w:ascii="Consolas" w:hAnsi="Consolas"/>
+        </w:rPr>
+        <w:t xml:space="preserve"># </w:t>
+      </w:r>
+      <w:r>
+        <w:rPr>
+          <w:rFonts w:ascii="Consolas" w:hAnsi="Consolas" w:cs="Arial" w:hint="cs"/>
+          <w:rtl/>
+        </w:rPr>
+        <w:t>فیلتر</w:t>
+      </w:r>
+      <w:r>
+        <w:rPr>
+          <w:rFonts w:ascii="Consolas" w:hAnsi="Consolas" w:cs="Arial"/>
+          <w:rtl/>
+        </w:rPr>
+        <w:t xml:space="preserve"> </w:t>
+      </w:r>
+      <w:r>
+        <w:rPr>
+          <w:rFonts w:ascii="Consolas" w:hAnsi="Consolas" w:cs="Arial" w:hint="cs"/>
+          <w:rtl/>
+        </w:rPr>
+        <w:t>بر</w:t>
+      </w:r>
+      <w:r>
+        <w:rPr>
+          <w:rFonts w:ascii="Consolas" w:hAnsi="Consolas" w:cs="Arial"/>
+          <w:rtl/>
+        </w:rPr>
+        <w:t xml:space="preserve"> </w:t>
+      </w:r>
+      <w:r>
+        <w:rPr>
+          <w:rFonts w:ascii="Consolas" w:hAnsi="Consolas" w:cs="Arial" w:hint="cs"/>
+          <w:rtl/>
+        </w:rPr>
+        <w:t>اساس</w:t>
+      </w:r>
+      <w:r>
+        <w:rPr>
+          <w:rFonts w:ascii="Consolas" w:hAnsi="Consolas"/>
+        </w:rPr>
+        <w:t xml:space="preserve"> tag_id</w:t>
+      </w:r>
+    </w:p>
+    <w:p>
+      <w:pPr>
+        <w:rPr>
+          <w:rFonts w:ascii="Consolas" w:hAnsi="Consolas"/>
+        </w:rPr>
+      </w:pPr>
+      <w:r>
+        <w:rPr>
+          <w:rFonts w:ascii="Consolas" w:hAnsi="Consolas"/>
+        </w:rPr>
+        <w:lastRenderedPageBreak/>
+        <w:t>$uri = "http://127.0.0.1:8082/api/v1/reports/alarms?tag_id=1&amp;format=json"</w:t>
+      </w:r>
+    </w:p>
+    <w:p>
+      <w:pPr>
+        <w:rPr>
+          <w:rFonts w:ascii="Consolas" w:hAnsi="Consolas"/>
+          <w:rtl/>
+        </w:rPr>
+      </w:pPr>
+      <w:r>
+        <w:rPr>
+          <w:rFonts w:ascii="Consolas" w:hAnsi="Consolas"/>
+        </w:rPr>
+        <w:t>Invoke-RestMethod -Uri $uri | ConvertTo-Json -Depth 10</w:t>
+      </w:r>
+    </w:p>
+    <w:p>
+      <w:pPr>
+        <w:rPr>
+          <w:rFonts w:ascii="Consolas" w:hAnsi="Consolas"/>
+          <w:rtl/>
+        </w:rPr>
+      </w:pPr>
+    </w:p>
+    <w:p>
+      <w:pPr>
+        <w:rPr>
+          <w:rFonts w:ascii="Consolas" w:hAnsi="Consolas"/>
+        </w:rPr>
+      </w:pPr>
+      <w:r>
+        <w:rPr>
+          <w:rFonts w:ascii="Consolas" w:hAnsi="Consolas"/>
+        </w:rPr>
+        <w:t>$uri = "http://127.0.0.1:8082/api/v1/reports/alarms?severity=critical&amp;format=csv"</w:t>
+      </w:r>
+    </w:p>
+    <w:p>
+      <w:pPr>
+        <w:rPr>
+          <w:rFonts w:ascii="Consolas" w:hAnsi="Consolas"/>
+        </w:rPr>
+      </w:pPr>
+      <w:r>
+        <w:rPr>
+          <w:rFonts w:ascii="Consolas" w:hAnsi="Consolas"/>
+        </w:rPr>
+        <w:t>Invoke-WebRequest -Uri $uri -OutFile "alarm_report.csv"</w:t>
+      </w:r>
+    </w:p>
+    <w:p>
+      <w:pPr>
+        <w:bidi/>
+        <w:rPr>
+          <w:rtl/>
+          <w:lang w:bidi="fa-IR"/>
+        </w:rPr>
+      </w:pPr>
+    </w:p>
+    <w:p>
+      <w:pPr>
+        <w:bidi/>
+        <w:rPr>
+          <w:rtl/>
+          <w:lang w:bidi="fa-IR"/>
+        </w:rPr>
+      </w:pPr>
+    </w:p>
+    <w:p>
+      <w:pPr>
+        <w:bidi/>
+        <w:rPr>
+          <w:rFonts w:ascii="Consolas" w:hAnsi="Consolas"/>
+          <w:lang w:bidi="fa-IR"/>
+        </w:rPr>
+      </w:pPr>
+      <w:r>
+        <w:rPr>
+          <w:rFonts w:ascii="Consolas" w:hAnsi="Consolas" w:cs="Arial"/>
+          <w:rtl/>
+          <w:lang w:bidi="fa-IR"/>
+        </w:rPr>
+        <w:t># خلاصه امروز</w:t>
+      </w:r>
+    </w:p>
+    <w:p>
+      <w:pPr>
+        <w:rPr>
+          <w:rFonts w:ascii="Consolas" w:hAnsi="Consolas"/>
+          <w:lang w:bidi="fa-IR"/>
+        </w:rPr>
+      </w:pPr>
+      <w:r>
+        <w:rPr>
+          <w:rFonts w:ascii="Consolas" w:hAnsi="Consolas" w:cs="Arial"/>
+          <w:rtl/>
+          <w:lang w:bidi="fa-IR"/>
+        </w:rPr>
+        <w:t>$</w:t>
+      </w:r>
+      <w:r>
+        <w:rPr>
+          <w:rFonts w:ascii="Consolas" w:hAnsi="Consolas"/>
+          <w:lang w:bidi="fa-IR"/>
+        </w:rPr>
+        <w:t>uri = "http://127.0.0.1:8082/api/v1/reports/daily-summary?tag_ids=1,2,3&amp;format=json</w:t>
+      </w:r>
+      <w:r>
+        <w:rPr>
+          <w:rFonts w:ascii="Consolas" w:hAnsi="Consolas" w:cs="Arial"/>
+          <w:rtl/>
+          <w:lang w:bidi="fa-IR"/>
+        </w:rPr>
+        <w:t>"</w:t>
+      </w:r>
+    </w:p>
+    <w:p>
+      <w:pPr>
+        <w:rPr>
+          <w:rFonts w:ascii="Consolas" w:hAnsi="Consolas"/>
+          <w:lang w:bidi="fa-IR"/>
+        </w:rPr>
+      </w:pPr>
+      <w:r>
+        <w:rPr>
+          <w:rFonts w:ascii="Consolas" w:hAnsi="Consolas"/>
+          <w:lang w:bidi="fa-IR"/>
+        </w:rPr>
+        <w:t>Invoke-RestMethod -Uri $uri | ConvertTo-Json -Depth 10</w:t>
+      </w:r>
+    </w:p>
+    <w:p>
+      <w:pPr>
+        <w:bidi/>
+        <w:rPr>
+          <w:rFonts w:ascii="Consolas" w:hAnsi="Consolas"/>
+          <w:lang w:bidi="fa-IR"/>
+        </w:rPr>
+      </w:pPr>
+    </w:p>
+    <w:p>
+      <w:pPr>
+        <w:bidi/>
+        <w:rPr>
+          <w:rFonts w:ascii="Consolas" w:hAnsi="Consolas"/>
+          <w:lang w:bidi="fa-IR"/>
+        </w:rPr>
+      </w:pPr>
+      <w:r>
+        <w:rPr>
+          <w:rFonts w:ascii="Consolas" w:hAnsi="Consolas" w:cs="Arial"/>
+          <w:rtl/>
+          <w:lang w:bidi="fa-IR"/>
+        </w:rPr>
+        <w:t># خلاصه یک روز خاص</w:t>
+      </w:r>
+    </w:p>
+    <w:p>
+      <w:pPr>
+        <w:rPr>
+          <w:rFonts w:ascii="Consolas" w:hAnsi="Consolas"/>
+          <w:lang w:bidi="fa-IR"/>
+        </w:rPr>
+      </w:pPr>
+      <w:r>
+        <w:rPr>
+          <w:rFonts w:ascii="Consolas" w:hAnsi="Consolas" w:cs="Arial"/>
+          <w:rtl/>
+          <w:lang w:bidi="fa-IR"/>
+        </w:rPr>
+        <w:t>$</w:t>
+      </w:r>
+      <w:r>
+        <w:rPr>
+          <w:rFonts w:ascii="Consolas" w:hAnsi="Consolas"/>
+          <w:lang w:bidi="fa-IR"/>
+        </w:rPr>
+        <w:t>uri = "http://127.0.0.1:8082/api/v1/reports/daily-summary?tag_ids=1,2,3&amp;date=2026-08-10&amp;format=json</w:t>
+      </w:r>
+      <w:r>
+        <w:rPr>
+          <w:rFonts w:ascii="Consolas" w:hAnsi="Consolas" w:cs="Arial"/>
+          <w:rtl/>
+          <w:lang w:bidi="fa-IR"/>
+        </w:rPr>
+        <w:t>"</w:t>
+      </w:r>
+    </w:p>
+    <w:p>
+      <w:pPr>
+        <w:rPr>
+          <w:rFonts w:ascii="Consolas" w:hAnsi="Consolas"/>
+          <w:lang w:bidi="fa-IR"/>
+        </w:rPr>
+      </w:pPr>
+      <w:r>
+        <w:rPr>
+          <w:rFonts w:ascii="Consolas" w:hAnsi="Consolas"/>
+          <w:lang w:bidi="fa-IR"/>
+        </w:rPr>
+        <w:t>Invoke-RestMethod -Uri $uri | ConvertTo-Json -Depth 10</w:t>
+      </w:r>
+    </w:p>
+    <w:p>
+      <w:pPr>
+        <w:bidi/>
+        <w:rPr>
+          <w:rFonts w:ascii="Consolas" w:hAnsi="Consolas"/>
+          <w:lang w:bidi="fa-IR"/>
+        </w:rPr>
+      </w:pPr>
+    </w:p>
+    <w:p>
+      <w:pPr>
+        <w:bidi/>
+        <w:rPr>
+          <w:rFonts w:ascii="Consolas" w:hAnsi="Consolas"/>
+          <w:lang w:bidi="fa-IR"/>
+        </w:rPr>
+      </w:pPr>
+      <w:r>
+        <w:rPr>
+          <w:rFonts w:ascii="Consolas" w:hAnsi="Consolas" w:cs="Arial"/>
+          <w:rtl/>
+          <w:lang w:bidi="fa-IR"/>
+        </w:rPr>
+        <w:t xml:space="preserve"># دانلود </w:t>
+      </w:r>
+      <w:r>
+        <w:rPr>
+          <w:rFonts w:ascii="Consolas" w:hAnsi="Consolas"/>
+          <w:lang w:bidi="fa-IR"/>
+        </w:rPr>
+        <w:t>CSV</w:t>
+      </w:r>
+    </w:p>
+    <w:p>
+      <w:pPr>
+        <w:rPr>
+          <w:rFonts w:ascii="Consolas" w:hAnsi="Consolas"/>
+          <w:lang w:bidi="fa-IR"/>
+        </w:rPr>
+      </w:pPr>
+      <w:r>
+        <w:rPr>
+          <w:rFonts w:ascii="Consolas" w:hAnsi="Consolas" w:cs="Arial"/>
+          <w:rtl/>
+          <w:lang w:bidi="fa-IR"/>
+        </w:rPr>
+        <w:t>$</w:t>
+      </w:r>
+      <w:r>
+        <w:rPr>
+          <w:rFonts w:ascii="Consolas" w:hAnsi="Consolas"/>
+          <w:lang w:bidi="fa-IR"/>
+        </w:rPr>
+        <w:t>uri = "http://127.0.0.1:8082/api/v1/reports/daily-summary?tag_ids=1,2,3&amp;date=2026-08-10&amp;format=csv</w:t>
+      </w:r>
+      <w:r>
+        <w:rPr>
+          <w:rFonts w:ascii="Consolas" w:hAnsi="Consolas" w:cs="Arial"/>
+          <w:rtl/>
+          <w:lang w:bidi="fa-IR"/>
+        </w:rPr>
+        <w:t>"</w:t>
+      </w:r>
+    </w:p>
+    <w:p>
+      <w:pPr>
+        <w:rPr>
+          <w:rFonts w:ascii="Consolas" w:hAnsi="Consolas"/>
+          <w:rtl/>
+          <w:lang w:bidi="fa-IR"/>
+        </w:rPr>
+      </w:pPr>
+      <w:r>
+        <w:rPr>
+          <w:rFonts w:ascii="Consolas" w:hAnsi="Consolas"/>
+          <w:lang w:bidi="fa-IR"/>
+        </w:rPr>
+        <w:t>Invoke-WebRequest -Uri $uri -OutFile "daily_summary.csv</w:t>
+      </w:r>
+      <w:r>
+        <w:rPr>
+          <w:rFonts w:ascii="Consolas" w:hAnsi="Consolas" w:cs="Arial"/>
+          <w:rtl/>
+          <w:lang w:bidi="fa-IR"/>
+        </w:rPr>
+        <w:t>"</w:t>
+      </w:r>
+    </w:p>
+    <w:p>
+      <w:pPr>
+        <w:bidi/>
+        <w:rPr>
+          <w:rtl/>
+          <w:lang w:bidi="fa-IR"/>
+        </w:rPr>
+      </w:pPr>
+    </w:p>
+    <w:p>
+      <w:pPr>
+        <w:bidi/>
+        <w:rPr>
+          <w:rtl/>
+          <w:lang w:bidi="fa-IR"/>
+        </w:rPr>
+      </w:pPr>
+    </w:p>
+    <w:p>
+      <w:pPr>
+        <w:bidi/>
+        <w:rPr>
+          <w:rtl/>
+          <w:lang w:bidi="fa-IR"/>
+        </w:rPr>
+      </w:pPr>
+    </w:p>
+    <w:p>
+      <w:pPr>
+        <w:bidi/>
+        <w:rPr>
+          <w:rFonts w:hint="cs"/>
+          <w:rtl/>
+          <w:lang w:bidi="fa-IR"/>
+        </w:rPr>
+      </w:pPr>
+      <w:r>
+        <w:rPr>
+          <w:rFonts w:cs="Arial"/>
+          <w:rtl/>
+          <w:lang w:bidi="fa-IR"/>
+        </w:rPr>
+        <w:lastRenderedPageBreak/>
+        <w:drawing>
+          <wp:inline distT="0" distB="0" distL="0" distR="0" wp14:anchorId="711F63C9" wp14:editId="121E726F">
+            <wp:extent cx="5943600" cy="3517265"/>
+            <wp:effectExtent l="0" t="0" r="0" b="6985"/>
+            <wp:docPr id="3" name="Picture 3"/>
+            <wp:cNvGraphicFramePr>
+              <a:graphicFrameLocks xmlns:a="http://schemas.openxmlformats.org/drawingml/2006/main" noChangeAspect="1"/>
+            </wp:cNvGraphicFramePr>
+            <a:graphic xmlns:a="http://schemas.openxmlformats.org/drawingml/2006/main">
+              <a:graphicData uri="http://schemas.openxmlformats.org/drawingml/2006/picture">
+                <pic:pic xmlns:pic="http://schemas.openxmlformats.org/drawingml/2006/picture">
+                  <pic:nvPicPr>
+                    <pic:cNvPr id="1" name=""/>
+                    <pic:cNvPicPr/>
+                  </pic:nvPicPr>
+                  <pic:blipFill>
+                    <a:blip r:embed="rId11"/>
+                    <a:stretch>
+                      <a:fillRect/>
+                    </a:stretch>
+                  </pic:blipFill>
+                  <pic:spPr>
+                    <a:xfrm>
+                      <a:off x="0" y="0"/>
+                      <a:ext cx="5943600" cy="3517265"/>
+                    </a:xfrm>
+                    <a:prstGeom prst="rect">
+                      <a:avLst/>
+                    </a:prstGeom>
+                  </pic:spPr>
+                </pic:pic>
+              </a:graphicData>
+            </a:graphic>
+          </wp:inline>
+        </w:drawing>
+      </w:r>
+    </w:p>
+    <w:p>
+      <w:pPr>
+        <w:bidi/>
+        <w:rPr>
+          <w:rtl/>
+          <w:lang w:bidi="fa-IR"/>
+        </w:rPr>
+      </w:pPr>
+    </w:p>
+    <w:p>
+      <w:pPr>
+        <w:bidi/>
+        <w:rPr>
+          <w:rtl/>
+          <w:lang w:bidi="fa-IR"/>
+        </w:rPr>
+      </w:pPr>
+      <w:r>
+        <w:rPr>
+          <w:rFonts w:hint="cs"/>
+          <w:rtl/>
+          <w:lang w:bidi="fa-IR"/>
+        </w:rPr>
+        <w:t>------------------------------------------------------------------------------------------------</w:t>
+      </w:r>
+    </w:p>
+    <w:p>
+      <w:pPr>
+        <w:bidi/>
+        <w:rPr>
+          <w:lang w:bidi="fa-IR"/>
+        </w:rPr>
+      </w:pPr>
+      <w:r>
+        <w:rPr>
+          <w:rFonts w:hint="cs"/>
+          <w:rtl/>
+          <w:lang w:bidi="fa-IR"/>
+        </w:rPr>
+        <w:t xml:space="preserve">تست </w:t>
+      </w:r>
+      <w:r>
+        <w:rPr>
+          <w:lang w:bidi="fa-IR"/>
+        </w:rPr>
+        <w:t>ack alarm</w:t>
+      </w:r>
+    </w:p>
+    <w:p>
+      <w:pPr>
+        <w:bidi/>
+        <w:rPr>
+          <w:lang w:bidi="fa-IR"/>
+        </w:rPr>
+      </w:pPr>
+      <w:r>
+        <w:rPr>
+          <w:lang w:bidi="fa-IR"/>
+        </w:rPr>
+        <w:t>wscat -c "ws://127.0.0.1:8081/ws/alarms/all</w:t>
+      </w:r>
+      <w:r>
+        <w:rPr>
+          <w:rFonts w:cs="Arial"/>
+          <w:rtl/>
+          <w:lang w:bidi="fa-IR"/>
+        </w:rPr>
+        <w:t xml:space="preserve">"      # </w:t>
+      </w:r>
+      <w:r>
+        <w:rPr>
+          <w:rFonts w:cs="Arial" w:hint="cs"/>
+          <w:rtl/>
+          <w:lang w:bidi="fa-IR"/>
+        </w:rPr>
+        <w:t>پنجره</w:t>
+      </w:r>
+      <w:r>
+        <w:rPr>
+          <w:rFonts w:cs="Arial"/>
+          <w:rtl/>
+          <w:lang w:bidi="fa-IR"/>
+        </w:rPr>
+        <w:t xml:space="preserve"> ۱ (</w:t>
+      </w:r>
+      <w:r>
+        <w:rPr>
+          <w:rFonts w:cs="Arial" w:hint="cs"/>
+          <w:rtl/>
+          <w:lang w:bidi="fa-IR"/>
+        </w:rPr>
+        <w:t>گیرنده</w:t>
+      </w:r>
+      <w:r>
+        <w:rPr>
+          <w:rFonts w:cs="Arial"/>
+          <w:rtl/>
+          <w:lang w:bidi="fa-IR"/>
+        </w:rPr>
+        <w:t>)</w:t>
+      </w:r>
+    </w:p>
+    <w:p>
+      <w:pPr>
+        <w:bidi/>
+        <w:rPr>
+          <w:rFonts w:cs="Arial"/>
+          <w:rtl/>
+          <w:lang w:bidi="fa-IR"/>
+        </w:rPr>
+      </w:pPr>
+      <w:r>
+        <w:rPr>
+          <w:lang w:bidi="fa-IR"/>
+        </w:rPr>
+        <w:t>wscat -c "ws://127.0.0.1:8081/ws/system/status</w:t>
+      </w:r>
+      <w:r>
+        <w:rPr>
+          <w:rFonts w:cs="Arial"/>
+          <w:rtl/>
+          <w:lang w:bidi="fa-IR"/>
+        </w:rPr>
+        <w:t xml:space="preserve">"   # </w:t>
+      </w:r>
+      <w:r>
+        <w:rPr>
+          <w:rFonts w:cs="Arial" w:hint="cs"/>
+          <w:rtl/>
+          <w:lang w:bidi="fa-IR"/>
+        </w:rPr>
+        <w:t>پنجره</w:t>
+      </w:r>
+      <w:r>
+        <w:rPr>
+          <w:rFonts w:cs="Arial"/>
+          <w:rtl/>
+          <w:lang w:bidi="fa-IR"/>
+        </w:rPr>
+        <w:t xml:space="preserve"> ۲ (</w:t>
+      </w:r>
+      <w:r>
+        <w:rPr>
+          <w:rFonts w:cs="Arial" w:hint="cs"/>
+          <w:rtl/>
+          <w:lang w:bidi="fa-IR"/>
+        </w:rPr>
+        <w:t>فرستنده</w:t>
+      </w:r>
+      <w:r>
+        <w:rPr>
+          <w:rFonts w:cs="Arial"/>
+          <w:rtl/>
+          <w:lang w:bidi="fa-IR"/>
+        </w:rPr>
+        <w:t>)</w:t>
+      </w:r>
+    </w:p>
+    <w:p>
+      <w:pPr>
+        <w:bidi/>
+        <w:rPr>
+          <w:rFonts w:ascii="Arial" w:hAnsi="Arial" w:cs="Arial"/>
+          <w:color w:val="F7F8FC"/>
+          <w:shd w:val="clear" w:color="auto" w:fill="232326"/>
+          <w:rtl/>
+        </w:rPr>
+      </w:pPr>
+      <w:r>
+        <w:rPr>
+          <w:rFonts w:ascii="Arial" w:hAnsi="Arial" w:cs="Arial"/>
+          <w:color w:val="F7F8FC"/>
+          <w:shd w:val="clear" w:color="auto" w:fill="232326"/>
+          <w:rtl/>
+        </w:rPr>
+        <w:t xml:space="preserve">در پنجره </w:t>
+      </w:r>
+      <w:r>
+        <w:rPr>
+          <w:rFonts w:ascii="Arial" w:hAnsi="Arial" w:cs="Arial"/>
+          <w:color w:val="F7F8FC"/>
+          <w:shd w:val="clear" w:color="auto" w:fill="232326"/>
+          <w:rtl/>
+          <w:lang w:bidi="fa-IR"/>
+        </w:rPr>
+        <w:t>۲</w:t>
+      </w:r>
+      <w:r>
+        <w:rPr>
+          <w:rFonts w:ascii="Arial" w:hAnsi="Arial" w:cs="Arial"/>
+          <w:color w:val="F7F8FC"/>
+          <w:shd w:val="clear" w:color="auto" w:fill="232326"/>
+        </w:rPr>
+        <w:t>:</w:t>
+      </w:r>
+    </w:p>
+    <w:p>
+      <w:pPr>
+        <w:bidi/>
+        <w:rPr>
+          <w:rtl/>
+          <w:lang w:bidi="fa-IR"/>
+        </w:rPr>
+      </w:pPr>
+      <w:r>
+        <w:rPr>
+          <w:rFonts w:cs="Arial"/>
+          <w:rtl/>
+          <w:lang w:bidi="fa-IR"/>
+        </w:rPr>
+        <w:t>{"</w:t>
+      </w:r>
+      <w:r>
+        <w:rPr>
+          <w:lang w:bidi="fa-IR"/>
+        </w:rPr>
+        <w:t>type":"command","id":"a1","op":"ack_alarm","payload":{"alarm_id":1,"user_name":"operator"}</w:t>
+      </w:r>
+      <w:r>
+        <w:rPr>
+          <w:rFonts w:cs="Arial"/>
+          <w:rtl/>
+          <w:lang w:bidi="fa-IR"/>
+        </w:rPr>
+        <w:t>}</w:t>
+      </w:r>
+    </w:p>
+    <w:p>
+      <w:pPr>
+        <w:bidi/>
+        <w:rPr>
+          <w:rtl/>
+          <w:lang w:bidi="fa-IR"/>
+        </w:rPr>
+      </w:pPr>
+    </w:p>
+    <w:p>
+      <w:pPr>
+        <w:bidi/>
+        <w:rPr>
+          <w:rtl/>
+          <w:lang w:bidi="fa-IR"/>
+        </w:rPr>
+      </w:pPr>
+    </w:p>
+    <w:p>
+      <w:pPr>
+        <w:bidi/>
+        <w:rPr>
+          <w:lang w:bidi="fa-IR"/>
+        </w:rPr>
+      </w:pPr>
+      <w:r>
+        <w:rPr>
+          <w:lang w:bidi="fa-IR"/>
+        </w:rPr>
+        <w:t>-------------------------------------------------</w:t>
+      </w:r>
+    </w:p>
+    <w:p>
+      <w:pPr>
+        <w:bidi/>
+        <w:rPr>
+          <w:lang w:bidi="fa-IR"/>
+        </w:rPr>
+      </w:pPr>
+      <w:r>
+        <w:rPr>
+          <w:rFonts w:hint="cs"/>
+          <w:rtl/>
+          <w:lang w:bidi="fa-IR"/>
+        </w:rPr>
+        <w:t xml:space="preserve">تست </w:t>
+      </w:r>
+      <w:r>
+        <w:rPr>
+          <w:lang w:bidi="fa-IR"/>
+        </w:rPr>
+        <w:t>user</w:t>
+      </w:r>
+    </w:p>
+    <w:p>
+      <w:pPr>
+        <w:rPr>
+          <w:lang w:bidi="fa-IR"/>
+        </w:rPr>
+      </w:pPr>
+      <w:r>
+        <w:rPr>
+          <w:lang w:bidi="fa-IR"/>
+        </w:rPr>
+        <w:t># Login</w:t>
+      </w:r>
+    </w:p>
+    <w:p>
+      <w:pPr>
+        <w:rPr>
+          <w:lang w:bidi="fa-IR"/>
+        </w:rPr>
+      </w:pPr>
+      <w:r>
+        <w:rPr>
+          <w:lang w:bidi="fa-IR"/>
+        </w:rPr>
+        <w:t>$login = Invoke-RestMethod -Uri "http://127.0.0.1:8082/api/v1/auth/login" -Method Post `</w:t>
+      </w:r>
+    </w:p>
+    <w:p>
+      <w:pPr>
+        <w:rPr>
+          <w:lang w:bidi="fa-IR"/>
+        </w:rPr>
+      </w:pPr>
+      <w:r>
+        <w:rPr>
+          <w:lang w:bidi="fa-IR"/>
+        </w:rPr>
+        <w:t xml:space="preserve">  -Body (@{username="admin"; password="admin123"} | ConvertTo-Json) -ContentType "application/json"</w:t>
+      </w:r>
+    </w:p>
+    <w:p>
+      <w:pPr>
+        <w:rPr>
+          <w:lang w:bidi="fa-IR"/>
+        </w:rPr>
+      </w:pPr>
+      <w:r>
+        <w:rPr>
+          <w:lang w:bidi="fa-IR"/>
+        </w:rPr>
+        <w:t>$token = $login.token</w:t>
+      </w:r>
+    </w:p>
+    <w:p>
+      <w:pPr>
+        <w:rPr>
+          <w:lang w:bidi="fa-IR"/>
+        </w:rPr>
+      </w:pPr>
+    </w:p>
+    <w:p>
+      <w:pPr>
+        <w:rPr>
+          <w:lang w:bidi="fa-IR"/>
+        </w:rPr>
+      </w:pPr>
+      <w:r>
+        <w:rPr>
+          <w:lang w:bidi="fa-IR"/>
+        </w:rPr>
+        <w:lastRenderedPageBreak/>
+        <w:t># Me</w:t>
+      </w:r>
+    </w:p>
+    <w:p>
+      <w:pPr>
+        <w:rPr>
+          <w:lang w:bidi="fa-IR"/>
+        </w:rPr>
+      </w:pPr>
+      <w:r>
+        <w:rPr>
+          <w:lang w:bidi="fa-IR"/>
+        </w:rPr>
+        <w:t>Invoke-RestMethod -Uri "http://127.0.0.1:8082/api/v1/auth/me" -Headers @{Authorization="Bearer $token"}</w:t>
+      </w:r>
+    </w:p>
+    <w:p>
+      <w:pPr>
+        <w:rPr>
+          <w:lang w:bidi="fa-IR"/>
+        </w:rPr>
+      </w:pPr>
+    </w:p>
+    <w:p>
+      <w:pPr>
+        <w:rPr>
+          <w:lang w:bidi="fa-IR"/>
+        </w:rPr>
+      </w:pPr>
+      <w:r>
+        <w:rPr>
+          <w:lang w:bidi="fa-IR"/>
+        </w:rPr>
+        <w:t xml:space="preserve"># </w:t>
+      </w:r>
+      <w:r>
+        <w:rPr>
+          <w:rFonts w:cs="Arial" w:hint="cs"/>
+          <w:rtl/>
+          <w:lang w:bidi="fa-IR"/>
+        </w:rPr>
+        <w:t>لیست</w:t>
+      </w:r>
+      <w:r>
+        <w:rPr>
+          <w:rFonts w:cs="Arial"/>
+          <w:rtl/>
+          <w:lang w:bidi="fa-IR"/>
+        </w:rPr>
+        <w:t xml:space="preserve"> </w:t>
+      </w:r>
+      <w:r>
+        <w:rPr>
+          <w:rFonts w:cs="Arial" w:hint="cs"/>
+          <w:rtl/>
+          <w:lang w:bidi="fa-IR"/>
+        </w:rPr>
+        <w:t>کاربران</w:t>
+      </w:r>
+    </w:p>
+    <w:p>
+      <w:pPr>
+        <w:rPr>
+          <w:lang w:bidi="fa-IR"/>
+        </w:rPr>
+      </w:pPr>
+      <w:r>
+        <w:rPr>
+          <w:lang w:bidi="fa-IR"/>
+        </w:rPr>
+        <w:t>Invoke-RestMethod -Uri "http://127.0.0.1:8082/api/v1/users" -Headers @{Authorization="Bearer $token"}</w:t>
+      </w:r>
+    </w:p>
+    <w:p>
+      <w:pPr>
+        <w:rPr>
+          <w:lang w:bidi="fa-IR"/>
+        </w:rPr>
+      </w:pPr>
+    </w:p>
+    <w:p>
+      <w:pPr>
+        <w:rPr>
+          <w:lang w:bidi="fa-IR"/>
+        </w:rPr>
+      </w:pPr>
+      <w:r>
+        <w:rPr>
+          <w:lang w:bidi="fa-IR"/>
+        </w:rPr>
+        <w:t xml:space="preserve"># </w:t>
+      </w:r>
+      <w:r>
+        <w:rPr>
+          <w:rFonts w:cs="Arial" w:hint="cs"/>
+          <w:rtl/>
+          <w:lang w:bidi="fa-IR"/>
+        </w:rPr>
+        <w:t>ساخت</w:t>
+      </w:r>
+      <w:r>
+        <w:rPr>
+          <w:rFonts w:cs="Arial"/>
+          <w:rtl/>
+          <w:lang w:bidi="fa-IR"/>
+        </w:rPr>
+        <w:t xml:space="preserve"> </w:t>
+      </w:r>
+      <w:r>
+        <w:rPr>
+          <w:rFonts w:cs="Arial" w:hint="cs"/>
+          <w:rtl/>
+          <w:lang w:bidi="fa-IR"/>
+        </w:rPr>
+        <w:t>کاربر</w:t>
+      </w:r>
+      <w:r>
+        <w:rPr>
+          <w:lang w:bidi="fa-IR"/>
+        </w:rPr>
+        <w:t xml:space="preserve"> viewer</w:t>
+      </w:r>
+    </w:p>
+    <w:p>
+      <w:pPr>
+        <w:rPr>
+          <w:lang w:bidi="fa-IR"/>
+        </w:rPr>
+      </w:pPr>
+      <w:r>
+        <w:rPr>
+          <w:lang w:bidi="fa-IR"/>
+        </w:rPr>
+        <w:t>Invoke-RestMethod -Uri "http://127.0.0.1:8082/api/v1/users" -Method Post -Headers @{Authorization="Bearer $token"} `</w:t>
+      </w:r>
+    </w:p>
+    <w:p>
+      <w:pPr>
+        <w:rPr>
+          <w:lang w:bidi="fa-IR"/>
+        </w:rPr>
+      </w:pPr>
+      <w:r>
+        <w:rPr>
+          <w:lang w:bidi="fa-IR"/>
+        </w:rPr>
+        <w:t xml:space="preserve">  -Body (@{username="guest"; password="1234"; role="viewer"} | ConvertTo-Json) -ContentType "application/json"</w:t>
+      </w:r>
+    </w:p>
+    <w:p>
+      <w:pPr>
+        <w:rPr>
+          <w:lang w:bidi="fa-IR"/>
+        </w:rPr>
+      </w:pPr>
+    </w:p>
+    <w:p>
+      <w:pPr>
+        <w:rPr>
+          <w:lang w:bidi="fa-IR"/>
+        </w:rPr>
+      </w:pPr>
+    </w:p>
+    <w:p>
+      <w:pPr>
+        <w:pStyle w:val="Heading2"/>
+        <w:pBdr>
+          <w:top w:val="single" w:sz="2" w:space="0" w:color="E3E3E3"/>
+          <w:left w:val="single" w:sz="2" w:space="0" w:color="E3E3E3"/>
+          <w:bottom w:val="single" w:sz="2" w:space="0" w:color="E3E3E3"/>
+          <w:right w:val="single" w:sz="2" w:space="0" w:color="E3E3E3"/>
+        </w:pBdr>
+        <w:shd w:val="clear" w:color="auto" w:fill="232326"/>
+        <w:bidi/>
+        <w:spacing w:before="0"/>
+        <w:rPr>
+          <w:rFonts w:ascii="Arial" w:hAnsi="Arial" w:cs="Arial"/>
+          <w:color w:val="F7F8FC"/>
+          <w:spacing w:val="-5"/>
+        </w:rPr>
+      </w:pPr>
+      <w:r>
+        <w:rPr>
+          <w:rStyle w:val="qwen-markdown-text"/>
+          <w:rFonts w:ascii="Arial" w:hAnsi="Arial" w:cs="Arial"/>
+          <w:color w:val="F7F8FC"/>
+          <w:spacing w:val="-5"/>
+          <w:bdr w:val="single" w:sz="2" w:space="0" w:color="E3E3E3" w:frame="1"/>
+          <w:rtl/>
+        </w:rPr>
+        <w:t xml:space="preserve">فعال‌سازی </w:t>
+      </w:r>
+      <w:r>
+        <w:rPr>
+          <w:rStyle w:val="qwen-markdown-text"/>
+          <w:rFonts w:ascii="Arial" w:hAnsi="Arial" w:cs="Arial"/>
+          <w:color w:val="F7F8FC"/>
+          <w:spacing w:val="-5"/>
+          <w:bdr w:val="single" w:sz="2" w:space="0" w:color="E3E3E3" w:frame="1"/>
+        </w:rPr>
+        <w:t>auth</w:t>
+      </w:r>
+      <w:r>
+        <w:rPr>
+          <w:rStyle w:val="qwen-markdown-text"/>
+          <w:rFonts w:ascii="Arial" w:hAnsi="Arial" w:cs="Arial"/>
+          <w:color w:val="F7F8FC"/>
+          <w:spacing w:val="-5"/>
+          <w:bdr w:val="single" w:sz="2" w:space="0" w:color="E3E3E3" w:frame="1"/>
+          <w:rtl/>
+        </w:rPr>
+        <w:t xml:space="preserve"> (اختیاری)</w:t>
+      </w:r>
+    </w:p>
+    <w:p>
+      <w:pPr>
+        <w:bidi/>
+        <w:rPr>
+          <w:lang w:bidi="fa-IR"/>
+        </w:rPr>
+      </w:pPr>
+    </w:p>
+    <w:p>
+      <w:pPr>
+        <w:jc w:val="both"/>
+        <w:rPr>
+          <w:lang w:bidi="fa-IR"/>
+        </w:rPr>
+      </w:pPr>
+      <w:r>
+        <w:rPr>
+          <w:lang w:bidi="fa-IR"/>
+        </w:rPr>
+        <w:t>UPDATE system_settings SET value_text='true' WHERE key='api.auth.enabled';</w:t>
+      </w:r>
+    </w:p>
+    <w:p>
+      <w:pPr>
+        <w:pStyle w:val="ListParagraph"/>
+        <w:bidi/>
+      </w:pPr>
+      <w:r>
+        <w:rPr>
+          <w:bdr w:val="single" w:sz="2" w:space="0" w:color="E3E3E3" w:frame="1"/>
+          <w:rtl/>
+        </w:rPr>
+        <w:t>بعد از فعال‌سازی:</w:t>
+      </w:r>
+    </w:p>
+    <w:p>
+      <w:pPr>
+        <w:pStyle w:val="ListParagraph"/>
+        <w:bidi/>
+        <w:rPr>
+          <w:rtl/>
+        </w:rPr>
+      </w:pPr>
+      <w:r>
+        <w:rPr>
+          <w:bdr w:val="single" w:sz="2" w:space="0" w:color="E3E3E3" w:frame="1"/>
+          <w:rtl/>
+        </w:rPr>
+        <w:t xml:space="preserve">بدون </w:t>
+      </w:r>
+      <w:r>
+        <w:rPr>
+          <w:bdr w:val="single" w:sz="2" w:space="0" w:color="E3E3E3" w:frame="1"/>
+        </w:rPr>
+        <w:t>token → 401</w:t>
+      </w:r>
+    </w:p>
+    <w:p>
+      <w:pPr>
+        <w:pStyle w:val="ListParagraph"/>
+        <w:bidi/>
+        <w:rPr>
+          <w:rtl/>
+        </w:rPr>
+      </w:pPr>
+      <w:r>
+        <w:rPr>
+          <w:bdr w:val="single" w:sz="2" w:space="0" w:color="E3E3E3" w:frame="1"/>
+        </w:rPr>
+        <w:t xml:space="preserve">viewer </w:t>
+      </w:r>
+      <w:r>
+        <w:rPr>
+          <w:bdr w:val="single" w:sz="2" w:space="0" w:color="E3E3E3" w:frame="1"/>
+          <w:rtl/>
+        </w:rPr>
+        <w:t>با</w:t>
+      </w:r>
+      <w:r>
+        <w:rPr>
+          <w:bdr w:val="single" w:sz="2" w:space="0" w:color="E3E3E3" w:frame="1"/>
+        </w:rPr>
+        <w:t xml:space="preserve"> POST → 403</w:t>
+      </w:r>
+    </w:p>
+    <w:p>
+      <w:pPr>
+        <w:pStyle w:val="ListParagraph"/>
+        <w:bidi/>
+      </w:pPr>
+      <w:r>
+        <w:rPr>
+          <w:bdr w:val="single" w:sz="2" w:space="0" w:color="E3E3E3" w:frame="1"/>
+        </w:rPr>
+        <w:t xml:space="preserve">admin → </w:t>
+      </w:r>
+      <w:r>
+        <w:rPr>
+          <w:bdr w:val="single" w:sz="2" w:space="0" w:color="E3E3E3" w:frame="1"/>
+          <w:rtl/>
+        </w:rPr>
+        <w:t>همه چیز</w:t>
+      </w:r>
+    </w:p>
+    <w:p>
+      <w:pPr>
+        <w:pStyle w:val="ListParagraph"/>
+        <w:bidi/>
+        <w:rPr>
+          <w:lang w:bidi="fa-IR"/>
+        </w:rPr>
+      </w:pPr>
+    </w:p>
+    <w:p>
+      <w:pPr>
+        <w:bidi/>
+        <w:rPr>
+          <w:rtl/>
+          <w:lang w:bidi="fa-IR"/>
+        </w:rPr>
+      </w:pPr>
+    </w:p>
+    <w:p>
+      <w:pPr>
+        <w:bidi/>
+        <w:rPr>
+          <w:rtl/>
+          <w:lang w:bidi="fa-IR"/>
+        </w:rPr>
+      </w:pPr>
+    </w:p>
+    <w:p>
+      <w:pPr>
+        <w:bidi/>
+        <w:rPr>
+          <w:rtl/>
+          <w:lang w:bidi="fa-IR"/>
+        </w:rPr>
+      </w:pPr>
+      <w:bookmarkStart w:id="0" w:name="_GoBack"/>
+    </w:p>
+    <w:bookmarkEnd w:id="0"/>
+    <w:p>
+      <w:pPr>
+        <w:bidi/>
+        <w:rPr>
+          <w:rtl/>
+          <w:lang w:bidi="fa-IR"/>
+        </w:rPr>
+      </w:pPr>
+    </w:p>
+    <w:p>
+      <w:pPr>
+        <w:bidi/>
+        <w:rPr>
+          <w:rtl/>
+          <w:lang w:bidi="fa-IR"/>
+        </w:rPr>
+      </w:pPr>
+    </w:p>
+    <w:p>
+      <w:pPr>
+        <w:bidi/>
+        <w:rPr>
+          <w:rtl/>
+          <w:lang w:bidi="fa-IR"/>
+        </w:rPr>
+      </w:pPr>
+    </w:p>
+    <w:p>
+      <w:pPr>
+        <w:bidi/>
+        <w:rPr>
+          <w:rtl/>
+          <w:lang w:bidi="fa-IR"/>
+        </w:rPr>
+      </w:pPr>
+    </w:p>
+    <w:p>
+      <w:pPr>
+        <w:bidi/>
+        <w:rPr>
+          <w:rtl/>
+          <w:lang w:bidi="fa-IR"/>
+        </w:rPr>
+      </w:pPr>
+    </w:p>
+    <w:p>
+      <w:pPr>
+        <w:bidi/>
+        <w:rPr>
+          <w:rtl/>
+          <w:lang w:bidi="fa-IR"/>
+        </w:rPr>
+      </w:pPr>
+    </w:p>
+    <w:p>
+      <w:pPr>
+        <w:bidi/>
+        <w:rPr>
+          <w:rtl/>
+          <w:lang w:bidi="fa-IR"/>
+        </w:rPr>
+      </w:pPr>
+    </w:p>
+    <w:p>
+      <w:pPr>
+        <w:bidi/>
+        <w:rPr>
+          <w:rtl/>
+          <w:lang w:bidi="fa-IR"/>
+        </w:rPr>
+      </w:pPr>
+    </w:p>
+    <w:p>
+      <w:pPr>
+        <w:bidi/>
+        <w:rPr>
+          <w:rtl/>
+          <w:lang w:bidi="fa-IR"/>
+        </w:rPr>
+      </w:pPr>
+    </w:p>
+    <w:p>
+      <w:pPr>
+        <w:bidi/>
+        <w:rPr>
+          <w:rtl/>
+          <w:lang w:bidi="fa-IR"/>
+        </w:rPr>
+      </w:pPr>
+    </w:p>
+    <w:p>
+      <w:pPr>
+        <w:bidi/>
+        <w:rPr>
+          <w:lang w:bidi="fa-IR"/>
+        </w:rPr>
+      </w:pPr>
     </w:p>
     <w:p>
       <w:pPr>
@@ -3668,6 +4832,56 @@
     </w:sectPr>
   </w:body>
 </w:document>
+</file>
+
+<file path=word/endnotes.xml><?xml version="1.0" encoding="utf-8"?>
+<w:endnotes xmlns:wpc="http://schemas.microsoft.com/office/word/2010/wordprocessingCanvas" xmlns:cx="http://schemas.microsoft.com/office/drawing/2014/chartex" xmlns:cx1="http://schemas.microsoft.com/office/drawing/2015/9/8/chartex" xmlns:mc="http://schemas.openxmlformats.org/markup-compatibility/2006" xmlns:o="urn:schemas-microsoft-com:office:office" xmlns:r="http://schemas.openxmlformats.org/officeDocument/2006/relationships" xmlns:m="http://schemas.openxmlformats.org/officeDocument/2006/math" xmlns:v="urn:schemas-microsoft-com:vml" xmlns:wp14="http://schemas.microsoft.com/office/word/2010/wordprocessingDrawing" xmlns:wp="http://schemas.openxmlformats.org/drawingml/2006/wordprocessingDrawing" xmlns:w10="urn:schemas-microsoft-com:office:word" xmlns:w="http://schemas.openxmlformats.org/wordprocessingml/2006/main" xmlns:w14="http://schemas.microsoft.com/office/word/2010/wordml" xmlns:w15="http://schemas.microsoft.com/office/word/2012/wordml" xmlns:w16se="http://schemas.microsoft.com/office/word/2015/wordml/symex" xmlns:wpg="http://schemas.microsoft.com/office/word/2010/wordprocessingGroup" xmlns:wpi="http://schemas.microsoft.com/office/word/2010/wordprocessingInk" xmlns:wne="http://schemas.microsoft.com/office/word/2006/wordml" xmlns:wps="http://schemas.microsoft.com/office/word/2010/wordprocessingShape" mc:Ignorable="w14 w15 w16se wp14">
+  <w:endnote w:type="separator" w:id="-1">
+    <w:p>
+      <w:pPr>
+        <w:spacing w:after="0" w:line="240" w:lineRule="auto"/>
+      </w:pPr>
+      <w:r>
+        <w:separator/>
+      </w:r>
+    </w:p>
+  </w:endnote>
+  <w:endnote w:type="continuationSeparator" w:id="0">
+    <w:p>
+      <w:pPr>
+        <w:spacing w:after="0" w:line="240" w:lineRule="auto"/>
+      </w:pPr>
+      <w:r>
+        <w:continuationSeparator/>
+      </w:r>
+    </w:p>
+  </w:endnote>
+</w:endnotes>
+</file>
+
+<file path=word/footnotes.xml><?xml version="1.0" encoding="utf-8"?>
+<w:footnotes xmlns:wpc="http://schemas.microsoft.com/office/word/2010/wordprocessingCanvas" xmlns:cx="http://schemas.microsoft.com/office/drawing/2014/chartex" xmlns:cx1="http://schemas.microsoft.com/office/drawing/2015/9/8/chartex" xmlns:mc="http://schemas.openxmlformats.org/markup-compatibility/2006" xmlns:o="urn:schemas-microsoft-com:office:office" xmlns:r="http://schemas.openxmlformats.org/officeDocument/2006/relationships" xmlns:m="http://schemas.openxmlformats.org/officeDocument/2006/math" xmlns:v="urn:schemas-microsoft-com:vml" xmlns:wp14="http://schemas.microsoft.com/office/word/2010/wordprocessingDrawing" xmlns:wp="http://schemas.openxmlformats.org/drawingml/2006/wordprocessingDrawing" xmlns:w10="urn:schemas-microsoft-com:office:word" xmlns:w="http://schemas.openxmlformats.org/wordprocessingml/2006/main" xmlns:w14="http://schemas.microsoft.com/office/word/2010/wordml" xmlns:w15="http://schemas.microsoft.com/office/word/2012/wordml" xmlns:w16se="http://schemas.microsoft.com/office/word/2015/wordml/symex" xmlns:wpg="http://schemas.microsoft.com/office/word/2010/wordprocessingGroup" xmlns:wpi="http://schemas.microsoft.com/office/word/2010/wordprocessingInk" xmlns:wne="http://schemas.microsoft.com/office/word/2006/wordml" xmlns:wps="http://schemas.microsoft.com/office/word/2010/wordprocessingShape" mc:Ignorable="w14 w15 w16se wp14">
+  <w:footnote w:type="separator" w:id="-1">
+    <w:p>
+      <w:pPr>
+        <w:spacing w:after="0" w:line="240" w:lineRule="auto"/>
+      </w:pPr>
+      <w:r>
+        <w:separator/>
+      </w:r>
+    </w:p>
+  </w:footnote>
+  <w:footnote w:type="continuationSeparator" w:id="0">
+    <w:p>
+      <w:pPr>
+        <w:spacing w:after="0" w:line="240" w:lineRule="auto"/>
+      </w:pPr>
+      <w:r>
+        <w:continuationSeparator/>
+      </w:r>
+    </w:p>
+  </w:footnote>
+</w:footnotes>
 </file>
 
 <file path=word/numbering.xml><?xml version="1.0" encoding="utf-8"?>
@@ -3785,8 +4999,160 @@
       </w:pPr>
     </w:lvl>
   </w:abstractNum>
+  <w:abstractNum w:abstractNumId="1" w15:restartNumberingAfterBreak="0">
+    <w:nsid w:val="439851ED"/>
+    <w:multiLevelType w:val="multilevel"/>
+    <w:tmpl w:val="77AC6FF6"/>
+    <w:lvl w:ilvl="0">
+      <w:start w:val="1"/>
+      <w:numFmt w:val="bullet"/>
+      <w:lvlText w:val=""/>
+      <w:lvlJc w:val="left"/>
+      <w:pPr>
+        <w:tabs>
+          <w:tab w:val="num" w:pos="720"/>
+        </w:tabs>
+        <w:ind w:left="720" w:hanging="360"/>
+      </w:pPr>
+      <w:rPr>
+        <w:rFonts w:ascii="Symbol" w:hAnsi="Symbol" w:hint="default"/>
+        <w:sz w:val="20"/>
+      </w:rPr>
+    </w:lvl>
+    <w:lvl w:ilvl="1" w:tentative="1">
+      <w:start w:val="1"/>
+      <w:numFmt w:val="bullet"/>
+      <w:lvlText w:val="o"/>
+      <w:lvlJc w:val="left"/>
+      <w:pPr>
+        <w:tabs>
+          <w:tab w:val="num" w:pos="1440"/>
+        </w:tabs>
+        <w:ind w:left="1440" w:hanging="360"/>
+      </w:pPr>
+      <w:rPr>
+        <w:rFonts w:ascii="Courier New" w:hAnsi="Courier New" w:hint="default"/>
+        <w:sz w:val="20"/>
+      </w:rPr>
+    </w:lvl>
+    <w:lvl w:ilvl="2" w:tentative="1">
+      <w:start w:val="1"/>
+      <w:numFmt w:val="bullet"/>
+      <w:lvlText w:val=""/>
+      <w:lvlJc w:val="left"/>
+      <w:pPr>
+        <w:tabs>
+          <w:tab w:val="num" w:pos="2160"/>
+        </w:tabs>
+        <w:ind w:left="2160" w:hanging="360"/>
+      </w:pPr>
+      <w:rPr>
+        <w:rFonts w:ascii="Wingdings" w:hAnsi="Wingdings" w:hint="default"/>
+        <w:sz w:val="20"/>
+      </w:rPr>
+    </w:lvl>
+    <w:lvl w:ilvl="3" w:tentative="1">
+      <w:start w:val="1"/>
+      <w:numFmt w:val="bullet"/>
+      <w:lvlText w:val=""/>
+      <w:lvlJc w:val="left"/>
+      <w:pPr>
+        <w:tabs>
+          <w:tab w:val="num" w:pos="2880"/>
+        </w:tabs>
+        <w:ind w:left="2880" w:hanging="360"/>
+      </w:pPr>
+      <w:rPr>
+        <w:rFonts w:ascii="Wingdings" w:hAnsi="Wingdings" w:hint="default"/>
+        <w:sz w:val="20"/>
+      </w:rPr>
+    </w:lvl>
+    <w:lvl w:ilvl="4" w:tentative="1">
+      <w:start w:val="1"/>
+      <w:numFmt w:val="bullet"/>
+      <w:lvlText w:val=""/>
+      <w:lvlJc w:val="left"/>
+      <w:pPr>
+        <w:tabs>
+          <w:tab w:val="num" w:pos="3600"/>
+        </w:tabs>
+        <w:ind w:left="3600" w:hanging="360"/>
+      </w:pPr>
+      <w:rPr>
+        <w:rFonts w:ascii="Wingdings" w:hAnsi="Wingdings" w:hint="default"/>
+        <w:sz w:val="20"/>
+      </w:rPr>
+    </w:lvl>
+    <w:lvl w:ilvl="5" w:tentative="1">
+      <w:start w:val="1"/>
+      <w:numFmt w:val="bullet"/>
+      <w:lvlText w:val=""/>
+      <w:lvlJc w:val="left"/>
+      <w:pPr>
+        <w:tabs>
+          <w:tab w:val="num" w:pos="4320"/>
+        </w:tabs>
+        <w:ind w:left="4320" w:hanging="360"/>
+      </w:pPr>
+      <w:rPr>
+        <w:rFonts w:ascii="Wingdings" w:hAnsi="Wingdings" w:hint="default"/>
+        <w:sz w:val="20"/>
+      </w:rPr>
+    </w:lvl>
+    <w:lvl w:ilvl="6" w:tentative="1">
+      <w:start w:val="1"/>
+      <w:numFmt w:val="bullet"/>
+      <w:lvlText w:val=""/>
+      <w:lvlJc w:val="left"/>
+      <w:pPr>
+        <w:tabs>
+          <w:tab w:val="num" w:pos="5040"/>
+        </w:tabs>
+        <w:ind w:left="5040" w:hanging="360"/>
+      </w:pPr>
+      <w:rPr>
+        <w:rFonts w:ascii="Wingdings" w:hAnsi="Wingdings" w:hint="default"/>
+        <w:sz w:val="20"/>
+      </w:rPr>
+    </w:lvl>
+    <w:lvl w:ilvl="7" w:tentative="1">
+      <w:start w:val="1"/>
+      <w:numFmt w:val="bullet"/>
+      <w:lvlText w:val=""/>
+      <w:lvlJc w:val="left"/>
+      <w:pPr>
+        <w:tabs>
+          <w:tab w:val="num" w:pos="5760"/>
+        </w:tabs>
+        <w:ind w:left="5760" w:hanging="360"/>
+      </w:pPr>
+      <w:rPr>
+        <w:rFonts w:ascii="Wingdings" w:hAnsi="Wingdings" w:hint="default"/>
+        <w:sz w:val="20"/>
+      </w:rPr>
+    </w:lvl>
+    <w:lvl w:ilvl="8" w:tentative="1">
+      <w:start w:val="1"/>
+      <w:numFmt w:val="bullet"/>
+      <w:lvlText w:val=""/>
+      <w:lvlJc w:val="left"/>
+      <w:pPr>
+        <w:tabs>
+          <w:tab w:val="num" w:pos="6480"/>
+        </w:tabs>
+        <w:ind w:left="6480" w:hanging="360"/>
+      </w:pPr>
+      <w:rPr>
+        <w:rFonts w:ascii="Wingdings" w:hAnsi="Wingdings" w:hint="default"/>
+        <w:sz w:val="20"/>
+      </w:rPr>
+    </w:lvl>
+  </w:abstractNum>
   <w:num w:numId="1">
     <w:abstractNumId w:val="0"/>
+  </w:num>
+  <w:num w:numId="2">
+    <w:abstractNumId w:val="1"/>
   </w:num>
 </w:numbering>
 </file>
@@ -4206,6 +5572,29 @@
       <w:szCs w:val="32"/>
     </w:rPr>
   </w:style>
+  <w:style w:type="paragraph" w:styleId="Heading2">
+    <w:name w:val="heading 2"/>
+    <w:basedOn w:val="Normal"/>
+    <w:next w:val="Normal"/>
+    <w:link w:val="Heading2Char"/>
+    <w:uiPriority w:val="9"/>
+    <w:semiHidden/>
+    <w:unhideWhenUsed/>
+    <w:qFormat/>
+    <w:rsid w:val="00A236E0"/>
+    <w:pPr>
+      <w:keepNext/>
+      <w:keepLines/>
+      <w:spacing w:before="40" w:after="0"/>
+      <w:outlineLvl w:val="1"/>
+    </w:pPr>
+    <w:rPr>
+      <w:rFonts w:asciiTheme="majorHAnsi" w:eastAsiaTheme="majorEastAsia" w:hAnsiTheme="majorHAnsi" w:cstheme="majorBidi"/>
+      <w:color w:val="2E74B5" w:themeColor="accent1" w:themeShade="BF"/>
+      <w:sz w:val="26"/>
+      <w:szCs w:val="26"/>
+    </w:rPr>
+  </w:style>
   <w:style w:type="character" w:default="1" w:styleId="DefaultParagraphFont">
     <w:name w:val="Default Paragraph Font"/>
     <w:uiPriority w:val="1"/>
@@ -4316,6 +5705,70 @@
       <w:sz w:val="20"/>
       <w:szCs w:val="20"/>
     </w:rPr>
+  </w:style>
+  <w:style w:type="paragraph" w:styleId="EndnoteText">
+    <w:name w:val="endnote text"/>
+    <w:basedOn w:val="Normal"/>
+    <w:link w:val="EndnoteTextChar"/>
+    <w:uiPriority w:val="99"/>
+    <w:semiHidden/>
+    <w:unhideWhenUsed/>
+    <w:rsid w:val="00A236E0"/>
+    <w:pPr>
+      <w:spacing w:after="0" w:line="240" w:lineRule="auto"/>
+    </w:pPr>
+    <w:rPr>
+      <w:sz w:val="20"/>
+      <w:szCs w:val="20"/>
+    </w:rPr>
+  </w:style>
+  <w:style w:type="character" w:customStyle="1" w:styleId="EndnoteTextChar">
+    <w:name w:val="Endnote Text Char"/>
+    <w:basedOn w:val="DefaultParagraphFont"/>
+    <w:link w:val="EndnoteText"/>
+    <w:uiPriority w:val="99"/>
+    <w:semiHidden/>
+    <w:rsid w:val="00A236E0"/>
+    <w:rPr>
+      <w:sz w:val="20"/>
+      <w:szCs w:val="20"/>
+    </w:rPr>
+  </w:style>
+  <w:style w:type="character" w:styleId="EndnoteReference">
+    <w:name w:val="endnote reference"/>
+    <w:basedOn w:val="DefaultParagraphFont"/>
+    <w:uiPriority w:val="99"/>
+    <w:semiHidden/>
+    <w:unhideWhenUsed/>
+    <w:rsid w:val="00A236E0"/>
+    <w:rPr>
+      <w:vertAlign w:val="superscript"/>
+    </w:rPr>
+  </w:style>
+  <w:style w:type="character" w:customStyle="1" w:styleId="Heading2Char">
+    <w:name w:val="Heading 2 Char"/>
+    <w:basedOn w:val="DefaultParagraphFont"/>
+    <w:link w:val="Heading2"/>
+    <w:uiPriority w:val="9"/>
+    <w:semiHidden/>
+    <w:rsid w:val="00A236E0"/>
+    <w:rPr>
+      <w:rFonts w:asciiTheme="majorHAnsi" w:eastAsiaTheme="majorEastAsia" w:hAnsiTheme="majorHAnsi" w:cstheme="majorBidi"/>
+      <w:color w:val="2E74B5" w:themeColor="accent1" w:themeShade="BF"/>
+      <w:sz w:val="26"/>
+      <w:szCs w:val="26"/>
+    </w:rPr>
+  </w:style>
+  <w:style w:type="paragraph" w:styleId="ListParagraph">
+    <w:name w:val="List Paragraph"/>
+    <w:basedOn w:val="Normal"/>
+    <w:uiPriority w:val="34"/>
+    <w:qFormat/>
+    <w:rsid w:val="00A236E0"/>
+    <w:pPr>
+      <w:ind w:left="720"/>
+      <w:contextualSpacing/>
+    </w:pPr>
   </w:style>
 </w:styles>
 </file>
@@ -4583,4 +6036,16 @@
     </a:ext>
   </a:extLst>
 </a:theme>
+</file>
+
+<file path=customXml/item1.xml><?xml version="1.0" encoding="utf-8"?>
+<b:Sources xmlns:b="http://schemas.openxmlformats.org/officeDocument/2006/bibliography" xmlns="http://schemas.openxmlformats.org/officeDocument/2006/bibliography" SelectedStyle="\APASixthEditionOfficeOnline.xsl" StyleName="APA" Version="6"/>
+</file>
+
+<file path=customXml/itemProps1.xml><?xml version="1.0" encoding="utf-8"?>
+<ds:datastoreItem xmlns:ds="http://schemas.openxmlformats.org/officeDocument/2006/customXml" ds:itemID="{C8BE9F3E-F5AD-4321-B715-925B56A5688A}">
+  <ds:schemaRefs>
+    <ds:schemaRef ds:uri="http://schemas.openxmlformats.org/officeDocument/2006/bibliography"/>
+  </ds:schemaRefs>
+</ds:datastoreItem>
 </file>
</xml_diff>

<commit_message>
compile opc ua lib. add opcua
</commit_message>
<xml_diff>
--- a/API Layer.docx
+++ b/API Layer.docx
@@ -5,6 +5,8 @@
     <w:p>
       <w:pPr>
         <w:rPr>
+          <w:rFonts w:hint="cs"/>
+          <w:rtl/>
           <w:lang w:bidi="fa-IR"/>
         </w:rPr>
       </w:pPr>
@@ -3962,16 +3964,15 @@
       <w:pPr>
         <w:bidi/>
         <w:rPr>
-          <w:rFonts w:hint="cs"/>
-          <w:rtl/>
-          <w:lang w:bidi="fa-IR"/>
-        </w:rPr>
-      </w:pPr>
-      <w:r>
-        <w:rPr>
-          <w:rFonts w:cs="Arial"/>
-          <w:rtl/>
-          <w:lang w:bidi="fa-IR"/>
+          <w:rtl/>
+          <w:lang w:bidi="fa-IR"/>
+        </w:rPr>
+      </w:pPr>
+      <w:r>
+        <w:rPr>
+          <w:rFonts w:cs="Arial"/>
+          <w:noProof/>
+          <w:rtl/>
         </w:rPr>
         <w:lastRenderedPageBreak/>
         <w:drawing>
@@ -4725,107 +4726,316 @@
           <w:rtl/>
           <w:lang w:bidi="fa-IR"/>
         </w:rPr>
-        <w:t xml:space="preserve">نصب </w:t>
-      </w:r>
-      <w:r>
-        <w:rPr>
-          <w:lang w:bidi="fa-IR"/>
-        </w:rPr>
-        <w:t>vcpkg</w:t>
-      </w:r>
-    </w:p>
-    <w:p>
-      <w:pPr>
-        <w:bidi/>
-        <w:rPr>
-          <w:lang w:bidi="fa-IR"/>
-        </w:rPr>
-      </w:pPr>
-      <w:r>
-        <w:rPr>
-          <w:lang w:bidi="fa-IR"/>
-        </w:rPr>
-        <w:t>git clone https://github.com/microsoft/vcpkg.git</w:t>
-      </w:r>
-    </w:p>
-    <w:p>
-      <w:pPr>
-        <w:bidi/>
-        <w:rPr>
-          <w:lang w:bidi="fa-IR"/>
-        </w:rPr>
-      </w:pPr>
-      <w:r>
-        <w:rPr>
-          <w:lang w:bidi="fa-IR"/>
-        </w:rPr>
-        <w:t>cd vcpkg</w:t>
-      </w:r>
-    </w:p>
-    <w:p>
-      <w:pPr>
-        <w:bidi/>
-        <w:rPr>
-          <w:lang w:bidi="fa-IR"/>
-        </w:rPr>
-      </w:pPr>
-      <w:r>
-        <w:rPr>
-          <w:lang w:bidi="fa-IR"/>
-        </w:rPr>
-        <w:t>bootstrap-vcpkg.bat</w:t>
-      </w:r>
-    </w:p>
-    <w:p>
-      <w:pPr>
-        <w:bidi/>
-        <w:rPr>
-          <w:lang w:bidi="fa-IR"/>
-        </w:rPr>
-      </w:pPr>
-      <w:r>
-        <w:rPr>
-          <w:lang w:bidi="fa-IR"/>
-        </w:rPr>
-        <w:t>vcpkg install open62541:x64-mingw-dynamic</w:t>
-      </w:r>
-    </w:p>
-    <w:p>
-      <w:pPr>
-        <w:bidi/>
-        <w:rPr>
-          <w:lang w:bidi="fa-IR"/>
-        </w:rPr>
-      </w:pPr>
-    </w:p>
-    <w:p>
-      <w:pPr>
-        <w:bidi/>
-        <w:rPr>
-          <w:lang w:bidi="fa-IR"/>
-        </w:rPr>
-      </w:pPr>
-      <w:r>
-        <w:rPr>
-          <w:lang w:bidi="fa-IR"/>
-        </w:rPr>
-        <w:t>https://github.com/open62541/open62541/releases</w:t>
-      </w:r>
-    </w:p>
-    <w:p>
-      <w:pPr>
-        <w:bidi/>
-        <w:rPr>
-          <w:rtl/>
-          <w:lang w:bidi="fa-IR"/>
-        </w:rPr>
-      </w:pPr>
-    </w:p>
-    <w:p>
-      <w:pPr>
-        <w:bidi/>
-        <w:rPr>
-          <w:rFonts w:hint="cs"/>
+        <w:t xml:space="preserve">بیلد </w:t>
+      </w:r>
+      <w:r>
+        <w:rPr>
+          <w:lang w:bidi="fa-IR"/>
+        </w:rPr>
+        <w:t xml:space="preserve">opc ua </w:t>
+      </w:r>
+    </w:p>
+    <w:p>
+      <w:pPr>
+        <w:bidi/>
+        <w:rPr>
+          <w:lang w:bidi="fa-IR"/>
+        </w:rPr>
+      </w:pPr>
+      <w:r>
+        <w:rPr>
+          <w:lang w:bidi="fa-IR"/>
+        </w:rPr>
+        <w:t>cd /d D:\Users\ISTAKIT\Desktop\SCADATest</w:t>
+      </w:r>
+    </w:p>
+    <w:p>
+      <w:pPr>
+        <w:bidi/>
+        <w:rPr>
+          <w:lang w:bidi="fa-IR"/>
+        </w:rPr>
+      </w:pPr>
+      <w:r>
+        <w:rPr>
+          <w:lang w:bidi="fa-IR"/>
+        </w:rPr>
+        <w:t>git clone --branch v1.1.6 --depth 1 https://github.com/open62541/open62541.git</w:t>
+      </w:r>
+    </w:p>
+    <w:p>
+      <w:pPr>
+        <w:bidi/>
+        <w:rPr>
+          <w:lang w:bidi="fa-IR"/>
+        </w:rPr>
+      </w:pPr>
+      <w:r>
+        <w:rPr>
+          <w:lang w:bidi="fa-IR"/>
+        </w:rPr>
+        <w:t>cd open62541</w:t>
+      </w:r>
+    </w:p>
+    <w:p>
+      <w:pPr>
+        <w:bidi/>
+        <w:rPr>
+          <w:lang w:bidi="fa-IR"/>
+        </w:rPr>
+      </w:pPr>
+      <w:r>
+        <w:rPr>
+          <w:lang w:bidi="fa-IR"/>
+        </w:rPr>
+        <w:t>mkdir build</w:t>
+      </w:r>
+    </w:p>
+    <w:p>
+      <w:pPr>
+        <w:bidi/>
+        <w:rPr>
+          <w:lang w:bidi="fa-IR"/>
+        </w:rPr>
+      </w:pPr>
+      <w:r>
+        <w:rPr>
+          <w:lang w:bidi="fa-IR"/>
+        </w:rPr>
+        <w:t>cd build</w:t>
+      </w:r>
+    </w:p>
+    <w:p>
+      <w:pPr>
+        <w:bidi/>
+        <w:rPr>
+          <w:lang w:bidi="fa-IR"/>
+        </w:rPr>
+      </w:pPr>
+    </w:p>
+    <w:p>
+      <w:pPr>
+        <w:bidi/>
+        <w:rPr>
+          <w:rFonts w:cs="Arial"/>
+          <w:lang w:bidi="fa-IR"/>
+        </w:rPr>
+      </w:pPr>
+      <w:r>
+        <w:rPr>
+          <w:lang w:bidi="fa-IR"/>
+        </w:rPr>
+        <w:lastRenderedPageBreak/>
+        <w:t>set PATH=E:\Qt\Qt5.12.9\Tools\mingw730_64\bin;%PATH</w:t>
+      </w:r>
+      <w:r>
+        <w:rPr>
+          <w:rFonts w:cs="Arial"/>
+          <w:rtl/>
+          <w:lang w:bidi="fa-IR"/>
+        </w:rPr>
+        <w:t>%</w:t>
+      </w:r>
+    </w:p>
+    <w:p>
+      <w:pPr>
+        <w:bidi/>
+        <w:rPr>
+          <w:rFonts w:cs="Arial"/>
+          <w:lang w:bidi="fa-IR"/>
+        </w:rPr>
+      </w:pPr>
+      <w:r>
+        <w:rPr>
+          <w:lang w:bidi="fa-IR"/>
+        </w:rPr>
+        <w:t>E:\Qt\Tools\CMake_64\bin\cmake.exe -G "MinGW Makefiles" -DCMAKE_BUILD_TYPE=Release -DBUILD_SHARED_LIBS=OFF -DUA_ENABLE_AMALGAMATION=ON -DUA_ENABLE_SUBSCRIPTIONS=ON -DUA_ENABLE_ENCRYPTION=OFF</w:t>
+      </w:r>
+      <w:r>
+        <w:rPr>
+          <w:rFonts w:cs="Arial"/>
+          <w:rtl/>
+          <w:lang w:bidi="fa-IR"/>
+        </w:rPr>
+        <w:t xml:space="preserve"> ..</w:t>
+      </w:r>
+    </w:p>
+    <w:p>
+      <w:pPr>
+        <w:bidi/>
+        <w:rPr>
+          <w:rFonts w:cs="Arial"/>
+          <w:lang w:bidi="fa-IR"/>
+        </w:rPr>
+      </w:pPr>
+    </w:p>
+    <w:p>
+      <w:pPr>
+        <w:bidi/>
+        <w:rPr>
+          <w:rFonts w:cs="Arial"/>
+          <w:lang w:bidi="fa-IR"/>
+        </w:rPr>
+      </w:pPr>
+    </w:p>
+    <w:p>
+      <w:pPr>
+        <w:bidi/>
+        <w:rPr>
+          <w:lang w:bidi="fa-IR"/>
+        </w:rPr>
+      </w:pPr>
+      <w:r>
+        <w:rPr>
+          <w:lang w:bidi="fa-IR"/>
+        </w:rPr>
+        <w:t>mkdir D:\Users\ISTAKIT\Desktop\SCADATest\Qt_base1\3rdparty\open62541</w:t>
+      </w:r>
+    </w:p>
+    <w:p>
+      <w:pPr>
+        <w:bidi/>
+        <w:rPr>
+          <w:lang w:bidi="fa-IR"/>
+        </w:rPr>
+      </w:pPr>
+      <w:r>
+        <w:rPr>
+          <w:lang w:bidi="fa-IR"/>
+        </w:rPr>
+        <w:t>copy open62541.c D:\Users\ISTAKIT\Desktop\SCADATest\Qt_base1\3rdparty\open62541</w:t>
+      </w:r>
+      <w:r>
+        <w:rPr>
+          <w:rFonts w:cs="Arial"/>
+          <w:rtl/>
+          <w:lang w:bidi="fa-IR"/>
+        </w:rPr>
+        <w:t>\</w:t>
+      </w:r>
+    </w:p>
+    <w:p>
+      <w:pPr>
+        <w:bidi/>
+        <w:rPr>
+          <w:rFonts w:cs="Arial"/>
+          <w:lang w:bidi="fa-IR"/>
+        </w:rPr>
+      </w:pPr>
+      <w:r>
+        <w:rPr>
+          <w:lang w:bidi="fa-IR"/>
+        </w:rPr>
+        <w:t>copy open62541.h D:\Users\ISTAKIT\Desktop\SCADATest\Qt_base1\3rdparty\open62541</w:t>
+      </w:r>
+      <w:r>
+        <w:rPr>
+          <w:rFonts w:cs="Arial"/>
+          <w:rtl/>
+          <w:lang w:bidi="fa-IR"/>
+        </w:rPr>
+        <w:t>\</w:t>
+      </w:r>
+    </w:p>
+    <w:p>
+      <w:pPr>
+        <w:bidi/>
+        <w:rPr>
+          <w:rFonts w:cs="Arial"/>
+          <w:lang w:bidi="fa-IR"/>
+        </w:rPr>
+      </w:pPr>
+    </w:p>
+    <w:p>
+      <w:pPr>
+        <w:bidi/>
+        <w:rPr>
+          <w:rFonts w:cs="Arial"/>
+          <w:lang w:bidi="fa-IR"/>
+        </w:rPr>
+      </w:pPr>
+    </w:p>
+    <w:p>
+      <w:pPr>
+        <w:bidi/>
+        <w:rPr>
+          <w:rFonts w:cs="Arial"/>
+          <w:lang w:bidi="fa-IR"/>
+        </w:rPr>
+      </w:pPr>
+      <w:bookmarkStart w:id="0" w:name="_GoBack"/>
+      <w:bookmarkEnd w:id="0"/>
+      <w:r>
+        <w:rPr>
+          <w:rFonts w:cs="Arial" w:hint="cs"/>
+          <w:rtl/>
+          <w:lang w:bidi="fa-IR"/>
+        </w:rPr>
+        <w:t xml:space="preserve">در </w:t>
+      </w:r>
+      <w:r>
+        <w:rPr>
+          <w:rFonts w:cs="Arial"/>
+          <w:lang w:bidi="fa-IR"/>
+        </w:rPr>
+        <w:t>.pro</w:t>
+      </w:r>
+    </w:p>
+    <w:p>
+      <w:pPr>
+        <w:bidi/>
+        <w:rPr>
+          <w:lang w:bidi="fa-IR"/>
+        </w:rPr>
+      </w:pPr>
+      <w:r>
+        <w:rPr>
+          <w:lang w:bidi="fa-IR"/>
+        </w:rPr>
+        <w:t>INCLUDEPATH += 3rdparty/open62541</w:t>
+      </w:r>
+    </w:p>
+    <w:p>
+      <w:pPr>
+        <w:bidi/>
+        <w:rPr>
+          <w:lang w:bidi="fa-IR"/>
+        </w:rPr>
+      </w:pPr>
+      <w:r>
+        <w:rPr>
+          <w:lang w:bidi="fa-IR"/>
+        </w:rPr>
+        <w:t>SOURCES += 3rdparty/open62541/open62541.c</w:t>
+      </w:r>
+    </w:p>
+    <w:p>
+      <w:pPr>
+        <w:bidi/>
+        <w:rPr>
+          <w:lang w:bidi="fa-IR"/>
+        </w:rPr>
+      </w:pPr>
+      <w:r>
+        <w:rPr>
+          <w:lang w:bidi="fa-IR"/>
+        </w:rPr>
+        <w:t>LIBS += -lws2_32</w:t>
+      </w:r>
+    </w:p>
+    <w:p>
+      <w:pPr>
+        <w:bidi/>
+        <w:rPr>
+          <w:rtl/>
+          <w:lang w:bidi="fa-IR"/>
+        </w:rPr>
+      </w:pPr>
+    </w:p>
+    <w:p>
+      <w:pPr>
+        <w:bidi/>
+        <w:rPr>
           <w:rtl/>
           <w:lang w:bidi="fa-IR"/>
         </w:rPr>
@@ -5340,6 +5550,7 @@
           <w:sz w:val="24"/>
           <w:szCs w:val="24"/>
         </w:rPr>
+        <w:lastRenderedPageBreak/>
         <w:t>cpp</w:t>
       </w:r>
     </w:p>
@@ -6003,6 +6214,7 @@
           <w:rtl/>
           <w:lang w:bidi="fa-IR"/>
         </w:rPr>
+        <w:lastRenderedPageBreak/>
         <w:t xml:space="preserve">    </w:t>
       </w:r>
       <w:r>
@@ -6409,301 +6621,301 @@
           <w:rtl/>
           <w:lang w:bidi="fa-IR"/>
         </w:rPr>
+        <w:t xml:space="preserve">    '</w:t>
+      </w:r>
+      <w:r>
+        <w:rPr>
+          <w:lang w:bidi="fa-IR"/>
+        </w:rPr>
+        <w:t>float</w:t>
+      </w:r>
+      <w:r>
+        <w:rPr>
+          <w:rFonts w:cs="Arial"/>
+          <w:rtl/>
+          <w:lang w:bidi="fa-IR"/>
+        </w:rPr>
+        <w:t>',</w:t>
+      </w:r>
+    </w:p>
+    <w:p>
+      <w:pPr>
+        <w:bidi/>
+        <w:rPr>
+          <w:lang w:bidi="fa-IR"/>
+        </w:rPr>
+      </w:pPr>
+      <w:r>
+        <w:rPr>
+          <w:rFonts w:cs="Arial"/>
+          <w:rtl/>
+          <w:lang w:bidi="fa-IR"/>
+        </w:rPr>
+        <w:t xml:space="preserve">    '</w:t>
+      </w:r>
+      <w:r>
+        <w:rPr>
+          <w:lang w:bidi="fa-IR"/>
+        </w:rPr>
+        <w:t>C</w:t>
+      </w:r>
+      <w:r>
+        <w:rPr>
+          <w:rFonts w:cs="Arial"/>
+          <w:rtl/>
+          <w:lang w:bidi="fa-IR"/>
+        </w:rPr>
+        <w:t>',</w:t>
+      </w:r>
+    </w:p>
+    <w:p>
+      <w:pPr>
+        <w:bidi/>
+        <w:rPr>
+          <w:lang w:bidi="fa-IR"/>
+        </w:rPr>
+      </w:pPr>
+      <w:r>
+        <w:rPr>
+          <w:rFonts w:cs="Arial"/>
+          <w:rtl/>
+          <w:lang w:bidi="fa-IR"/>
+        </w:rPr>
+        <w:t xml:space="preserve">    -20,</w:t>
+      </w:r>
+    </w:p>
+    <w:p>
+      <w:pPr>
+        <w:bidi/>
+        <w:rPr>
+          <w:lang w:bidi="fa-IR"/>
+        </w:rPr>
+      </w:pPr>
+      <w:r>
+        <w:rPr>
+          <w:rFonts w:cs="Arial"/>
+          <w:rtl/>
+          <w:lang w:bidi="fa-IR"/>
+        </w:rPr>
+        <w:t xml:space="preserve">    100,</w:t>
+      </w:r>
+    </w:p>
+    <w:p>
+      <w:pPr>
+        <w:bidi/>
+        <w:rPr>
+          <w:lang w:bidi="fa-IR"/>
+        </w:rPr>
+      </w:pPr>
+      <w:r>
+        <w:rPr>
+          <w:rFonts w:cs="Arial"/>
+          <w:rtl/>
+          <w:lang w:bidi="fa-IR"/>
+        </w:rPr>
+        <w:t xml:space="preserve">    -20,</w:t>
+      </w:r>
+    </w:p>
+    <w:p>
+      <w:pPr>
+        <w:bidi/>
+        <w:rPr>
+          <w:lang w:bidi="fa-IR"/>
+        </w:rPr>
+      </w:pPr>
+      <w:r>
+        <w:rPr>
+          <w:rFonts w:cs="Arial"/>
+          <w:rtl/>
+          <w:lang w:bidi="fa-IR"/>
+        </w:rPr>
+        <w:t xml:space="preserve">    100,</w:t>
+      </w:r>
+    </w:p>
+    <w:p>
+      <w:pPr>
+        <w:bidi/>
+        <w:rPr>
+          <w:lang w:bidi="fa-IR"/>
+        </w:rPr>
+      </w:pPr>
+      <w:r>
+        <w:rPr>
+          <w:rFonts w:cs="Arial"/>
+          <w:rtl/>
+          <w:lang w:bidi="fa-IR"/>
+        </w:rPr>
+        <w:t xml:space="preserve">    '</w:t>
+      </w:r>
+      <w:r>
+        <w:rPr>
+          <w:lang w:bidi="fa-IR"/>
+        </w:rPr>
+        <w:t>linear</w:t>
+      </w:r>
+      <w:r>
+        <w:rPr>
+          <w:rFonts w:cs="Arial"/>
+          <w:rtl/>
+          <w:lang w:bidi="fa-IR"/>
+        </w:rPr>
+        <w:t>',</w:t>
+      </w:r>
+    </w:p>
+    <w:p>
+      <w:pPr>
+        <w:bidi/>
+        <w:rPr>
+          <w:lang w:bidi="fa-IR"/>
+        </w:rPr>
+      </w:pPr>
+      <w:r>
+        <w:rPr>
+          <w:rFonts w:cs="Arial"/>
+          <w:rtl/>
+          <w:lang w:bidi="fa-IR"/>
+        </w:rPr>
+        <w:t xml:space="preserve">    1.0,</w:t>
+      </w:r>
+    </w:p>
+    <w:p>
+      <w:pPr>
+        <w:bidi/>
+        <w:rPr>
+          <w:lang w:bidi="fa-IR"/>
+        </w:rPr>
+      </w:pPr>
+      <w:r>
+        <w:rPr>
+          <w:rFonts w:cs="Arial"/>
+          <w:rtl/>
+          <w:lang w:bidi="fa-IR"/>
+        </w:rPr>
+        <w:t xml:space="preserve">    0.0,</w:t>
+      </w:r>
+    </w:p>
+    <w:p>
+      <w:pPr>
+        <w:bidi/>
+        <w:rPr>
+          <w:lang w:bidi="fa-IR"/>
+        </w:rPr>
+      </w:pPr>
+      <w:r>
+        <w:rPr>
+          <w:rFonts w:cs="Arial"/>
+          <w:rtl/>
+          <w:lang w:bidi="fa-IR"/>
+        </w:rPr>
+        <w:t xml:space="preserve">    0.1,</w:t>
+      </w:r>
+    </w:p>
+    <w:p>
+      <w:pPr>
+        <w:bidi/>
+        <w:rPr>
+          <w:lang w:bidi="fa-IR"/>
+        </w:rPr>
+      </w:pPr>
+      <w:r>
+        <w:rPr>
+          <w:rFonts w:cs="Arial"/>
+          <w:rtl/>
+          <w:lang w:bidi="fa-IR"/>
+        </w:rPr>
+        <w:t xml:space="preserve">    0.1,</w:t>
+      </w:r>
+    </w:p>
+    <w:p>
+      <w:pPr>
+        <w:bidi/>
+        <w:rPr>
+          <w:lang w:bidi="fa-IR"/>
+        </w:rPr>
+      </w:pPr>
+      <w:r>
+        <w:rPr>
+          <w:rFonts w:cs="Arial"/>
+          <w:rtl/>
+          <w:lang w:bidi="fa-IR"/>
+        </w:rPr>
+        <w:t xml:space="preserve">    '</w:t>
+      </w:r>
+      <w:r>
+        <w:rPr>
+          <w:lang w:bidi="fa-IR"/>
+        </w:rPr>
+        <w:t>none</w:t>
+      </w:r>
+      <w:r>
+        <w:rPr>
+          <w:rFonts w:cs="Arial"/>
+          <w:rtl/>
+          <w:lang w:bidi="fa-IR"/>
+        </w:rPr>
+        <w:t>',</w:t>
+      </w:r>
+    </w:p>
+    <w:p>
+      <w:pPr>
+        <w:bidi/>
+        <w:rPr>
+          <w:lang w:bidi="fa-IR"/>
+        </w:rPr>
+      </w:pPr>
+      <w:r>
+        <w:rPr>
+          <w:rFonts w:cs="Arial"/>
+          <w:rtl/>
+          <w:lang w:bidi="fa-IR"/>
+        </w:rPr>
+        <w:t xml:space="preserve">    '{}',</w:t>
+      </w:r>
+    </w:p>
+    <w:p>
+      <w:pPr>
+        <w:bidi/>
+        <w:rPr>
+          <w:lang w:bidi="fa-IR"/>
+        </w:rPr>
+      </w:pPr>
+      <w:r>
+        <w:rPr>
+          <w:rFonts w:cs="Arial"/>
+          <w:rtl/>
+          <w:lang w:bidi="fa-IR"/>
+        </w:rPr>
+        <w:t xml:space="preserve">    </w:t>
+      </w:r>
+      <w:r>
+        <w:rPr>
+          <w:lang w:bidi="fa-IR"/>
+        </w:rPr>
+        <w:t>TRUE</w:t>
+      </w:r>
+      <w:r>
+        <w:rPr>
+          <w:rFonts w:cs="Arial"/>
+          <w:rtl/>
+          <w:lang w:bidi="fa-IR"/>
+        </w:rPr>
+        <w:t>,</w:t>
+      </w:r>
+    </w:p>
+    <w:p>
+      <w:pPr>
+        <w:bidi/>
+        <w:rPr>
+          <w:lang w:bidi="fa-IR"/>
+        </w:rPr>
+      </w:pPr>
+      <w:r>
+        <w:rPr>
+          <w:rFonts w:cs="Arial"/>
+          <w:rtl/>
+          <w:lang w:bidi="fa-IR"/>
+        </w:rPr>
         <w:lastRenderedPageBreak/>
-        <w:t xml:space="preserve">    '</w:t>
-      </w:r>
-      <w:r>
-        <w:rPr>
-          <w:lang w:bidi="fa-IR"/>
-        </w:rPr>
-        <w:t>float</w:t>
-      </w:r>
-      <w:r>
-        <w:rPr>
-          <w:rFonts w:cs="Arial"/>
-          <w:rtl/>
-          <w:lang w:bidi="fa-IR"/>
-        </w:rPr>
-        <w:t>',</w:t>
-      </w:r>
-    </w:p>
-    <w:p>
-      <w:pPr>
-        <w:bidi/>
-        <w:rPr>
-          <w:lang w:bidi="fa-IR"/>
-        </w:rPr>
-      </w:pPr>
-      <w:r>
-        <w:rPr>
-          <w:rFonts w:cs="Arial"/>
-          <w:rtl/>
-          <w:lang w:bidi="fa-IR"/>
-        </w:rPr>
-        <w:t xml:space="preserve">    '</w:t>
-      </w:r>
-      <w:r>
-        <w:rPr>
-          <w:lang w:bidi="fa-IR"/>
-        </w:rPr>
-        <w:t>C</w:t>
-      </w:r>
-      <w:r>
-        <w:rPr>
-          <w:rFonts w:cs="Arial"/>
-          <w:rtl/>
-          <w:lang w:bidi="fa-IR"/>
-        </w:rPr>
-        <w:t>',</w:t>
-      </w:r>
-    </w:p>
-    <w:p>
-      <w:pPr>
-        <w:bidi/>
-        <w:rPr>
-          <w:lang w:bidi="fa-IR"/>
-        </w:rPr>
-      </w:pPr>
-      <w:r>
-        <w:rPr>
-          <w:rFonts w:cs="Arial"/>
-          <w:rtl/>
-          <w:lang w:bidi="fa-IR"/>
-        </w:rPr>
-        <w:t xml:space="preserve">    -20,</w:t>
-      </w:r>
-    </w:p>
-    <w:p>
-      <w:pPr>
-        <w:bidi/>
-        <w:rPr>
-          <w:lang w:bidi="fa-IR"/>
-        </w:rPr>
-      </w:pPr>
-      <w:r>
-        <w:rPr>
-          <w:rFonts w:cs="Arial"/>
-          <w:rtl/>
-          <w:lang w:bidi="fa-IR"/>
-        </w:rPr>
-        <w:t xml:space="preserve">    100,</w:t>
-      </w:r>
-    </w:p>
-    <w:p>
-      <w:pPr>
-        <w:bidi/>
-        <w:rPr>
-          <w:lang w:bidi="fa-IR"/>
-        </w:rPr>
-      </w:pPr>
-      <w:r>
-        <w:rPr>
-          <w:rFonts w:cs="Arial"/>
-          <w:rtl/>
-          <w:lang w:bidi="fa-IR"/>
-        </w:rPr>
-        <w:t xml:space="preserve">    -20,</w:t>
-      </w:r>
-    </w:p>
-    <w:p>
-      <w:pPr>
-        <w:bidi/>
-        <w:rPr>
-          <w:lang w:bidi="fa-IR"/>
-        </w:rPr>
-      </w:pPr>
-      <w:r>
-        <w:rPr>
-          <w:rFonts w:cs="Arial"/>
-          <w:rtl/>
-          <w:lang w:bidi="fa-IR"/>
-        </w:rPr>
-        <w:t xml:space="preserve">    100,</w:t>
-      </w:r>
-    </w:p>
-    <w:p>
-      <w:pPr>
-        <w:bidi/>
-        <w:rPr>
-          <w:lang w:bidi="fa-IR"/>
-        </w:rPr>
-      </w:pPr>
-      <w:r>
-        <w:rPr>
-          <w:rFonts w:cs="Arial"/>
-          <w:rtl/>
-          <w:lang w:bidi="fa-IR"/>
-        </w:rPr>
-        <w:t xml:space="preserve">    '</w:t>
-      </w:r>
-      <w:r>
-        <w:rPr>
-          <w:lang w:bidi="fa-IR"/>
-        </w:rPr>
-        <w:t>linear</w:t>
-      </w:r>
-      <w:r>
-        <w:rPr>
-          <w:rFonts w:cs="Arial"/>
-          <w:rtl/>
-          <w:lang w:bidi="fa-IR"/>
-        </w:rPr>
-        <w:t>',</w:t>
-      </w:r>
-    </w:p>
-    <w:p>
-      <w:pPr>
-        <w:bidi/>
-        <w:rPr>
-          <w:lang w:bidi="fa-IR"/>
-        </w:rPr>
-      </w:pPr>
-      <w:r>
-        <w:rPr>
-          <w:rFonts w:cs="Arial"/>
-          <w:rtl/>
-          <w:lang w:bidi="fa-IR"/>
-        </w:rPr>
-        <w:t xml:space="preserve">    1.0,</w:t>
-      </w:r>
-    </w:p>
-    <w:p>
-      <w:pPr>
-        <w:bidi/>
-        <w:rPr>
-          <w:lang w:bidi="fa-IR"/>
-        </w:rPr>
-      </w:pPr>
-      <w:r>
-        <w:rPr>
-          <w:rFonts w:cs="Arial"/>
-          <w:rtl/>
-          <w:lang w:bidi="fa-IR"/>
-        </w:rPr>
-        <w:t xml:space="preserve">    0.0,</w:t>
-      </w:r>
-    </w:p>
-    <w:p>
-      <w:pPr>
-        <w:bidi/>
-        <w:rPr>
-          <w:lang w:bidi="fa-IR"/>
-        </w:rPr>
-      </w:pPr>
-      <w:r>
-        <w:rPr>
-          <w:rFonts w:cs="Arial"/>
-          <w:rtl/>
-          <w:lang w:bidi="fa-IR"/>
-        </w:rPr>
-        <w:t xml:space="preserve">    0.1,</w:t>
-      </w:r>
-    </w:p>
-    <w:p>
-      <w:pPr>
-        <w:bidi/>
-        <w:rPr>
-          <w:lang w:bidi="fa-IR"/>
-        </w:rPr>
-      </w:pPr>
-      <w:r>
-        <w:rPr>
-          <w:rFonts w:cs="Arial"/>
-          <w:rtl/>
-          <w:lang w:bidi="fa-IR"/>
-        </w:rPr>
-        <w:t xml:space="preserve">    0.1,</w:t>
-      </w:r>
-    </w:p>
-    <w:p>
-      <w:pPr>
-        <w:bidi/>
-        <w:rPr>
-          <w:lang w:bidi="fa-IR"/>
-        </w:rPr>
-      </w:pPr>
-      <w:r>
-        <w:rPr>
-          <w:rFonts w:cs="Arial"/>
-          <w:rtl/>
-          <w:lang w:bidi="fa-IR"/>
-        </w:rPr>
-        <w:t xml:space="preserve">    '</w:t>
-      </w:r>
-      <w:r>
-        <w:rPr>
-          <w:lang w:bidi="fa-IR"/>
-        </w:rPr>
-        <w:t>none</w:t>
-      </w:r>
-      <w:r>
-        <w:rPr>
-          <w:rFonts w:cs="Arial"/>
-          <w:rtl/>
-          <w:lang w:bidi="fa-IR"/>
-        </w:rPr>
-        <w:t>',</w:t>
-      </w:r>
-    </w:p>
-    <w:p>
-      <w:pPr>
-        <w:bidi/>
-        <w:rPr>
-          <w:lang w:bidi="fa-IR"/>
-        </w:rPr>
-      </w:pPr>
-      <w:r>
-        <w:rPr>
-          <w:rFonts w:cs="Arial"/>
-          <w:rtl/>
-          <w:lang w:bidi="fa-IR"/>
-        </w:rPr>
-        <w:t xml:space="preserve">    '{}',</w:t>
-      </w:r>
-    </w:p>
-    <w:p>
-      <w:pPr>
-        <w:bidi/>
-        <w:rPr>
-          <w:lang w:bidi="fa-IR"/>
-        </w:rPr>
-      </w:pPr>
-      <w:r>
-        <w:rPr>
-          <w:rFonts w:cs="Arial"/>
-          <w:rtl/>
-          <w:lang w:bidi="fa-IR"/>
-        </w:rPr>
-        <w:t xml:space="preserve">    </w:t>
-      </w:r>
-      <w:r>
-        <w:rPr>
-          <w:lang w:bidi="fa-IR"/>
-        </w:rPr>
-        <w:t>TRUE</w:t>
-      </w:r>
-      <w:r>
-        <w:rPr>
-          <w:rFonts w:cs="Arial"/>
-          <w:rtl/>
-          <w:lang w:bidi="fa-IR"/>
-        </w:rPr>
-        <w:t>,</w:t>
-      </w:r>
-    </w:p>
-    <w:p>
-      <w:pPr>
-        <w:bidi/>
-        <w:rPr>
-          <w:lang w:bidi="fa-IR"/>
-        </w:rPr>
-      </w:pPr>
-      <w:r>
-        <w:rPr>
-          <w:rFonts w:cs="Arial"/>
-          <w:rtl/>
-          <w:lang w:bidi="fa-IR"/>
-        </w:rPr>
         <w:t xml:space="preserve">    '{"</w:t>
       </w:r>
       <w:r>
@@ -6921,10 +7133,9 @@
       <w:r>
         <w:rPr>
           <w:rFonts w:cs="Arial"/>
-          <w:rtl/>
-          <w:lang w:bidi="fa-IR"/>
-        </w:rPr>
-        <w:lastRenderedPageBreak/>
+          <w:noProof/>
+          <w:rtl/>
+        </w:rPr>
         <w:drawing>
           <wp:inline distT="0" distB="0" distL="0" distR="0" wp14:anchorId="26F694C3" wp14:editId="3D1E5C2B">
             <wp:extent cx="5943600" cy="1955800"/>
@@ -6982,8 +7193,8 @@
       <w:r>
         <w:rPr>
           <w:rFonts w:cs="Arial"/>
-          <w:rtl/>
-          <w:lang w:bidi="fa-IR"/>
+          <w:noProof/>
+          <w:rtl/>
         </w:rPr>
         <w:drawing>
           <wp:inline distT="0" distB="0" distL="0" distR="0" wp14:anchorId="71056B0F" wp14:editId="046FA70A">
@@ -7044,13 +7255,11 @@
       <w:pPr>
         <w:bidi/>
         <w:rPr>
-          <w:rFonts w:cs="Arial" w:hint="cs"/>
-          <w:rtl/>
-          <w:lang w:bidi="fa-IR"/>
-        </w:rPr>
-      </w:pPr>
-      <w:bookmarkStart w:id="0" w:name="_GoBack"/>
-      <w:bookmarkEnd w:id="0"/>
+          <w:rFonts w:cs="Arial"/>
+          <w:rtl/>
+          <w:lang w:bidi="fa-IR"/>
+        </w:rPr>
+      </w:pPr>
     </w:p>
     <w:p>
       <w:pPr>
@@ -8343,7 +8552,7 @@
 </file>
 
 <file path=customXml/itemProps1.xml><?xml version="1.0" encoding="utf-8"?>
-<ds:datastoreItem xmlns:ds="http://schemas.openxmlformats.org/officeDocument/2006/customXml" ds:itemID="{FDD5682B-B4AD-4EA4-849A-0A5E5E0CFB8A}">
+<ds:datastoreItem xmlns:ds="http://schemas.openxmlformats.org/officeDocument/2006/customXml" ds:itemID="{C8DD77F3-D093-4A8F-8A0E-8129686A10F5}">
   <ds:schemaRefs>
     <ds:schemaRef ds:uri="http://schemas.openxmlformats.org/officeDocument/2006/bibliography"/>
   </ds:schemaRefs>

</xml_diff>

<commit_message>
fix start stop drivers
</commit_message>
<xml_diff>
--- a/API Layer.docx
+++ b/API Layer.docx
@@ -4963,8 +4963,6 @@
           <w:lang w:bidi="fa-IR"/>
         </w:rPr>
       </w:pPr>
-      <w:bookmarkStart w:id="0" w:name="_GoBack"/>
-      <w:bookmarkEnd w:id="0"/>
       <w:r>
         <w:rPr>
           <w:rFonts w:cs="Arial" w:hint="cs"/>
@@ -7275,52 +7273,3839 @@
         <w:bidi/>
         <w:rPr>
           <w:rtl/>
-          <w:lang w:bidi="fa-IR"/>
-        </w:rPr>
-      </w:pPr>
-    </w:p>
-    <w:p>
-      <w:pPr>
-        <w:bidi/>
-        <w:rPr>
-          <w:rtl/>
-          <w:lang w:bidi="fa-IR"/>
-        </w:rPr>
-      </w:pPr>
-    </w:p>
-    <w:p>
-      <w:pPr>
-        <w:bidi/>
-        <w:rPr>
-          <w:rtl/>
-          <w:lang w:bidi="fa-IR"/>
-        </w:rPr>
-      </w:pPr>
-    </w:p>
-    <w:p>
-      <w:pPr>
-        <w:bidi/>
-        <w:rPr>
-          <w:rtl/>
-          <w:lang w:bidi="fa-IR"/>
-        </w:rPr>
-      </w:pPr>
-    </w:p>
-    <w:p>
-      <w:pPr>
-        <w:bidi/>
-        <w:rPr>
-          <w:lang w:bidi="fa-IR"/>
-        </w:rPr>
-      </w:pPr>
-    </w:p>
-    <w:p>
-      <w:pPr>
-        <w:bidi/>
-        <w:rPr>
-          <w:lang w:bidi="fa-IR"/>
-        </w:rPr>
-      </w:pPr>
+        </w:rPr>
+      </w:pPr>
+      <w:r>
+        <w:rPr>
+          <w:rStyle w:val="qwen-markdown-text"/>
+          <w:rFonts w:ascii="Arial" w:hAnsi="Arial" w:cs="Arial"/>
+          <w:color w:val="F7F8FC"/>
+          <w:bdr w:val="single" w:sz="2" w:space="0" w:color="E3E3E3" w:frame="1"/>
+          <w:shd w:val="clear" w:color="auto" w:fill="232326"/>
+        </w:rPr>
+        <w:lastRenderedPageBreak/>
+        <w:t xml:space="preserve">build </w:t>
+      </w:r>
+      <w:r>
+        <w:rPr>
+          <w:rtl/>
+        </w:rPr>
+        <w:t>بگیر. اگر خطای</w:t>
+      </w:r>
+      <w:r>
+        <w:t xml:space="preserve"> link </w:t>
+      </w:r>
+      <w:r>
+        <w:rPr>
+          <w:rtl/>
+        </w:rPr>
+        <w:t>یا</w:t>
+      </w:r>
+      <w:r>
+        <w:t xml:space="preserve"> compile </w:t>
+      </w:r>
+      <w:r>
+        <w:rPr>
+          <w:rtl/>
+        </w:rPr>
+        <w:t>دیدی</w:t>
+      </w:r>
+      <w:r>
+        <w:t xml:space="preserve"> (</w:t>
+      </w:r>
+      <w:r>
+        <w:rPr>
+          <w:rtl/>
+        </w:rPr>
+        <w:t>مثلاً</w:t>
+      </w:r>
+      <w:r>
+        <w:t xml:space="preserve"> undefined reference)</w:t>
+      </w:r>
+      <w:r>
+        <w:rPr>
+          <w:rtl/>
+        </w:rPr>
+        <w:t>، متن کامل را بفرست. برای تست می‌توانی یک سرور</w:t>
+      </w:r>
+      <w:r>
+        <w:t xml:space="preserve"> OPC UA </w:t>
+      </w:r>
+      <w:r>
+        <w:rPr>
+          <w:rtl/>
+        </w:rPr>
+        <w:t xml:space="preserve">رایگان مثل </w:t>
+      </w:r>
+      <w:r>
+        <w:t xml:space="preserve">Prosys OPC UA Simulation Server </w:t>
+      </w:r>
+      <w:r>
+        <w:rPr>
+          <w:rtl/>
+        </w:rPr>
+        <w:t>یا سرور نمونه خود</w:t>
+      </w:r>
+      <w:r>
+        <w:t xml:space="preserve"> open62541 (open62541/build/bin/) </w:t>
+      </w:r>
+      <w:r>
+        <w:rPr>
+          <w:rtl/>
+        </w:rPr>
+        <w:t>را اجرا کنی</w:t>
+      </w:r>
+      <w:r>
+        <w:t>.</w:t>
+      </w:r>
+    </w:p>
+    <w:p>
+      <w:pPr>
+        <w:bidi/>
+        <w:rPr>
+          <w:rtl/>
+        </w:rPr>
+      </w:pPr>
+    </w:p>
+    <w:p>
+      <w:pPr>
+        <w:bidi/>
+        <w:rPr>
+          <w:rFonts w:hint="cs"/>
+          <w:rtl/>
+          <w:lang w:bidi="fa-IR"/>
+        </w:rPr>
+      </w:pPr>
+      <w:r>
+        <w:rPr>
+          <w:rFonts w:hint="cs"/>
+          <w:rtl/>
+          <w:lang w:bidi="fa-IR"/>
+        </w:rPr>
+        <w:t>کامپال سرور تست</w:t>
+      </w:r>
+    </w:p>
+    <w:p>
+      <w:pPr>
+        <w:bidi/>
+        <w:rPr>
+          <w:lang w:bidi="fa-IR"/>
+        </w:rPr>
+      </w:pPr>
+      <w:r>
+        <w:rPr>
+          <w:lang w:bidi="fa-IR"/>
+        </w:rPr>
+        <w:t>cd /d D:\Users\ISTAKIT\Desktop\SCADATest\Qt_base1</w:t>
+      </w:r>
+    </w:p>
+    <w:p>
+      <w:pPr>
+        <w:bidi/>
+        <w:rPr>
+          <w:rtl/>
+          <w:lang w:bidi="fa-IR"/>
+        </w:rPr>
+      </w:pPr>
+      <w:r>
+        <w:rPr>
+          <w:lang w:bidi="fa-IR"/>
+        </w:rPr>
+        <w:t>E:\Qt\Qt5.12.9\Tools\mingw730_64\bin\gcc.exe -O2 test_server.c 3rdparty\open62541\open62541.c -I3rdparty\open62541 -lws2_32 -o test_server.exe</w:t>
+      </w:r>
+    </w:p>
+    <w:p>
+      <w:pPr>
+        <w:bidi/>
+        <w:rPr>
+          <w:rtl/>
+          <w:lang w:bidi="fa-IR"/>
+        </w:rPr>
+      </w:pPr>
+    </w:p>
+    <w:p>
+      <w:pPr>
+        <w:bidi/>
+        <w:rPr>
+          <w:lang w:bidi="fa-IR"/>
+        </w:rPr>
+      </w:pPr>
+      <w:r>
+        <w:rPr>
+          <w:rFonts w:cs="Arial"/>
+          <w:rtl/>
+          <w:lang w:bidi="fa-IR"/>
+        </w:rPr>
+        <w:t>-- فعال کردن درا</w:t>
+      </w:r>
+      <w:r>
+        <w:rPr>
+          <w:rFonts w:cs="Arial" w:hint="cs"/>
+          <w:rtl/>
+          <w:lang w:bidi="fa-IR"/>
+        </w:rPr>
+        <w:t>ی</w:t>
+      </w:r>
+      <w:r>
+        <w:rPr>
+          <w:rFonts w:cs="Arial" w:hint="eastAsia"/>
+          <w:rtl/>
+          <w:lang w:bidi="fa-IR"/>
+        </w:rPr>
+        <w:t>ور</w:t>
+      </w:r>
+      <w:r>
+        <w:rPr>
+          <w:rFonts w:cs="Arial"/>
+          <w:rtl/>
+          <w:lang w:bidi="fa-IR"/>
+        </w:rPr>
+        <w:t xml:space="preserve"> </w:t>
+      </w:r>
+      <w:r>
+        <w:rPr>
+          <w:lang w:bidi="fa-IR"/>
+        </w:rPr>
+        <w:t>OPC UA</w:t>
+      </w:r>
+    </w:p>
+    <w:p>
+      <w:pPr>
+        <w:bidi/>
+        <w:rPr>
+          <w:lang w:bidi="fa-IR"/>
+        </w:rPr>
+      </w:pPr>
+      <w:r>
+        <w:rPr>
+          <w:lang w:bidi="fa-IR"/>
+        </w:rPr>
+        <w:t>UPDATE drivers SET enabled = true WHERE driver_id = 4</w:t>
+      </w:r>
+      <w:r>
+        <w:rPr>
+          <w:rFonts w:cs="Arial"/>
+          <w:rtl/>
+          <w:lang w:bidi="fa-IR"/>
+        </w:rPr>
+        <w:t>;</w:t>
+      </w:r>
+    </w:p>
+    <w:p>
+      <w:pPr>
+        <w:bidi/>
+        <w:rPr>
+          <w:lang w:bidi="fa-IR"/>
+        </w:rPr>
+      </w:pPr>
+    </w:p>
+    <w:p>
+      <w:pPr>
+        <w:bidi/>
+        <w:rPr>
+          <w:lang w:bidi="fa-IR"/>
+        </w:rPr>
+      </w:pPr>
+      <w:r>
+        <w:rPr>
+          <w:rFonts w:cs="Arial"/>
+          <w:rtl/>
+          <w:lang w:bidi="fa-IR"/>
+        </w:rPr>
+        <w:t xml:space="preserve">-- فعال کردن تگ نمونه </w:t>
+      </w:r>
+      <w:r>
+        <w:rPr>
+          <w:lang w:bidi="fa-IR"/>
+        </w:rPr>
+        <w:t>seed</w:t>
+      </w:r>
+      <w:r>
+        <w:rPr>
+          <w:rFonts w:cs="Arial"/>
+          <w:rtl/>
+          <w:lang w:bidi="fa-IR"/>
+        </w:rPr>
+        <w:t xml:space="preserve"> شده</w:t>
+      </w:r>
+    </w:p>
+    <w:p>
+      <w:pPr>
+        <w:bidi/>
+        <w:rPr>
+          <w:lang w:bidi="fa-IR"/>
+        </w:rPr>
+      </w:pPr>
+      <w:r>
+        <w:rPr>
+          <w:lang w:bidi="fa-IR"/>
+        </w:rPr>
+        <w:t>UPDATE tags SET enabled = true WHERE tag_id = 9003</w:t>
+      </w:r>
+      <w:r>
+        <w:rPr>
+          <w:rFonts w:cs="Arial"/>
+          <w:rtl/>
+          <w:lang w:bidi="fa-IR"/>
+        </w:rPr>
+        <w:t>;</w:t>
+      </w:r>
+    </w:p>
+    <w:p>
+      <w:pPr>
+        <w:bidi/>
+        <w:rPr>
+          <w:lang w:bidi="fa-IR"/>
+        </w:rPr>
+      </w:pPr>
+    </w:p>
+    <w:p>
+      <w:pPr>
+        <w:bidi/>
+        <w:rPr>
+          <w:lang w:bidi="fa-IR"/>
+        </w:rPr>
+      </w:pPr>
+      <w:r>
+        <w:rPr>
+          <w:rFonts w:cs="Arial"/>
+          <w:rtl/>
+          <w:lang w:bidi="fa-IR"/>
+        </w:rPr>
+        <w:t>-- تگ دوم (شمارنده)</w:t>
+      </w:r>
+    </w:p>
+    <w:p>
+      <w:pPr>
+        <w:bidi/>
+        <w:rPr>
+          <w:lang w:bidi="fa-IR"/>
+        </w:rPr>
+      </w:pPr>
+      <w:r>
+        <w:rPr>
+          <w:lang w:bidi="fa-IR"/>
+        </w:rPr>
+        <w:t>INSERT INTO tags</w:t>
+      </w:r>
+    </w:p>
+    <w:p>
+      <w:pPr>
+        <w:bidi/>
+        <w:rPr>
+          <w:lang w:bidi="fa-IR"/>
+        </w:rPr>
+      </w:pPr>
+      <w:r>
+        <w:rPr>
+          <w:rFonts w:cs="Arial"/>
+          <w:rtl/>
+          <w:lang w:bidi="fa-IR"/>
+        </w:rPr>
+        <w:t>(</w:t>
+      </w:r>
+      <w:r>
+        <w:rPr>
+          <w:lang w:bidi="fa-IR"/>
+        </w:rPr>
+        <w:t>tag_id, tag_name, source_type, data_type, eng_units</w:t>
+      </w:r>
+      <w:r>
+        <w:rPr>
+          <w:rFonts w:cs="Arial"/>
+          <w:rtl/>
+          <w:lang w:bidi="fa-IR"/>
+        </w:rPr>
+        <w:t>,</w:t>
+      </w:r>
+    </w:p>
+    <w:p>
+      <w:pPr>
+        <w:bidi/>
+        <w:rPr>
+          <w:lang w:bidi="fa-IR"/>
+        </w:rPr>
+      </w:pPr>
+      <w:r>
+        <w:rPr>
+          <w:rFonts w:cs="Arial"/>
+          <w:rtl/>
+          <w:lang w:bidi="fa-IR"/>
+        </w:rPr>
+        <w:t xml:space="preserve"> </w:t>
+      </w:r>
+      <w:r>
+        <w:rPr>
+          <w:lang w:bidi="fa-IR"/>
+        </w:rPr>
+        <w:t>raw_min, raw_max, eng_min, eng_max, scaling_type</w:t>
+      </w:r>
+      <w:r>
+        <w:rPr>
+          <w:rFonts w:cs="Arial"/>
+          <w:rtl/>
+          <w:lang w:bidi="fa-IR"/>
+        </w:rPr>
+        <w:t>,</w:t>
+      </w:r>
+    </w:p>
+    <w:p>
+      <w:pPr>
+        <w:bidi/>
+        <w:rPr>
+          <w:lang w:bidi="fa-IR"/>
+        </w:rPr>
+      </w:pPr>
+      <w:r>
+        <w:rPr>
+          <w:rFonts w:cs="Arial"/>
+          <w:rtl/>
+          <w:lang w:bidi="fa-IR"/>
+        </w:rPr>
+        <w:t xml:space="preserve"> </w:t>
+      </w:r>
+      <w:r>
+        <w:rPr>
+          <w:lang w:bidi="fa-IR"/>
+        </w:rPr>
+        <w:t>scaling_slope, scaling_offset, deadband</w:t>
+      </w:r>
+      <w:r>
+        <w:rPr>
+          <w:rFonts w:cs="Arial"/>
+          <w:rtl/>
+          <w:lang w:bidi="fa-IR"/>
+        </w:rPr>
+        <w:t>,</w:t>
+      </w:r>
+    </w:p>
+    <w:p>
+      <w:pPr>
+        <w:bidi/>
+        <w:rPr>
+          <w:lang w:bidi="fa-IR"/>
+        </w:rPr>
+      </w:pPr>
+      <w:r>
+        <w:rPr>
+          <w:rFonts w:cs="Arial"/>
+          <w:rtl/>
+          <w:lang w:bidi="fa-IR"/>
+        </w:rPr>
+        <w:t xml:space="preserve"> </w:t>
+      </w:r>
+      <w:r>
+        <w:rPr>
+          <w:lang w:bidi="fa-IR"/>
+        </w:rPr>
+        <w:t>driver_id, address_config, enabled</w:t>
+      </w:r>
+      <w:r>
+        <w:rPr>
+          <w:rFonts w:cs="Arial"/>
+          <w:rtl/>
+          <w:lang w:bidi="fa-IR"/>
+        </w:rPr>
+        <w:t>)</w:t>
+      </w:r>
+    </w:p>
+    <w:p>
+      <w:pPr>
+        <w:bidi/>
+        <w:rPr>
+          <w:lang w:bidi="fa-IR"/>
+        </w:rPr>
+      </w:pPr>
+      <w:r>
+        <w:rPr>
+          <w:lang w:bidi="fa-IR"/>
+        </w:rPr>
+        <w:t>VALUES</w:t>
+      </w:r>
+    </w:p>
+    <w:p>
+      <w:pPr>
+        <w:bidi/>
+        <w:rPr>
+          <w:lang w:bidi="fa-IR"/>
+        </w:rPr>
+      </w:pPr>
+      <w:r>
+        <w:rPr>
+          <w:rFonts w:cs="Arial"/>
+          <w:rtl/>
+          <w:lang w:bidi="fa-IR"/>
+        </w:rPr>
+        <w:t>(9004, '</w:t>
+      </w:r>
+      <w:r>
+        <w:rPr>
+          <w:lang w:bidi="fa-IR"/>
+        </w:rPr>
+        <w:t>OPC_Counter', 'real_driver', 'int32</w:t>
+      </w:r>
+      <w:r>
+        <w:rPr>
+          <w:rFonts w:cs="Arial"/>
+          <w:rtl/>
+          <w:lang w:bidi="fa-IR"/>
+        </w:rPr>
+        <w:t>', '',</w:t>
+      </w:r>
+    </w:p>
+    <w:p>
+      <w:pPr>
+        <w:bidi/>
+        <w:rPr>
+          <w:lang w:bidi="fa-IR"/>
+        </w:rPr>
+      </w:pPr>
+      <w:r>
+        <w:rPr>
+          <w:rFonts w:cs="Arial"/>
+          <w:rtl/>
+          <w:lang w:bidi="fa-IR"/>
+        </w:rPr>
+        <w:t xml:space="preserve"> 0, 100000, 0, 100000, '</w:t>
+      </w:r>
+      <w:r>
+        <w:rPr>
+          <w:lang w:bidi="fa-IR"/>
+        </w:rPr>
+        <w:t>linear', 1, 0, 0</w:t>
+      </w:r>
+      <w:r>
+        <w:rPr>
+          <w:rFonts w:cs="Arial"/>
+          <w:rtl/>
+          <w:lang w:bidi="fa-IR"/>
+        </w:rPr>
+        <w:t>,</w:t>
+      </w:r>
+    </w:p>
+    <w:p>
+      <w:pPr>
+        <w:bidi/>
+        <w:rPr>
+          <w:lang w:bidi="fa-IR"/>
+        </w:rPr>
+      </w:pPr>
+      <w:r>
+        <w:rPr>
+          <w:rFonts w:cs="Arial"/>
+          <w:rtl/>
+          <w:lang w:bidi="fa-IR"/>
+        </w:rPr>
+        <w:t xml:space="preserve"> 4, '</w:t>
+      </w:r>
+      <w:r>
+        <w:rPr>
+          <w:lang w:bidi="fa-IR"/>
+        </w:rPr>
+        <w:t>{"node_id":"ns=2;s=Counter"}', true</w:t>
+      </w:r>
+      <w:r>
+        <w:rPr>
+          <w:rFonts w:cs="Arial"/>
+          <w:rtl/>
+          <w:lang w:bidi="fa-IR"/>
+        </w:rPr>
+        <w:t>)</w:t>
+      </w:r>
+    </w:p>
+    <w:p>
+      <w:pPr>
+        <w:bidi/>
+        <w:rPr>
+          <w:rFonts w:cs="Arial"/>
+          <w:rtl/>
+          <w:lang w:bidi="fa-IR"/>
+        </w:rPr>
+      </w:pPr>
+      <w:r>
+        <w:rPr>
+          <w:lang w:bidi="fa-IR"/>
+        </w:rPr>
+        <w:t>ON CONFLICT DO NOTHING</w:t>
+      </w:r>
+      <w:r>
+        <w:rPr>
+          <w:rFonts w:cs="Arial"/>
+          <w:rtl/>
+          <w:lang w:bidi="fa-IR"/>
+        </w:rPr>
+        <w:t>;</w:t>
+      </w:r>
+    </w:p>
+    <w:p>
+      <w:pPr>
+        <w:bidi/>
+        <w:rPr>
+          <w:rFonts w:cs="Arial"/>
+          <w:rtl/>
+          <w:lang w:bidi="fa-IR"/>
+        </w:rPr>
+      </w:pPr>
+    </w:p>
+    <w:p>
+      <w:pPr>
+        <w:bidi/>
+        <w:rPr>
+          <w:rFonts w:cs="Arial"/>
+          <w:rtl/>
+          <w:lang w:bidi="fa-IR"/>
+        </w:rPr>
+      </w:pPr>
+    </w:p>
+    <w:p>
+      <w:pPr>
+        <w:bidi/>
+        <w:rPr>
+          <w:lang w:bidi="fa-IR"/>
+        </w:rPr>
+      </w:pPr>
+      <w:r>
+        <w:rPr>
+          <w:rFonts w:cs="Arial"/>
+          <w:rtl/>
+          <w:lang w:bidi="fa-IR"/>
+        </w:rPr>
+        <w:t># مقدار فعل</w:t>
+      </w:r>
+      <w:r>
+        <w:rPr>
+          <w:rFonts w:cs="Arial" w:hint="cs"/>
+          <w:rtl/>
+          <w:lang w:bidi="fa-IR"/>
+        </w:rPr>
+        <w:t>ی</w:t>
+      </w:r>
+      <w:r>
+        <w:rPr>
+          <w:rFonts w:cs="Arial"/>
+          <w:rtl/>
+          <w:lang w:bidi="fa-IR"/>
+        </w:rPr>
+        <w:t xml:space="preserve"> دما — با</w:t>
+      </w:r>
+      <w:r>
+        <w:rPr>
+          <w:rFonts w:cs="Arial" w:hint="cs"/>
+          <w:rtl/>
+          <w:lang w:bidi="fa-IR"/>
+        </w:rPr>
+        <w:t>ی</w:t>
+      </w:r>
+      <w:r>
+        <w:rPr>
+          <w:rFonts w:cs="Arial" w:hint="eastAsia"/>
+          <w:rtl/>
+          <w:lang w:bidi="fa-IR"/>
+        </w:rPr>
+        <w:t>د</w:t>
+      </w:r>
+      <w:r>
+        <w:rPr>
+          <w:rFonts w:cs="Arial"/>
+          <w:rtl/>
+          <w:lang w:bidi="fa-IR"/>
+        </w:rPr>
+        <w:t xml:space="preserve"> هر بار عدد متفاوت</w:t>
+      </w:r>
+      <w:r>
+        <w:rPr>
+          <w:rFonts w:cs="Arial" w:hint="cs"/>
+          <w:rtl/>
+          <w:lang w:bidi="fa-IR"/>
+        </w:rPr>
+        <w:t>ی</w:t>
+      </w:r>
+      <w:r>
+        <w:rPr>
+          <w:rFonts w:cs="Arial"/>
+          <w:rtl/>
+          <w:lang w:bidi="fa-IR"/>
+        </w:rPr>
+        <w:t xml:space="preserve"> ب</w:t>
+      </w:r>
+      <w:r>
+        <w:rPr>
+          <w:rFonts w:cs="Arial" w:hint="cs"/>
+          <w:rtl/>
+          <w:lang w:bidi="fa-IR"/>
+        </w:rPr>
+        <w:t>ی</w:t>
+      </w:r>
+      <w:r>
+        <w:rPr>
+          <w:rFonts w:cs="Arial" w:hint="eastAsia"/>
+          <w:rtl/>
+          <w:lang w:bidi="fa-IR"/>
+        </w:rPr>
+        <w:t>ن</w:t>
+      </w:r>
+      <w:r>
+        <w:rPr>
+          <w:rFonts w:cs="Arial"/>
+          <w:rtl/>
+          <w:lang w:bidi="fa-IR"/>
+        </w:rPr>
+        <w:t xml:space="preserve"> 20 تا 30 بدهد</w:t>
+      </w:r>
+    </w:p>
+    <w:p>
+      <w:pPr>
+        <w:bidi/>
+        <w:rPr>
+          <w:lang w:bidi="fa-IR"/>
+        </w:rPr>
+      </w:pPr>
+      <w:r>
+        <w:rPr>
+          <w:lang w:bidi="fa-IR"/>
+        </w:rPr>
+        <w:t>Invoke-RestMethod -Uri "http://127.0.0.1:8082/api/v1/tags/9003/current</w:t>
+      </w:r>
+      <w:r>
+        <w:rPr>
+          <w:rFonts w:cs="Arial"/>
+          <w:rtl/>
+          <w:lang w:bidi="fa-IR"/>
+        </w:rPr>
+        <w:t>"</w:t>
+      </w:r>
+    </w:p>
+    <w:p>
+      <w:pPr>
+        <w:bidi/>
+        <w:rPr>
+          <w:lang w:bidi="fa-IR"/>
+        </w:rPr>
+      </w:pPr>
+    </w:p>
+    <w:p>
+      <w:pPr>
+        <w:bidi/>
+        <w:rPr>
+          <w:lang w:bidi="fa-IR"/>
+        </w:rPr>
+      </w:pPr>
+      <w:r>
+        <w:rPr>
+          <w:rFonts w:cs="Arial"/>
+          <w:rtl/>
+          <w:lang w:bidi="fa-IR"/>
+        </w:rPr>
+        <w:t># شمارنده — با</w:t>
+      </w:r>
+      <w:r>
+        <w:rPr>
+          <w:rFonts w:cs="Arial" w:hint="cs"/>
+          <w:rtl/>
+          <w:lang w:bidi="fa-IR"/>
+        </w:rPr>
+        <w:t>ی</w:t>
+      </w:r>
+      <w:r>
+        <w:rPr>
+          <w:rFonts w:cs="Arial" w:hint="eastAsia"/>
+          <w:rtl/>
+          <w:lang w:bidi="fa-IR"/>
+        </w:rPr>
+        <w:t>د</w:t>
+      </w:r>
+      <w:r>
+        <w:rPr>
+          <w:rFonts w:cs="Arial"/>
+          <w:rtl/>
+          <w:lang w:bidi="fa-IR"/>
+        </w:rPr>
+        <w:t xml:space="preserve"> افزا</w:t>
+      </w:r>
+      <w:r>
+        <w:rPr>
+          <w:rFonts w:cs="Arial" w:hint="cs"/>
+          <w:rtl/>
+          <w:lang w:bidi="fa-IR"/>
+        </w:rPr>
+        <w:t>ی</w:t>
+      </w:r>
+      <w:r>
+        <w:rPr>
+          <w:rFonts w:cs="Arial" w:hint="eastAsia"/>
+          <w:rtl/>
+          <w:lang w:bidi="fa-IR"/>
+        </w:rPr>
+        <w:t>ش</w:t>
+      </w:r>
+      <w:r>
+        <w:rPr>
+          <w:rFonts w:cs="Arial" w:hint="cs"/>
+          <w:rtl/>
+          <w:lang w:bidi="fa-IR"/>
+        </w:rPr>
+        <w:t>ی</w:t>
+      </w:r>
+      <w:r>
+        <w:rPr>
+          <w:rFonts w:cs="Arial"/>
+          <w:rtl/>
+          <w:lang w:bidi="fa-IR"/>
+        </w:rPr>
+        <w:t xml:space="preserve"> باشد</w:t>
+      </w:r>
+    </w:p>
+    <w:p>
+      <w:pPr>
+        <w:bidi/>
+        <w:rPr>
+          <w:rFonts w:cs="Arial"/>
+          <w:rtl/>
+          <w:lang w:bidi="fa-IR"/>
+        </w:rPr>
+      </w:pPr>
+      <w:r>
+        <w:rPr>
+          <w:lang w:bidi="fa-IR"/>
+        </w:rPr>
+        <w:t xml:space="preserve">Invoke-RestMethod -Uri </w:t>
+      </w:r>
+      <w:hyperlink r:id="rId16" w:history="1">
+        <w:r>
+          <w:rPr>
+            <w:rStyle w:val="Hyperlink"/>
+            <w:lang w:bidi="fa-IR"/>
+          </w:rPr>
+          <w:t>http://127.0.0.1:8082/api/v1/tags/9004/current</w:t>
+        </w:r>
+      </w:hyperlink>
+    </w:p>
+    <w:p>
+      <w:pPr>
+        <w:bidi/>
+        <w:rPr>
+          <w:rFonts w:cs="Arial"/>
+          <w:rtl/>
+          <w:lang w:bidi="fa-IR"/>
+        </w:rPr>
+      </w:pPr>
+    </w:p>
+    <w:p>
+      <w:pPr>
+        <w:bidi/>
+        <w:rPr>
+          <w:rFonts w:cs="Arial"/>
+          <w:rtl/>
+          <w:lang w:bidi="fa-IR"/>
+        </w:rPr>
+      </w:pPr>
+    </w:p>
+    <w:p>
+      <w:pPr>
+        <w:bidi/>
+        <w:rPr>
+          <w:rFonts w:hint="cs"/>
+          <w:lang w:bidi="fa-IR"/>
+        </w:rPr>
+      </w:pPr>
+      <w:r>
+        <w:rPr>
+          <w:lang w:bidi="fa-IR"/>
+        </w:rPr>
+        <w:t>wscat -c "ws://127.0.0.1:8081/ws/tags/batch?ids=9003,9004</w:t>
+      </w:r>
+      <w:r>
+        <w:rPr>
+          <w:rFonts w:cs="Arial"/>
+          <w:rtl/>
+          <w:lang w:bidi="fa-IR"/>
+        </w:rPr>
+        <w:t>"</w:t>
+      </w:r>
+    </w:p>
+    <w:p>
+      <w:pPr>
+        <w:bidi/>
+        <w:rPr>
+          <w:rtl/>
+          <w:lang w:bidi="fa-IR"/>
+        </w:rPr>
+      </w:pPr>
+    </w:p>
+    <w:p>
+      <w:pPr>
+        <w:bidi/>
+        <w:rPr>
+          <w:lang w:bidi="fa-IR"/>
+        </w:rPr>
+      </w:pPr>
+    </w:p>
+    <w:p>
+      <w:pPr>
+        <w:bidi/>
+        <w:rPr>
+          <w:lang w:bidi="fa-IR"/>
+        </w:rPr>
+      </w:pPr>
+    </w:p>
+    <w:p>
+      <w:pPr>
+        <w:bidi/>
+        <w:rPr>
+          <w:lang w:bidi="fa-IR"/>
+        </w:rPr>
+      </w:pPr>
+    </w:p>
+    <w:p>
+      <w:pPr>
+        <w:bidi/>
+        <w:rPr>
+          <w:lang w:bidi="fa-IR"/>
+        </w:rPr>
+      </w:pPr>
+      <w:r>
+        <w:rPr>
+          <w:lang w:bidi="fa-IR"/>
+        </w:rPr>
+        <w:t>-------------------------------------------------------------------------------</w:t>
+      </w:r>
+    </w:p>
+    <w:p>
+      <w:pPr>
+        <w:bidi/>
+        <w:rPr>
+          <w:lang w:bidi="fa-IR"/>
+        </w:rPr>
+      </w:pPr>
+      <w:r>
+        <w:rPr>
+          <w:rFonts w:cs="Arial"/>
+          <w:rtl/>
+          <w:lang w:bidi="fa-IR"/>
+        </w:rPr>
+        <w:t>م</w:t>
+      </w:r>
+      <w:r>
+        <w:rPr>
+          <w:rFonts w:cs="Arial" w:hint="cs"/>
+          <w:rtl/>
+          <w:lang w:bidi="fa-IR"/>
+        </w:rPr>
+        <w:t>ی‌</w:t>
+      </w:r>
+      <w:r>
+        <w:rPr>
+          <w:rFonts w:cs="Arial" w:hint="eastAsia"/>
+          <w:rtl/>
+          <w:lang w:bidi="fa-IR"/>
+        </w:rPr>
+        <w:t>خواهم</w:t>
+      </w:r>
+      <w:r>
+        <w:rPr>
+          <w:rFonts w:cs="Arial"/>
+          <w:rtl/>
+          <w:lang w:bidi="fa-IR"/>
+        </w:rPr>
+        <w:t xml:space="preserve"> </w:t>
+      </w:r>
+      <w:r>
+        <w:rPr>
+          <w:lang w:bidi="fa-IR"/>
+        </w:rPr>
+        <w:t>GUI</w:t>
+      </w:r>
+      <w:r>
+        <w:rPr>
+          <w:rFonts w:cs="Arial"/>
+          <w:rtl/>
+          <w:lang w:bidi="fa-IR"/>
+        </w:rPr>
+        <w:t xml:space="preserve"> (کلا</w:t>
+      </w:r>
+      <w:r>
+        <w:rPr>
+          <w:rFonts w:cs="Arial" w:hint="cs"/>
+          <w:rtl/>
+          <w:lang w:bidi="fa-IR"/>
+        </w:rPr>
+        <w:t>ی</w:t>
+      </w:r>
+      <w:r>
+        <w:rPr>
+          <w:rFonts w:cs="Arial" w:hint="eastAsia"/>
+          <w:rtl/>
+          <w:lang w:bidi="fa-IR"/>
+        </w:rPr>
+        <w:t>نت</w:t>
+      </w:r>
+      <w:r>
+        <w:rPr>
+          <w:rFonts w:cs="Arial"/>
+          <w:rtl/>
+          <w:lang w:bidi="fa-IR"/>
+        </w:rPr>
+        <w:t xml:space="preserve">) </w:t>
+      </w:r>
+      <w:r>
+        <w:rPr>
+          <w:rFonts w:cs="Arial" w:hint="cs"/>
+          <w:rtl/>
+          <w:lang w:bidi="fa-IR"/>
+        </w:rPr>
+        <w:t>ی</w:t>
+      </w:r>
+      <w:r>
+        <w:rPr>
+          <w:rFonts w:cs="Arial" w:hint="eastAsia"/>
+          <w:rtl/>
+          <w:lang w:bidi="fa-IR"/>
+        </w:rPr>
+        <w:t>ک</w:t>
+      </w:r>
+      <w:r>
+        <w:rPr>
+          <w:rFonts w:cs="Arial"/>
+          <w:rtl/>
+          <w:lang w:bidi="fa-IR"/>
+        </w:rPr>
+        <w:t xml:space="preserve"> پروژه </w:t>
+      </w:r>
+      <w:r>
+        <w:rPr>
+          <w:lang w:bidi="fa-IR"/>
+        </w:rPr>
+        <w:t>SCADA</w:t>
+      </w:r>
+      <w:r>
+        <w:rPr>
+          <w:rFonts w:cs="Arial"/>
+          <w:rtl/>
+          <w:lang w:bidi="fa-IR"/>
+        </w:rPr>
+        <w:t xml:space="preserve"> را بسازم. بک‌اند («</w:t>
+      </w:r>
+      <w:r>
+        <w:rPr>
+          <w:lang w:bidi="fa-IR"/>
+        </w:rPr>
+        <w:t>Tag Core</w:t>
+      </w:r>
+      <w:r>
+        <w:rPr>
+          <w:rFonts w:cs="Arial"/>
+          <w:rtl/>
+          <w:lang w:bidi="fa-IR"/>
+        </w:rPr>
+        <w:t>») کامل پ</w:t>
+      </w:r>
+      <w:r>
+        <w:rPr>
+          <w:rFonts w:cs="Arial" w:hint="cs"/>
+          <w:rtl/>
+          <w:lang w:bidi="fa-IR"/>
+        </w:rPr>
+        <w:t>ی</w:t>
+      </w:r>
+      <w:r>
+        <w:rPr>
+          <w:rFonts w:cs="Arial" w:hint="eastAsia"/>
+          <w:rtl/>
+          <w:lang w:bidi="fa-IR"/>
+        </w:rPr>
+        <w:t>اده‌ساز</w:t>
+      </w:r>
+      <w:r>
+        <w:rPr>
+          <w:rFonts w:cs="Arial" w:hint="cs"/>
+          <w:rtl/>
+          <w:lang w:bidi="fa-IR"/>
+        </w:rPr>
+        <w:t>ی</w:t>
+      </w:r>
+      <w:r>
+        <w:rPr>
+          <w:rFonts w:cs="Arial"/>
+          <w:rtl/>
+          <w:lang w:bidi="fa-IR"/>
+        </w:rPr>
+        <w:t xml:space="preserve"> و تست شده است؛ وظ</w:t>
+      </w:r>
+      <w:r>
+        <w:rPr>
+          <w:rFonts w:cs="Arial" w:hint="cs"/>
+          <w:rtl/>
+          <w:lang w:bidi="fa-IR"/>
+        </w:rPr>
+        <w:t>ی</w:t>
+      </w:r>
+      <w:r>
+        <w:rPr>
+          <w:rFonts w:cs="Arial" w:hint="eastAsia"/>
+          <w:rtl/>
+          <w:lang w:bidi="fa-IR"/>
+        </w:rPr>
+        <w:t>فه</w:t>
+      </w:r>
+      <w:r>
+        <w:rPr>
+          <w:rFonts w:cs="Arial"/>
+          <w:rtl/>
+          <w:lang w:bidi="fa-IR"/>
+        </w:rPr>
+        <w:t xml:space="preserve"> تو طراح</w:t>
+      </w:r>
+      <w:r>
+        <w:rPr>
+          <w:rFonts w:cs="Arial" w:hint="cs"/>
+          <w:rtl/>
+          <w:lang w:bidi="fa-IR"/>
+        </w:rPr>
+        <w:t>ی</w:t>
+      </w:r>
+      <w:r>
+        <w:rPr>
+          <w:rFonts w:cs="Arial"/>
+          <w:rtl/>
+          <w:lang w:bidi="fa-IR"/>
+        </w:rPr>
+        <w:t xml:space="preserve"> و پ</w:t>
+      </w:r>
+      <w:r>
+        <w:rPr>
+          <w:rFonts w:cs="Arial" w:hint="cs"/>
+          <w:rtl/>
+          <w:lang w:bidi="fa-IR"/>
+        </w:rPr>
+        <w:t>ی</w:t>
+      </w:r>
+      <w:r>
+        <w:rPr>
+          <w:rFonts w:cs="Arial" w:hint="eastAsia"/>
+          <w:rtl/>
+          <w:lang w:bidi="fa-IR"/>
+        </w:rPr>
+        <w:t>اده‌ساز</w:t>
+      </w:r>
+      <w:r>
+        <w:rPr>
+          <w:rFonts w:cs="Arial" w:hint="cs"/>
+          <w:rtl/>
+          <w:lang w:bidi="fa-IR"/>
+        </w:rPr>
+        <w:t>ی</w:t>
+      </w:r>
+      <w:r>
+        <w:rPr>
+          <w:rFonts w:cs="Arial"/>
+          <w:rtl/>
+          <w:lang w:bidi="fa-IR"/>
+        </w:rPr>
+        <w:t xml:space="preserve"> </w:t>
+      </w:r>
+      <w:r>
+        <w:rPr>
+          <w:lang w:bidi="fa-IR"/>
+        </w:rPr>
+        <w:t>UI</w:t>
+      </w:r>
+      <w:r>
+        <w:rPr>
+          <w:rFonts w:cs="Arial"/>
+          <w:rtl/>
+          <w:lang w:bidi="fa-IR"/>
+        </w:rPr>
+        <w:t xml:space="preserve"> است.</w:t>
+      </w:r>
+    </w:p>
+    <w:p>
+      <w:pPr>
+        <w:bidi/>
+        <w:rPr>
+          <w:lang w:bidi="fa-IR"/>
+        </w:rPr>
+      </w:pPr>
+    </w:p>
+    <w:p>
+      <w:pPr>
+        <w:bidi/>
+        <w:rPr>
+          <w:lang w:bidi="fa-IR"/>
+        </w:rPr>
+      </w:pPr>
+      <w:r>
+        <w:rPr>
+          <w:rFonts w:cs="Arial"/>
+          <w:rtl/>
+          <w:lang w:bidi="fa-IR"/>
+        </w:rPr>
+        <w:t>## اطلاعات پروژه</w:t>
+      </w:r>
+    </w:p>
+    <w:p>
+      <w:pPr>
+        <w:bidi/>
+        <w:rPr>
+          <w:lang w:bidi="fa-IR"/>
+        </w:rPr>
+      </w:pPr>
+      <w:r>
+        <w:rPr>
+          <w:rFonts w:cs="Arial"/>
+          <w:rtl/>
+          <w:lang w:bidi="fa-IR"/>
+        </w:rPr>
+        <w:t xml:space="preserve">- بک‌اند: </w:t>
+      </w:r>
+      <w:r>
+        <w:rPr>
+          <w:lang w:bidi="fa-IR"/>
+        </w:rPr>
+        <w:t>C++/Qt</w:t>
+      </w:r>
+      <w:r>
+        <w:rPr>
+          <w:rFonts w:cs="Arial"/>
+          <w:rtl/>
+          <w:lang w:bidi="fa-IR"/>
+        </w:rPr>
+        <w:t xml:space="preserve"> — نسخه </w:t>
+      </w:r>
+      <w:r>
+        <w:rPr>
+          <w:lang w:bidi="fa-IR"/>
+        </w:rPr>
+        <w:t>Qt</w:t>
+      </w:r>
+      <w:r>
+        <w:rPr>
+          <w:rFonts w:cs="Arial"/>
+          <w:rtl/>
+          <w:lang w:bidi="fa-IR"/>
+        </w:rPr>
+        <w:t xml:space="preserve"> من 5.12.9 (</w:t>
+      </w:r>
+      <w:r>
+        <w:rPr>
+          <w:lang w:bidi="fa-IR"/>
+        </w:rPr>
+        <w:t>MinGW 7.3 64-bit</w:t>
+      </w:r>
+      <w:r>
+        <w:rPr>
+          <w:rFonts w:cs="Arial"/>
+          <w:rtl/>
+          <w:lang w:bidi="fa-IR"/>
+        </w:rPr>
+        <w:t xml:space="preserve">، </w:t>
+      </w:r>
+      <w:r>
+        <w:rPr>
+          <w:lang w:bidi="fa-IR"/>
+        </w:rPr>
+        <w:t>Windows</w:t>
+      </w:r>
+      <w:r>
+        <w:rPr>
+          <w:rFonts w:cs="Arial"/>
+          <w:rtl/>
+          <w:lang w:bidi="fa-IR"/>
+        </w:rPr>
+        <w:t>)</w:t>
+      </w:r>
+    </w:p>
+    <w:p>
+      <w:pPr>
+        <w:bidi/>
+        <w:rPr>
+          <w:lang w:bidi="fa-IR"/>
+        </w:rPr>
+      </w:pPr>
+      <w:r>
+        <w:rPr>
+          <w:rFonts w:cs="Arial"/>
+          <w:rtl/>
+          <w:lang w:bidi="fa-IR"/>
+        </w:rPr>
+        <w:t>- مس</w:t>
+      </w:r>
+      <w:r>
+        <w:rPr>
+          <w:rFonts w:cs="Arial" w:hint="cs"/>
+          <w:rtl/>
+          <w:lang w:bidi="fa-IR"/>
+        </w:rPr>
+        <w:t>ی</w:t>
+      </w:r>
+      <w:r>
+        <w:rPr>
+          <w:rFonts w:cs="Arial" w:hint="eastAsia"/>
+          <w:rtl/>
+          <w:lang w:bidi="fa-IR"/>
+        </w:rPr>
+        <w:t>ر</w:t>
+      </w:r>
+      <w:r>
+        <w:rPr>
+          <w:rFonts w:cs="Arial"/>
+          <w:rtl/>
+          <w:lang w:bidi="fa-IR"/>
+        </w:rPr>
+        <w:t xml:space="preserve"> پروژه بک‌اند: </w:t>
+      </w:r>
+      <w:r>
+        <w:rPr>
+          <w:lang w:bidi="fa-IR"/>
+        </w:rPr>
+        <w:t>D:\Users\ISTAKIT\Desktop\SCADATest\Qt_base1</w:t>
+      </w:r>
+    </w:p>
+    <w:p>
+      <w:pPr>
+        <w:bidi/>
+        <w:rPr>
+          <w:lang w:bidi="fa-IR"/>
+        </w:rPr>
+      </w:pPr>
+      <w:r>
+        <w:rPr>
+          <w:rFonts w:cs="Arial"/>
+          <w:rtl/>
+          <w:lang w:bidi="fa-IR"/>
+        </w:rPr>
+        <w:t>- د</w:t>
+      </w:r>
+      <w:r>
+        <w:rPr>
+          <w:rFonts w:cs="Arial" w:hint="cs"/>
+          <w:rtl/>
+          <w:lang w:bidi="fa-IR"/>
+        </w:rPr>
+        <w:t>ی</w:t>
+      </w:r>
+      <w:r>
+        <w:rPr>
+          <w:rFonts w:cs="Arial" w:hint="eastAsia"/>
+          <w:rtl/>
+          <w:lang w:bidi="fa-IR"/>
+        </w:rPr>
+        <w:t>تاب</w:t>
+      </w:r>
+      <w:r>
+        <w:rPr>
+          <w:rFonts w:cs="Arial" w:hint="cs"/>
+          <w:rtl/>
+          <w:lang w:bidi="fa-IR"/>
+        </w:rPr>
+        <w:t>ی</w:t>
+      </w:r>
+      <w:r>
+        <w:rPr>
+          <w:rFonts w:cs="Arial" w:hint="eastAsia"/>
+          <w:rtl/>
+          <w:lang w:bidi="fa-IR"/>
+        </w:rPr>
+        <w:t>س</w:t>
+      </w:r>
+      <w:r>
+        <w:rPr>
+          <w:rFonts w:cs="Arial"/>
+          <w:rtl/>
+          <w:lang w:bidi="fa-IR"/>
+        </w:rPr>
+        <w:t xml:space="preserve">: </w:t>
+      </w:r>
+      <w:r>
+        <w:rPr>
+          <w:lang w:bidi="fa-IR"/>
+        </w:rPr>
+        <w:t>PostgreSQL + TimescaleDB</w:t>
+      </w:r>
+    </w:p>
+    <w:p>
+      <w:pPr>
+        <w:bidi/>
+        <w:rPr>
+          <w:lang w:bidi="fa-IR"/>
+        </w:rPr>
+      </w:pPr>
+      <w:r>
+        <w:rPr>
+          <w:rFonts w:cs="Arial"/>
+          <w:rtl/>
+          <w:lang w:bidi="fa-IR"/>
+        </w:rPr>
+        <w:t>- دو سرور فعال:</w:t>
+      </w:r>
+    </w:p>
+    <w:p>
+      <w:pPr>
+        <w:bidi/>
+        <w:rPr>
+          <w:lang w:bidi="fa-IR"/>
+        </w:rPr>
+      </w:pPr>
+      <w:r>
+        <w:rPr>
+          <w:rFonts w:cs="Arial"/>
+          <w:rtl/>
+          <w:lang w:bidi="fa-IR"/>
+        </w:rPr>
+        <w:t xml:space="preserve">  - </w:t>
+      </w:r>
+      <w:r>
+        <w:rPr>
+          <w:lang w:bidi="fa-IR"/>
+        </w:rPr>
+        <w:t>WebSocket (real-time): ws://127.0.0.1:8081</w:t>
+      </w:r>
+    </w:p>
+    <w:p>
+      <w:pPr>
+        <w:bidi/>
+        <w:rPr>
+          <w:lang w:bidi="fa-IR"/>
+        </w:rPr>
+      </w:pPr>
+      <w:r>
+        <w:rPr>
+          <w:rFonts w:cs="Arial"/>
+          <w:rtl/>
+          <w:lang w:bidi="fa-IR"/>
+        </w:rPr>
+        <w:t xml:space="preserve">  - </w:t>
+      </w:r>
+      <w:r>
+        <w:rPr>
+          <w:lang w:bidi="fa-IR"/>
+        </w:rPr>
+        <w:t>REST API: http://127.0.0.1:8082</w:t>
+      </w:r>
+    </w:p>
+    <w:p>
+      <w:pPr>
+        <w:bidi/>
+        <w:rPr>
+          <w:lang w:bidi="fa-IR"/>
+        </w:rPr>
+      </w:pPr>
+      <w:r>
+        <w:rPr>
+          <w:rFonts w:cs="Arial"/>
+          <w:rtl/>
+          <w:lang w:bidi="fa-IR"/>
+        </w:rPr>
+        <w:t>- فناور</w:t>
+      </w:r>
+      <w:r>
+        <w:rPr>
+          <w:rFonts w:cs="Arial" w:hint="cs"/>
+          <w:rtl/>
+          <w:lang w:bidi="fa-IR"/>
+        </w:rPr>
+        <w:t>ی</w:t>
+      </w:r>
+      <w:r>
+        <w:rPr>
+          <w:rFonts w:cs="Arial"/>
+          <w:rtl/>
+          <w:lang w:bidi="fa-IR"/>
+        </w:rPr>
+        <w:t xml:space="preserve"> </w:t>
+      </w:r>
+      <w:r>
+        <w:rPr>
+          <w:lang w:bidi="fa-IR"/>
+        </w:rPr>
+        <w:t>UI: Qt Quick (QML) + Qt Quick Controls 2</w:t>
+      </w:r>
+      <w:r>
+        <w:rPr>
+          <w:rFonts w:cs="Arial"/>
+          <w:rtl/>
+          <w:lang w:bidi="fa-IR"/>
+        </w:rPr>
+        <w:t>، تم ت</w:t>
+      </w:r>
+      <w:r>
+        <w:rPr>
+          <w:rFonts w:cs="Arial" w:hint="cs"/>
+          <w:rtl/>
+          <w:lang w:bidi="fa-IR"/>
+        </w:rPr>
+        <w:t>ی</w:t>
+      </w:r>
+      <w:r>
+        <w:rPr>
+          <w:rFonts w:cs="Arial" w:hint="eastAsia"/>
+          <w:rtl/>
+          <w:lang w:bidi="fa-IR"/>
+        </w:rPr>
+        <w:t>ره</w:t>
+      </w:r>
+      <w:r>
+        <w:rPr>
+          <w:rFonts w:cs="Arial"/>
+          <w:rtl/>
+          <w:lang w:bidi="fa-IR"/>
+        </w:rPr>
+        <w:t xml:space="preserve"> صنعت</w:t>
+      </w:r>
+      <w:r>
+        <w:rPr>
+          <w:rFonts w:cs="Arial" w:hint="cs"/>
+          <w:rtl/>
+          <w:lang w:bidi="fa-IR"/>
+        </w:rPr>
+        <w:t>ی</w:t>
+      </w:r>
+    </w:p>
+    <w:p>
+      <w:pPr>
+        <w:bidi/>
+        <w:rPr>
+          <w:lang w:bidi="fa-IR"/>
+        </w:rPr>
+      </w:pPr>
+    </w:p>
+    <w:p>
+      <w:pPr>
+        <w:bidi/>
+        <w:rPr>
+          <w:lang w:bidi="fa-IR"/>
+        </w:rPr>
+      </w:pPr>
+      <w:r>
+        <w:rPr>
+          <w:rFonts w:cs="Arial"/>
+          <w:rtl/>
+          <w:lang w:bidi="fa-IR"/>
+        </w:rPr>
+        <w:t>## پروتکل بک‌اند (خلاصه — جزئ</w:t>
+      </w:r>
+      <w:r>
+        <w:rPr>
+          <w:rFonts w:cs="Arial" w:hint="cs"/>
+          <w:rtl/>
+          <w:lang w:bidi="fa-IR"/>
+        </w:rPr>
+        <w:t>ی</w:t>
+      </w:r>
+      <w:r>
+        <w:rPr>
+          <w:rFonts w:cs="Arial" w:hint="eastAsia"/>
+          <w:rtl/>
+          <w:lang w:bidi="fa-IR"/>
+        </w:rPr>
+        <w:t>ات</w:t>
+      </w:r>
+      <w:r>
+        <w:rPr>
+          <w:rFonts w:cs="Arial"/>
+          <w:rtl/>
+          <w:lang w:bidi="fa-IR"/>
+        </w:rPr>
+        <w:t xml:space="preserve"> کامل در فا</w:t>
+      </w:r>
+      <w:r>
+        <w:rPr>
+          <w:rFonts w:cs="Arial" w:hint="cs"/>
+          <w:rtl/>
+          <w:lang w:bidi="fa-IR"/>
+        </w:rPr>
+        <w:t>ی</w:t>
+      </w:r>
+      <w:r>
+        <w:rPr>
+          <w:rFonts w:cs="Arial" w:hint="eastAsia"/>
+          <w:rtl/>
+          <w:lang w:bidi="fa-IR"/>
+        </w:rPr>
+        <w:t>ل</w:t>
+      </w:r>
+      <w:r>
+        <w:rPr>
+          <w:rFonts w:cs="Arial"/>
+          <w:rtl/>
+          <w:lang w:bidi="fa-IR"/>
+        </w:rPr>
+        <w:t xml:space="preserve"> پ</w:t>
+      </w:r>
+      <w:r>
+        <w:rPr>
+          <w:rFonts w:cs="Arial" w:hint="cs"/>
+          <w:rtl/>
+          <w:lang w:bidi="fa-IR"/>
+        </w:rPr>
+        <w:t>ی</w:t>
+      </w:r>
+      <w:r>
+        <w:rPr>
+          <w:rFonts w:cs="Arial" w:hint="eastAsia"/>
+          <w:rtl/>
+          <w:lang w:bidi="fa-IR"/>
+        </w:rPr>
+        <w:t>وست</w:t>
+      </w:r>
+      <w:r>
+        <w:rPr>
+          <w:rFonts w:cs="Arial"/>
+          <w:rtl/>
+          <w:lang w:bidi="fa-IR"/>
+        </w:rPr>
+        <w:t xml:space="preserve"> </w:t>
+      </w:r>
+      <w:r>
+        <w:rPr>
+          <w:lang w:bidi="fa-IR"/>
+        </w:rPr>
+        <w:t>tag_core_docs.html</w:t>
+      </w:r>
+      <w:r>
+        <w:rPr>
+          <w:rFonts w:cs="Arial"/>
+          <w:rtl/>
+          <w:lang w:bidi="fa-IR"/>
+        </w:rPr>
+        <w:t>)</w:t>
+      </w:r>
+    </w:p>
+    <w:p>
+      <w:pPr>
+        <w:bidi/>
+        <w:rPr>
+          <w:lang w:bidi="fa-IR"/>
+        </w:rPr>
+      </w:pPr>
+    </w:p>
+    <w:p>
+      <w:pPr>
+        <w:bidi/>
+        <w:rPr>
+          <w:lang w:bidi="fa-IR"/>
+        </w:rPr>
+      </w:pPr>
+      <w:r>
+        <w:rPr>
+          <w:rFonts w:cs="Arial"/>
+          <w:rtl/>
+          <w:lang w:bidi="fa-IR"/>
+        </w:rPr>
+        <w:t>### کانال‌ها</w:t>
+      </w:r>
+      <w:r>
+        <w:rPr>
+          <w:rFonts w:cs="Arial" w:hint="cs"/>
+          <w:rtl/>
+          <w:lang w:bidi="fa-IR"/>
+        </w:rPr>
+        <w:t>ی</w:t>
+      </w:r>
+      <w:r>
+        <w:rPr>
+          <w:rFonts w:cs="Arial"/>
+          <w:rtl/>
+          <w:lang w:bidi="fa-IR"/>
+        </w:rPr>
+        <w:t xml:space="preserve"> </w:t>
+      </w:r>
+      <w:r>
+        <w:rPr>
+          <w:lang w:bidi="fa-IR"/>
+        </w:rPr>
+        <w:t>WebSocket</w:t>
+      </w:r>
+    </w:p>
+    <w:p>
+      <w:pPr>
+        <w:bidi/>
+        <w:rPr>
+          <w:lang w:bidi="fa-IR"/>
+        </w:rPr>
+      </w:pPr>
+      <w:r>
+        <w:rPr>
+          <w:rFonts w:cs="Arial"/>
+          <w:rtl/>
+          <w:lang w:bidi="fa-IR"/>
+        </w:rPr>
+        <w:t>- /</w:t>
+      </w:r>
+      <w:r>
+        <w:rPr>
+          <w:lang w:bidi="fa-IR"/>
+        </w:rPr>
+        <w:t>ws/tags/batch?ids=1,2,3</w:t>
+      </w:r>
+      <w:r>
+        <w:rPr>
+          <w:rFonts w:cs="Arial"/>
+          <w:rtl/>
+          <w:lang w:bidi="fa-IR"/>
+        </w:rPr>
+        <w:t xml:space="preserve">   → آپد</w:t>
+      </w:r>
+      <w:r>
+        <w:rPr>
+          <w:rFonts w:cs="Arial" w:hint="cs"/>
+          <w:rtl/>
+          <w:lang w:bidi="fa-IR"/>
+        </w:rPr>
+        <w:t>ی</w:t>
+      </w:r>
+      <w:r>
+        <w:rPr>
+          <w:rFonts w:cs="Arial" w:hint="eastAsia"/>
+          <w:rtl/>
+          <w:lang w:bidi="fa-IR"/>
+        </w:rPr>
+        <w:t>ت</w:t>
+      </w:r>
+      <w:r>
+        <w:rPr>
+          <w:rFonts w:cs="Arial"/>
+          <w:rtl/>
+          <w:lang w:bidi="fa-IR"/>
+        </w:rPr>
+        <w:t xml:space="preserve"> زنده تگ‌ها</w:t>
+      </w:r>
+    </w:p>
+    <w:p>
+      <w:pPr>
+        <w:bidi/>
+        <w:rPr>
+          <w:lang w:bidi="fa-IR"/>
+        </w:rPr>
+      </w:pPr>
+      <w:r>
+        <w:rPr>
+          <w:rFonts w:cs="Arial"/>
+          <w:rtl/>
+          <w:lang w:bidi="fa-IR"/>
+        </w:rPr>
+        <w:t>- /</w:t>
+      </w:r>
+      <w:r>
+        <w:rPr>
+          <w:lang w:bidi="fa-IR"/>
+        </w:rPr>
+        <w:t>ws/alarms/analog | /ws/alarms/digital | /ws/alarms/all</w:t>
+      </w:r>
+    </w:p>
+    <w:p>
+      <w:pPr>
+        <w:bidi/>
+        <w:rPr>
+          <w:lang w:bidi="fa-IR"/>
+        </w:rPr>
+      </w:pPr>
+      <w:r>
+        <w:rPr>
+          <w:rFonts w:cs="Arial"/>
+          <w:rtl/>
+          <w:lang w:bidi="fa-IR"/>
+        </w:rPr>
+        <w:t>- /</w:t>
+      </w:r>
+      <w:r>
+        <w:rPr>
+          <w:lang w:bidi="fa-IR"/>
+        </w:rPr>
+        <w:t>ws/dashboard/{id}?ids</w:t>
+      </w:r>
+      <w:r>
+        <w:rPr>
+          <w:rFonts w:cs="Arial"/>
+          <w:rtl/>
+          <w:lang w:bidi="fa-IR"/>
+        </w:rPr>
+        <w:t>=...</w:t>
+      </w:r>
+    </w:p>
+    <w:p>
+      <w:pPr>
+        <w:bidi/>
+        <w:rPr>
+          <w:lang w:bidi="fa-IR"/>
+        </w:rPr>
+      </w:pPr>
+      <w:r>
+        <w:rPr>
+          <w:rFonts w:cs="Arial"/>
+          <w:rtl/>
+          <w:lang w:bidi="fa-IR"/>
+        </w:rPr>
+        <w:lastRenderedPageBreak/>
+        <w:t>- /</w:t>
+      </w:r>
+      <w:r>
+        <w:rPr>
+          <w:lang w:bidi="fa-IR"/>
+        </w:rPr>
+        <w:t>ws/system/status</w:t>
+      </w:r>
+    </w:p>
+    <w:p>
+      <w:pPr>
+        <w:bidi/>
+        <w:rPr>
+          <w:lang w:bidi="fa-IR"/>
+        </w:rPr>
+      </w:pPr>
+      <w:r>
+        <w:rPr>
+          <w:rFonts w:cs="Arial" w:hint="eastAsia"/>
+          <w:rtl/>
+          <w:lang w:bidi="fa-IR"/>
+        </w:rPr>
+        <w:t>پ</w:t>
+      </w:r>
+      <w:r>
+        <w:rPr>
+          <w:rFonts w:cs="Arial" w:hint="cs"/>
+          <w:rtl/>
+          <w:lang w:bidi="fa-IR"/>
+        </w:rPr>
+        <w:t>ی</w:t>
+      </w:r>
+      <w:r>
+        <w:rPr>
+          <w:rFonts w:cs="Arial" w:hint="eastAsia"/>
+          <w:rtl/>
+          <w:lang w:bidi="fa-IR"/>
+        </w:rPr>
+        <w:t>ام‌ها</w:t>
+      </w:r>
+      <w:r>
+        <w:rPr>
+          <w:rFonts w:cs="Arial" w:hint="cs"/>
+          <w:rtl/>
+          <w:lang w:bidi="fa-IR"/>
+        </w:rPr>
+        <w:t>ی</w:t>
+      </w:r>
+      <w:r>
+        <w:rPr>
+          <w:rFonts w:cs="Arial"/>
+          <w:rtl/>
+          <w:lang w:bidi="fa-IR"/>
+        </w:rPr>
+        <w:t xml:space="preserve"> سرور: </w:t>
+      </w:r>
+      <w:r>
+        <w:rPr>
+          <w:lang w:bidi="fa-IR"/>
+        </w:rPr>
+        <w:t>hello, tags.snapshot, tag.update, tags.batch, alarm.event, alarm.ack, system.status, response, pong</w:t>
+      </w:r>
+    </w:p>
+    <w:p>
+      <w:pPr>
+        <w:bidi/>
+        <w:rPr>
+          <w:lang w:bidi="fa-IR"/>
+        </w:rPr>
+      </w:pPr>
+      <w:r>
+        <w:rPr>
+          <w:rFonts w:cs="Arial" w:hint="eastAsia"/>
+          <w:rtl/>
+          <w:lang w:bidi="fa-IR"/>
+        </w:rPr>
+        <w:t>پ</w:t>
+      </w:r>
+      <w:r>
+        <w:rPr>
+          <w:rFonts w:cs="Arial" w:hint="cs"/>
+          <w:rtl/>
+          <w:lang w:bidi="fa-IR"/>
+        </w:rPr>
+        <w:t>ی</w:t>
+      </w:r>
+      <w:r>
+        <w:rPr>
+          <w:rFonts w:cs="Arial" w:hint="eastAsia"/>
+          <w:rtl/>
+          <w:lang w:bidi="fa-IR"/>
+        </w:rPr>
+        <w:t>ام‌ها</w:t>
+      </w:r>
+      <w:r>
+        <w:rPr>
+          <w:rFonts w:cs="Arial" w:hint="cs"/>
+          <w:rtl/>
+          <w:lang w:bidi="fa-IR"/>
+        </w:rPr>
+        <w:t>ی</w:t>
+      </w:r>
+      <w:r>
+        <w:rPr>
+          <w:rFonts w:cs="Arial"/>
+          <w:rtl/>
+          <w:lang w:bidi="fa-IR"/>
+        </w:rPr>
+        <w:t xml:space="preserve"> کنترل</w:t>
+      </w:r>
+      <w:r>
+        <w:rPr>
+          <w:rFonts w:cs="Arial" w:hint="cs"/>
+          <w:rtl/>
+          <w:lang w:bidi="fa-IR"/>
+        </w:rPr>
+        <w:t>ی</w:t>
+      </w:r>
+      <w:r>
+        <w:rPr>
+          <w:rFonts w:cs="Arial"/>
+          <w:rtl/>
+          <w:lang w:bidi="fa-IR"/>
+        </w:rPr>
+        <w:t xml:space="preserve">: </w:t>
+      </w:r>
+      <w:r>
+        <w:rPr>
+          <w:lang w:bidi="fa-IR"/>
+        </w:rPr>
+        <w:t>{"op":"subscribe","tags</w:t>
+      </w:r>
+      <w:r>
+        <w:rPr>
+          <w:rFonts w:cs="Arial"/>
+          <w:rtl/>
+          <w:lang w:bidi="fa-IR"/>
+        </w:rPr>
+        <w:t>":[1,2]</w:t>
+      </w:r>
+      <w:r>
+        <w:rPr>
+          <w:lang w:bidi="fa-IR"/>
+        </w:rPr>
+        <w:t>}, {"op":"subscribe","channel":"alarms/all"}, {"op":"options","delivery":"batch"}, {"op":"get_snapshot","tags</w:t>
+      </w:r>
+      <w:r>
+        <w:rPr>
+          <w:rFonts w:cs="Arial"/>
+          <w:rtl/>
+          <w:lang w:bidi="fa-IR"/>
+        </w:rPr>
+        <w:t>":[...]</w:t>
+      </w:r>
+      <w:r>
+        <w:rPr>
+          <w:lang w:bidi="fa-IR"/>
+        </w:rPr>
+        <w:t>}, {"op":"ping"}</w:t>
+      </w:r>
+    </w:p>
+    <w:p>
+      <w:pPr>
+        <w:bidi/>
+        <w:rPr>
+          <w:lang w:bidi="fa-IR"/>
+        </w:rPr>
+      </w:pPr>
+      <w:r>
+        <w:rPr>
+          <w:rFonts w:cs="Arial" w:hint="eastAsia"/>
+          <w:rtl/>
+          <w:lang w:bidi="fa-IR"/>
+        </w:rPr>
+        <w:t>نمونه</w:t>
+      </w:r>
+      <w:r>
+        <w:rPr>
+          <w:rFonts w:cs="Arial"/>
+          <w:rtl/>
+          <w:lang w:bidi="fa-IR"/>
+        </w:rPr>
+        <w:t xml:space="preserve"> </w:t>
+      </w:r>
+      <w:r>
+        <w:rPr>
+          <w:lang w:bidi="fa-IR"/>
+        </w:rPr>
+        <w:t>tags.batch</w:t>
+      </w:r>
+      <w:r>
+        <w:rPr>
+          <w:rFonts w:cs="Arial"/>
+          <w:rtl/>
+          <w:lang w:bidi="fa-IR"/>
+        </w:rPr>
+        <w:t>:</w:t>
+      </w:r>
+    </w:p>
+    <w:p>
+      <w:pPr>
+        <w:bidi/>
+        <w:rPr>
+          <w:lang w:bidi="fa-IR"/>
+        </w:rPr>
+      </w:pPr>
+      <w:r>
+        <w:rPr>
+          <w:rFonts w:cs="Arial"/>
+          <w:rtl/>
+          <w:lang w:bidi="fa-IR"/>
+        </w:rPr>
+        <w:t>{"</w:t>
+      </w:r>
+      <w:r>
+        <w:rPr>
+          <w:lang w:bidi="fa-IR"/>
+        </w:rPr>
+        <w:t>type":"tags.batch","ts":"...","updates":[{"type":"tag.update","tag_id":1,"value":23.4,"quality":"good"}]</w:t>
+      </w:r>
+      <w:r>
+        <w:rPr>
+          <w:rFonts w:cs="Arial"/>
+          <w:rtl/>
+          <w:lang w:bidi="fa-IR"/>
+        </w:rPr>
+        <w:t>}</w:t>
+      </w:r>
+    </w:p>
+    <w:p>
+      <w:pPr>
+        <w:bidi/>
+        <w:rPr>
+          <w:lang w:bidi="fa-IR"/>
+        </w:rPr>
+      </w:pPr>
+    </w:p>
+    <w:p>
+      <w:pPr>
+        <w:bidi/>
+        <w:rPr>
+          <w:lang w:bidi="fa-IR"/>
+        </w:rPr>
+      </w:pPr>
+      <w:r>
+        <w:rPr>
+          <w:rFonts w:cs="Arial"/>
+          <w:rtl/>
+          <w:lang w:bidi="fa-IR"/>
+        </w:rPr>
+        <w:t xml:space="preserve">### </w:t>
+      </w:r>
+      <w:r>
+        <w:rPr>
+          <w:lang w:bidi="fa-IR"/>
+        </w:rPr>
+        <w:t>Command Channel</w:t>
+      </w:r>
+      <w:r>
+        <w:rPr>
+          <w:rFonts w:cs="Arial"/>
+          <w:rtl/>
+          <w:lang w:bidi="fa-IR"/>
+        </w:rPr>
+        <w:t xml:space="preserve"> رو</w:t>
+      </w:r>
+      <w:r>
+        <w:rPr>
+          <w:rFonts w:cs="Arial" w:hint="cs"/>
+          <w:rtl/>
+          <w:lang w:bidi="fa-IR"/>
+        </w:rPr>
+        <w:t>ی</w:t>
+      </w:r>
+      <w:r>
+        <w:rPr>
+          <w:rFonts w:cs="Arial"/>
+          <w:rtl/>
+          <w:lang w:bidi="fa-IR"/>
+        </w:rPr>
+        <w:t xml:space="preserve"> </w:t>
+      </w:r>
+      <w:r>
+        <w:rPr>
+          <w:lang w:bidi="fa-IR"/>
+        </w:rPr>
+        <w:t>WebSocket (request/response)</w:t>
+      </w:r>
+    </w:p>
+    <w:p>
+      <w:pPr>
+        <w:bidi/>
+        <w:rPr>
+          <w:lang w:bidi="fa-IR"/>
+        </w:rPr>
+      </w:pPr>
+      <w:r>
+        <w:rPr>
+          <w:rFonts w:cs="Arial"/>
+          <w:rtl/>
+          <w:lang w:bidi="fa-IR"/>
+        </w:rPr>
+        <w:t>{"</w:t>
+      </w:r>
+      <w:r>
+        <w:rPr>
+          <w:lang w:bidi="fa-IR"/>
+        </w:rPr>
+        <w:t>type":"command","id":"x","op":"write_tag","payload":{"tag_id":1,"value":55}</w:t>
+      </w:r>
+      <w:r>
+        <w:rPr>
+          <w:rFonts w:cs="Arial"/>
+          <w:rtl/>
+          <w:lang w:bidi="fa-IR"/>
+        </w:rPr>
+        <w:t>}</w:t>
+      </w:r>
+    </w:p>
+    <w:p>
+      <w:pPr>
+        <w:bidi/>
+        <w:rPr>
+          <w:lang w:bidi="fa-IR"/>
+        </w:rPr>
+      </w:pPr>
+      <w:r>
+        <w:rPr>
+          <w:rFonts w:cs="Arial" w:hint="eastAsia"/>
+          <w:rtl/>
+          <w:lang w:bidi="fa-IR"/>
+        </w:rPr>
+        <w:t>عمل</w:t>
+      </w:r>
+      <w:r>
+        <w:rPr>
+          <w:rFonts w:cs="Arial" w:hint="cs"/>
+          <w:rtl/>
+          <w:lang w:bidi="fa-IR"/>
+        </w:rPr>
+        <w:t>ی</w:t>
+      </w:r>
+      <w:r>
+        <w:rPr>
+          <w:rFonts w:cs="Arial" w:hint="eastAsia"/>
+          <w:rtl/>
+          <w:lang w:bidi="fa-IR"/>
+        </w:rPr>
+        <w:t>ات‌ها</w:t>
+      </w:r>
+      <w:r>
+        <w:rPr>
+          <w:rFonts w:cs="Arial"/>
+          <w:rtl/>
+          <w:lang w:bidi="fa-IR"/>
+        </w:rPr>
+        <w:t xml:space="preserve">: </w:t>
+      </w:r>
+      <w:r>
+        <w:rPr>
+          <w:lang w:bidi="fa-IR"/>
+        </w:rPr>
+        <w:t>write_tag, ack_alarm, get_current, reload_drivers, start_driver, stop_driver, list_drivers, load_dashboard</w:t>
+      </w:r>
+    </w:p>
+    <w:p>
+      <w:pPr>
+        <w:bidi/>
+        <w:rPr>
+          <w:lang w:bidi="fa-IR"/>
+        </w:rPr>
+      </w:pPr>
+      <w:r>
+        <w:rPr>
+          <w:rFonts w:cs="Arial" w:hint="eastAsia"/>
+          <w:rtl/>
+          <w:lang w:bidi="fa-IR"/>
+        </w:rPr>
+        <w:t>پاسخ</w:t>
+      </w:r>
+      <w:r>
+        <w:rPr>
+          <w:rFonts w:cs="Arial"/>
+          <w:rtl/>
+          <w:lang w:bidi="fa-IR"/>
+        </w:rPr>
+        <w:t>: {"</w:t>
+      </w:r>
+      <w:r>
+        <w:rPr>
+          <w:lang w:bidi="fa-IR"/>
+        </w:rPr>
+        <w:t>type":"response","id":"x","ok":true,"data</w:t>
+      </w:r>
+      <w:r>
+        <w:rPr>
+          <w:rFonts w:cs="Arial"/>
+          <w:rtl/>
+          <w:lang w:bidi="fa-IR"/>
+        </w:rPr>
+        <w:t>":{...}}</w:t>
+      </w:r>
+    </w:p>
+    <w:p>
+      <w:pPr>
+        <w:bidi/>
+        <w:rPr>
+          <w:lang w:bidi="fa-IR"/>
+        </w:rPr>
+      </w:pPr>
+    </w:p>
+    <w:p>
+      <w:pPr>
+        <w:bidi/>
+        <w:rPr>
+          <w:lang w:bidi="fa-IR"/>
+        </w:rPr>
+      </w:pPr>
+      <w:r>
+        <w:rPr>
+          <w:rFonts w:cs="Arial"/>
+          <w:rtl/>
+          <w:lang w:bidi="fa-IR"/>
+        </w:rPr>
+        <w:t xml:space="preserve">### </w:t>
+      </w:r>
+      <w:r>
+        <w:rPr>
+          <w:lang w:bidi="fa-IR"/>
+        </w:rPr>
+        <w:t>REST</w:t>
+      </w:r>
+      <w:r>
+        <w:rPr>
+          <w:rFonts w:cs="Arial"/>
+          <w:rtl/>
+          <w:lang w:bidi="fa-IR"/>
+        </w:rPr>
+        <w:t xml:space="preserve"> (</w:t>
+      </w:r>
+      <w:r>
+        <w:rPr>
+          <w:lang w:bidi="fa-IR"/>
+        </w:rPr>
+        <w:t>endpoint</w:t>
+      </w:r>
+      <w:r>
+        <w:rPr>
+          <w:rFonts w:cs="Arial"/>
+          <w:rtl/>
+          <w:lang w:bidi="fa-IR"/>
+        </w:rPr>
+        <w:t xml:space="preserve"> ها</w:t>
+      </w:r>
+      <w:r>
+        <w:rPr>
+          <w:rFonts w:cs="Arial" w:hint="cs"/>
+          <w:rtl/>
+          <w:lang w:bidi="fa-IR"/>
+        </w:rPr>
+        <w:t>ی</w:t>
+      </w:r>
+      <w:r>
+        <w:rPr>
+          <w:rFonts w:cs="Arial"/>
+          <w:rtl/>
+          <w:lang w:bidi="fa-IR"/>
+        </w:rPr>
+        <w:t xml:space="preserve"> اصل</w:t>
+      </w:r>
+      <w:r>
+        <w:rPr>
+          <w:rFonts w:cs="Arial" w:hint="cs"/>
+          <w:rtl/>
+          <w:lang w:bidi="fa-IR"/>
+        </w:rPr>
+        <w:t>ی</w:t>
+      </w:r>
+      <w:r>
+        <w:rPr>
+          <w:rFonts w:cs="Arial"/>
+          <w:rtl/>
+          <w:lang w:bidi="fa-IR"/>
+        </w:rPr>
+        <w:t>)</w:t>
+      </w:r>
+    </w:p>
+    <w:p>
+      <w:pPr>
+        <w:bidi/>
+        <w:rPr>
+          <w:lang w:bidi="fa-IR"/>
+        </w:rPr>
+      </w:pPr>
+      <w:r>
+        <w:rPr>
+          <w:rFonts w:cs="Arial"/>
+          <w:rtl/>
+          <w:lang w:bidi="fa-IR"/>
+        </w:rPr>
+        <w:t xml:space="preserve">- </w:t>
+      </w:r>
+      <w:r>
+        <w:rPr>
+          <w:lang w:bidi="fa-IR"/>
+        </w:rPr>
+        <w:t>POST /api/v1/auth/login {username,password} → token</w:t>
+      </w:r>
+      <w:r>
+        <w:rPr>
+          <w:rFonts w:cs="Arial"/>
+          <w:rtl/>
+          <w:lang w:bidi="fa-IR"/>
+        </w:rPr>
+        <w:t xml:space="preserve"> (کاربر پ</w:t>
+      </w:r>
+      <w:r>
+        <w:rPr>
+          <w:rFonts w:cs="Arial" w:hint="cs"/>
+          <w:rtl/>
+          <w:lang w:bidi="fa-IR"/>
+        </w:rPr>
+        <w:t>ی</w:t>
+      </w:r>
+      <w:r>
+        <w:rPr>
+          <w:rFonts w:cs="Arial" w:hint="eastAsia"/>
+          <w:rtl/>
+          <w:lang w:bidi="fa-IR"/>
+        </w:rPr>
+        <w:t>ش‌فرض</w:t>
+      </w:r>
+      <w:r>
+        <w:rPr>
+          <w:rFonts w:cs="Arial"/>
+          <w:rtl/>
+          <w:lang w:bidi="fa-IR"/>
+        </w:rPr>
+        <w:t xml:space="preserve"> </w:t>
+      </w:r>
+      <w:r>
+        <w:rPr>
+          <w:lang w:bidi="fa-IR"/>
+        </w:rPr>
+        <w:t>admin/admin123</w:t>
+      </w:r>
+      <w:r>
+        <w:rPr>
+          <w:rFonts w:cs="Arial"/>
+          <w:rtl/>
+          <w:lang w:bidi="fa-IR"/>
+        </w:rPr>
+        <w:t xml:space="preserve">؛ </w:t>
+      </w:r>
+      <w:r>
+        <w:rPr>
+          <w:lang w:bidi="fa-IR"/>
+        </w:rPr>
+        <w:t>auth</w:t>
+      </w:r>
+      <w:r>
+        <w:rPr>
+          <w:rFonts w:cs="Arial"/>
+          <w:rtl/>
+          <w:lang w:bidi="fa-IR"/>
+        </w:rPr>
+        <w:t xml:space="preserve"> فعلاً غ</w:t>
+      </w:r>
+      <w:r>
+        <w:rPr>
+          <w:rFonts w:cs="Arial" w:hint="cs"/>
+          <w:rtl/>
+          <w:lang w:bidi="fa-IR"/>
+        </w:rPr>
+        <w:t>ی</w:t>
+      </w:r>
+      <w:r>
+        <w:rPr>
+          <w:rFonts w:cs="Arial" w:hint="eastAsia"/>
+          <w:rtl/>
+          <w:lang w:bidi="fa-IR"/>
+        </w:rPr>
+        <w:t>رفعال</w:t>
+      </w:r>
+      <w:r>
+        <w:rPr>
+          <w:rFonts w:cs="Arial"/>
+          <w:rtl/>
+          <w:lang w:bidi="fa-IR"/>
+        </w:rPr>
+        <w:t xml:space="preserve"> است)</w:t>
+      </w:r>
+    </w:p>
+    <w:p>
+      <w:pPr>
+        <w:bidi/>
+        <w:rPr>
+          <w:lang w:bidi="fa-IR"/>
+        </w:rPr>
+      </w:pPr>
+      <w:r>
+        <w:rPr>
+          <w:rFonts w:cs="Arial"/>
+          <w:rtl/>
+          <w:lang w:bidi="fa-IR"/>
+        </w:rPr>
+        <w:t xml:space="preserve">- </w:t>
+      </w:r>
+      <w:r>
+        <w:rPr>
+          <w:lang w:bidi="fa-IR"/>
+        </w:rPr>
+        <w:t xml:space="preserve">GET/POST /api/v1/tags </w:t>
+      </w:r>
+      <w:r>
+        <w:rPr>
+          <w:rFonts w:cs="Arial"/>
+          <w:rtl/>
+          <w:lang w:bidi="fa-IR"/>
+        </w:rPr>
+        <w:t xml:space="preserve">، </w:t>
+      </w:r>
+      <w:r>
+        <w:rPr>
+          <w:lang w:bidi="fa-IR"/>
+        </w:rPr>
+        <w:t>GET/PUT/DELETE /api/v1/tags/{id}</w:t>
+      </w:r>
+    </w:p>
+    <w:p>
+      <w:pPr>
+        <w:bidi/>
+        <w:rPr>
+          <w:lang w:bidi="fa-IR"/>
+        </w:rPr>
+      </w:pPr>
+      <w:r>
+        <w:rPr>
+          <w:rFonts w:cs="Arial"/>
+          <w:rtl/>
+          <w:lang w:bidi="fa-IR"/>
+        </w:rPr>
+        <w:t xml:space="preserve">- </w:t>
+      </w:r>
+      <w:r>
+        <w:rPr>
+          <w:lang w:bidi="fa-IR"/>
+        </w:rPr>
+        <w:t xml:space="preserve">GET /api/v1/tags/{id}/current </w:t>
+      </w:r>
+      <w:r>
+        <w:rPr>
+          <w:rFonts w:cs="Arial"/>
+          <w:rtl/>
+          <w:lang w:bidi="fa-IR"/>
+        </w:rPr>
+        <w:t xml:space="preserve">، </w:t>
+      </w:r>
+      <w:r>
+        <w:rPr>
+          <w:lang w:bidi="fa-IR"/>
+        </w:rPr>
+        <w:t>GET /api/v1/tags/{id}/history</w:t>
+      </w:r>
+    </w:p>
+    <w:p>
+      <w:pPr>
+        <w:bidi/>
+        <w:rPr>
+          <w:lang w:bidi="fa-IR"/>
+        </w:rPr>
+      </w:pPr>
+      <w:r>
+        <w:rPr>
+          <w:rFonts w:cs="Arial"/>
+          <w:rtl/>
+          <w:lang w:bidi="fa-IR"/>
+        </w:rPr>
+        <w:t xml:space="preserve">- </w:t>
+      </w:r>
+      <w:r>
+        <w:rPr>
+          <w:lang w:bidi="fa-IR"/>
+        </w:rPr>
+        <w:t xml:space="preserve">GET /api/v1/alarms </w:t>
+      </w:r>
+      <w:r>
+        <w:rPr>
+          <w:rFonts w:cs="Arial"/>
+          <w:rtl/>
+          <w:lang w:bidi="fa-IR"/>
+        </w:rPr>
+        <w:t xml:space="preserve">، </w:t>
+      </w:r>
+      <w:r>
+        <w:rPr>
+          <w:lang w:bidi="fa-IR"/>
+        </w:rPr>
+        <w:t>POST /api/v1/alarms/{id}/ack</w:t>
+      </w:r>
+    </w:p>
+    <w:p>
+      <w:pPr>
+        <w:bidi/>
+        <w:rPr>
+          <w:lang w:bidi="fa-IR"/>
+        </w:rPr>
+      </w:pPr>
+      <w:r>
+        <w:rPr>
+          <w:rFonts w:cs="Arial"/>
+          <w:rtl/>
+          <w:lang w:bidi="fa-IR"/>
+        </w:rPr>
+        <w:t xml:space="preserve">- </w:t>
+      </w:r>
+      <w:r>
+        <w:rPr>
+          <w:lang w:bidi="fa-IR"/>
+        </w:rPr>
+        <w:t>GET /api/v1/drivers</w:t>
+      </w:r>
+    </w:p>
+    <w:p>
+      <w:pPr>
+        <w:bidi/>
+        <w:rPr>
+          <w:lang w:bidi="fa-IR"/>
+        </w:rPr>
+      </w:pPr>
+      <w:r>
+        <w:rPr>
+          <w:rFonts w:cs="Arial"/>
+          <w:rtl/>
+          <w:lang w:bidi="fa-IR"/>
+        </w:rPr>
+        <w:t xml:space="preserve">- </w:t>
+      </w:r>
+      <w:r>
+        <w:rPr>
+          <w:lang w:bidi="fa-IR"/>
+        </w:rPr>
+        <w:t>CRUD</w:t>
+      </w:r>
+      <w:r>
+        <w:rPr>
+          <w:rFonts w:cs="Arial"/>
+          <w:rtl/>
+          <w:lang w:bidi="fa-IR"/>
+        </w:rPr>
+        <w:t xml:space="preserve"> داشبوردها: /</w:t>
+      </w:r>
+      <w:r>
+        <w:rPr>
+          <w:lang w:bidi="fa-IR"/>
+        </w:rPr>
+        <w:t>api/v1/dashboards (+ /content + /resources)</w:t>
+      </w:r>
+    </w:p>
+    <w:p>
+      <w:pPr>
+        <w:bidi/>
+        <w:rPr>
+          <w:lang w:bidi="fa-IR"/>
+        </w:rPr>
+      </w:pPr>
+      <w:r>
+        <w:rPr>
+          <w:rFonts w:cs="Arial"/>
+          <w:rtl/>
+          <w:lang w:bidi="fa-IR"/>
+        </w:rPr>
+        <w:t xml:space="preserve">- گزارش‌ها: </w:t>
+      </w:r>
+      <w:r>
+        <w:rPr>
+          <w:lang w:bidi="fa-IR"/>
+        </w:rPr>
+        <w:t>GET /api/v1/reports/tag-history|alarms|daily-summary</w:t>
+      </w:r>
+      <w:r>
+        <w:rPr>
+          <w:rFonts w:cs="Arial"/>
+          <w:rtl/>
+          <w:lang w:bidi="fa-IR"/>
+        </w:rPr>
+        <w:t xml:space="preserve"> (با ?</w:t>
+      </w:r>
+      <w:r>
+        <w:rPr>
+          <w:lang w:bidi="fa-IR"/>
+        </w:rPr>
+        <w:t>format=csv|json</w:t>
+      </w:r>
+      <w:r>
+        <w:rPr>
+          <w:rFonts w:cs="Arial"/>
+          <w:rtl/>
+          <w:lang w:bidi="fa-IR"/>
+        </w:rPr>
+        <w:t>)</w:t>
+      </w:r>
+    </w:p>
+    <w:p>
+      <w:pPr>
+        <w:bidi/>
+        <w:rPr>
+          <w:lang w:bidi="fa-IR"/>
+        </w:rPr>
+      </w:pPr>
+      <w:r>
+        <w:rPr>
+          <w:rFonts w:cs="Arial"/>
+          <w:rtl/>
+          <w:lang w:bidi="fa-IR"/>
+        </w:rPr>
+        <w:t>- مد</w:t>
+      </w:r>
+      <w:r>
+        <w:rPr>
+          <w:rFonts w:cs="Arial" w:hint="cs"/>
+          <w:rtl/>
+          <w:lang w:bidi="fa-IR"/>
+        </w:rPr>
+        <w:t>ی</w:t>
+      </w:r>
+      <w:r>
+        <w:rPr>
+          <w:rFonts w:cs="Arial" w:hint="eastAsia"/>
+          <w:rtl/>
+          <w:lang w:bidi="fa-IR"/>
+        </w:rPr>
+        <w:t>ر</w:t>
+      </w:r>
+      <w:r>
+        <w:rPr>
+          <w:rFonts w:cs="Arial" w:hint="cs"/>
+          <w:rtl/>
+          <w:lang w:bidi="fa-IR"/>
+        </w:rPr>
+        <w:t>ی</w:t>
+      </w:r>
+      <w:r>
+        <w:rPr>
+          <w:rFonts w:cs="Arial" w:hint="eastAsia"/>
+          <w:rtl/>
+          <w:lang w:bidi="fa-IR"/>
+        </w:rPr>
+        <w:t>ت</w:t>
+      </w:r>
+      <w:r>
+        <w:rPr>
+          <w:rFonts w:cs="Arial"/>
+          <w:rtl/>
+          <w:lang w:bidi="fa-IR"/>
+        </w:rPr>
+        <w:t xml:space="preserve"> کاربران: /</w:t>
+      </w:r>
+      <w:r>
+        <w:rPr>
+          <w:lang w:bidi="fa-IR"/>
+        </w:rPr>
+        <w:t>api/v1/users</w:t>
+      </w:r>
+      <w:r>
+        <w:rPr>
+          <w:rFonts w:cs="Arial"/>
+          <w:rtl/>
+          <w:lang w:bidi="fa-IR"/>
+        </w:rPr>
+        <w:t xml:space="preserve"> (نقش </w:t>
+      </w:r>
+      <w:r>
+        <w:rPr>
+          <w:lang w:bidi="fa-IR"/>
+        </w:rPr>
+        <w:t>admin</w:t>
+      </w:r>
+      <w:r>
+        <w:rPr>
+          <w:rFonts w:cs="Arial"/>
+          <w:rtl/>
+          <w:lang w:bidi="fa-IR"/>
+        </w:rPr>
+        <w:t>)</w:t>
+      </w:r>
+    </w:p>
+    <w:p>
+      <w:pPr>
+        <w:bidi/>
+        <w:rPr>
+          <w:lang w:bidi="fa-IR"/>
+        </w:rPr>
+      </w:pPr>
+      <w:r>
+        <w:rPr>
+          <w:rFonts w:cs="Arial"/>
+          <w:rtl/>
+          <w:lang w:bidi="fa-IR"/>
+        </w:rPr>
+        <w:t xml:space="preserve">- </w:t>
+      </w:r>
+      <w:r>
+        <w:rPr>
+          <w:lang w:bidi="fa-IR"/>
+        </w:rPr>
+        <w:t>GET /api/v1/system/status</w:t>
+      </w:r>
+      <w:r>
+        <w:rPr>
+          <w:rFonts w:cs="Arial"/>
+          <w:rtl/>
+          <w:lang w:bidi="fa-IR"/>
+        </w:rPr>
+        <w:t xml:space="preserve"> و /</w:t>
+      </w:r>
+      <w:r>
+        <w:rPr>
+          <w:lang w:bidi="fa-IR"/>
+        </w:rPr>
+        <w:t>api/v1/health</w:t>
+      </w:r>
+      <w:r>
+        <w:rPr>
+          <w:rFonts w:cs="Arial"/>
+          <w:rtl/>
+          <w:lang w:bidi="fa-IR"/>
+        </w:rPr>
+        <w:t xml:space="preserve"> (عموم</w:t>
+      </w:r>
+      <w:r>
+        <w:rPr>
+          <w:rFonts w:cs="Arial" w:hint="cs"/>
+          <w:rtl/>
+          <w:lang w:bidi="fa-IR"/>
+        </w:rPr>
+        <w:t>ی</w:t>
+      </w:r>
+      <w:r>
+        <w:rPr>
+          <w:rFonts w:cs="Arial"/>
+          <w:rtl/>
+          <w:lang w:bidi="fa-IR"/>
+        </w:rPr>
+        <w:t>)</w:t>
+      </w:r>
+    </w:p>
+    <w:p>
+      <w:pPr>
+        <w:bidi/>
+        <w:rPr>
+          <w:lang w:bidi="fa-IR"/>
+        </w:rPr>
+      </w:pPr>
+    </w:p>
+    <w:p>
+      <w:pPr>
+        <w:bidi/>
+        <w:rPr>
+          <w:lang w:bidi="fa-IR"/>
+        </w:rPr>
+      </w:pPr>
+      <w:r>
+        <w:rPr>
+          <w:rFonts w:cs="Arial"/>
+          <w:rtl/>
+          <w:lang w:bidi="fa-IR"/>
+        </w:rPr>
+        <w:t>## ماژول‌ها</w:t>
+      </w:r>
+      <w:r>
+        <w:rPr>
+          <w:rFonts w:cs="Arial" w:hint="cs"/>
+          <w:rtl/>
+          <w:lang w:bidi="fa-IR"/>
+        </w:rPr>
+        <w:t>ی</w:t>
+      </w:r>
+      <w:r>
+        <w:rPr>
+          <w:rFonts w:cs="Arial"/>
+          <w:rtl/>
+          <w:lang w:bidi="fa-IR"/>
+        </w:rPr>
+        <w:t xml:space="preserve"> </w:t>
+      </w:r>
+      <w:r>
+        <w:rPr>
+          <w:lang w:bidi="fa-IR"/>
+        </w:rPr>
+        <w:t>UI</w:t>
+      </w:r>
+      <w:r>
+        <w:rPr>
+          <w:rFonts w:cs="Arial"/>
+          <w:rtl/>
+          <w:lang w:bidi="fa-IR"/>
+        </w:rPr>
+        <w:t xml:space="preserve"> که با</w:t>
+      </w:r>
+      <w:r>
+        <w:rPr>
+          <w:rFonts w:cs="Arial" w:hint="cs"/>
+          <w:rtl/>
+          <w:lang w:bidi="fa-IR"/>
+        </w:rPr>
+        <w:t>ی</w:t>
+      </w:r>
+      <w:r>
+        <w:rPr>
+          <w:rFonts w:cs="Arial" w:hint="eastAsia"/>
+          <w:rtl/>
+          <w:lang w:bidi="fa-IR"/>
+        </w:rPr>
+        <w:t>د</w:t>
+      </w:r>
+      <w:r>
+        <w:rPr>
+          <w:rFonts w:cs="Arial"/>
+          <w:rtl/>
+          <w:lang w:bidi="fa-IR"/>
+        </w:rPr>
+        <w:t xml:space="preserve"> ساخته شوند (به ا</w:t>
+      </w:r>
+      <w:r>
+        <w:rPr>
+          <w:rFonts w:cs="Arial" w:hint="cs"/>
+          <w:rtl/>
+          <w:lang w:bidi="fa-IR"/>
+        </w:rPr>
+        <w:t>ی</w:t>
+      </w:r>
+      <w:r>
+        <w:rPr>
+          <w:rFonts w:cs="Arial" w:hint="eastAsia"/>
+          <w:rtl/>
+          <w:lang w:bidi="fa-IR"/>
+        </w:rPr>
+        <w:t>ن</w:t>
+      </w:r>
+      <w:r>
+        <w:rPr>
+          <w:rFonts w:cs="Arial"/>
+          <w:rtl/>
+          <w:lang w:bidi="fa-IR"/>
+        </w:rPr>
+        <w:t xml:space="preserve"> ترت</w:t>
+      </w:r>
+      <w:r>
+        <w:rPr>
+          <w:rFonts w:cs="Arial" w:hint="cs"/>
+          <w:rtl/>
+          <w:lang w:bidi="fa-IR"/>
+        </w:rPr>
+        <w:t>ی</w:t>
+      </w:r>
+      <w:r>
+        <w:rPr>
+          <w:rFonts w:cs="Arial" w:hint="eastAsia"/>
+          <w:rtl/>
+          <w:lang w:bidi="fa-IR"/>
+        </w:rPr>
+        <w:t>ب</w:t>
+      </w:r>
+      <w:r>
+        <w:rPr>
+          <w:rFonts w:cs="Arial"/>
+          <w:rtl/>
+          <w:lang w:bidi="fa-IR"/>
+        </w:rPr>
+        <w:t xml:space="preserve"> اولو</w:t>
+      </w:r>
+      <w:r>
+        <w:rPr>
+          <w:rFonts w:cs="Arial" w:hint="cs"/>
+          <w:rtl/>
+          <w:lang w:bidi="fa-IR"/>
+        </w:rPr>
+        <w:t>ی</w:t>
+      </w:r>
+      <w:r>
+        <w:rPr>
+          <w:rFonts w:cs="Arial" w:hint="eastAsia"/>
+          <w:rtl/>
+          <w:lang w:bidi="fa-IR"/>
+        </w:rPr>
+        <w:t>ت</w:t>
+      </w:r>
+      <w:r>
+        <w:rPr>
+          <w:rFonts w:cs="Arial"/>
+          <w:rtl/>
+          <w:lang w:bidi="fa-IR"/>
+        </w:rPr>
+        <w:t>)</w:t>
+      </w:r>
+    </w:p>
+    <w:p>
+      <w:pPr>
+        <w:bidi/>
+        <w:rPr>
+          <w:lang w:bidi="fa-IR"/>
+        </w:rPr>
+      </w:pPr>
+      <w:r>
+        <w:rPr>
+          <w:rFonts w:cs="Arial"/>
+          <w:rtl/>
+          <w:lang w:bidi="fa-IR"/>
+        </w:rPr>
+        <w:t>1. پنجره اتصال + لاگ</w:t>
+      </w:r>
+      <w:r>
+        <w:rPr>
+          <w:rFonts w:cs="Arial" w:hint="cs"/>
+          <w:rtl/>
+          <w:lang w:bidi="fa-IR"/>
+        </w:rPr>
+        <w:t>ی</w:t>
+      </w:r>
+      <w:r>
+        <w:rPr>
+          <w:rFonts w:cs="Arial" w:hint="eastAsia"/>
+          <w:rtl/>
+          <w:lang w:bidi="fa-IR"/>
+        </w:rPr>
+        <w:t>ن</w:t>
+      </w:r>
+      <w:r>
+        <w:rPr>
+          <w:rFonts w:cs="Arial"/>
+          <w:rtl/>
+          <w:lang w:bidi="fa-IR"/>
+        </w:rPr>
+        <w:t xml:space="preserve"> (مد</w:t>
+      </w:r>
+      <w:r>
+        <w:rPr>
+          <w:rFonts w:cs="Arial" w:hint="cs"/>
+          <w:rtl/>
+          <w:lang w:bidi="fa-IR"/>
+        </w:rPr>
+        <w:t>ی</w:t>
+      </w:r>
+      <w:r>
+        <w:rPr>
+          <w:rFonts w:cs="Arial" w:hint="eastAsia"/>
+          <w:rtl/>
+          <w:lang w:bidi="fa-IR"/>
+        </w:rPr>
+        <w:t>ر</w:t>
+      </w:r>
+      <w:r>
+        <w:rPr>
+          <w:rFonts w:cs="Arial" w:hint="cs"/>
+          <w:rtl/>
+          <w:lang w:bidi="fa-IR"/>
+        </w:rPr>
+        <w:t>ی</w:t>
+      </w:r>
+      <w:r>
+        <w:rPr>
+          <w:rFonts w:cs="Arial" w:hint="eastAsia"/>
+          <w:rtl/>
+          <w:lang w:bidi="fa-IR"/>
+        </w:rPr>
+        <w:t>ت</w:t>
+      </w:r>
+      <w:r>
+        <w:rPr>
+          <w:rFonts w:cs="Arial"/>
+          <w:rtl/>
+          <w:lang w:bidi="fa-IR"/>
+        </w:rPr>
+        <w:t xml:space="preserve"> </w:t>
+      </w:r>
+      <w:r>
+        <w:rPr>
+          <w:lang w:bidi="fa-IR"/>
+        </w:rPr>
+        <w:t>token</w:t>
+      </w:r>
+      <w:r>
+        <w:rPr>
+          <w:rFonts w:cs="Arial"/>
+          <w:rtl/>
+          <w:lang w:bidi="fa-IR"/>
+        </w:rPr>
+        <w:t>)</w:t>
+      </w:r>
+    </w:p>
+    <w:p>
+      <w:pPr>
+        <w:bidi/>
+        <w:rPr>
+          <w:lang w:bidi="fa-IR"/>
+        </w:rPr>
+      </w:pPr>
+      <w:r>
+        <w:rPr>
+          <w:rFonts w:cs="Arial"/>
+          <w:rtl/>
+          <w:lang w:bidi="fa-IR"/>
+        </w:rPr>
+        <w:t>2. نما</w:t>
+      </w:r>
+      <w:r>
+        <w:rPr>
+          <w:rFonts w:cs="Arial" w:hint="cs"/>
+          <w:rtl/>
+          <w:lang w:bidi="fa-IR"/>
+        </w:rPr>
+        <w:t>ی</w:t>
+      </w:r>
+      <w:r>
+        <w:rPr>
+          <w:rFonts w:cs="Arial" w:hint="eastAsia"/>
+          <w:rtl/>
+          <w:lang w:bidi="fa-IR"/>
+        </w:rPr>
+        <w:t>ش</w:t>
+      </w:r>
+      <w:r>
+        <w:rPr>
+          <w:rFonts w:cs="Arial"/>
+          <w:rtl/>
+          <w:lang w:bidi="fa-IR"/>
+        </w:rPr>
+        <w:t xml:space="preserve"> مقاد</w:t>
+      </w:r>
+      <w:r>
+        <w:rPr>
+          <w:rFonts w:cs="Arial" w:hint="cs"/>
+          <w:rtl/>
+          <w:lang w:bidi="fa-IR"/>
+        </w:rPr>
+        <w:t>ی</w:t>
+      </w:r>
+      <w:r>
+        <w:rPr>
+          <w:rFonts w:cs="Arial" w:hint="eastAsia"/>
+          <w:rtl/>
+          <w:lang w:bidi="fa-IR"/>
+        </w:rPr>
+        <w:t>ر</w:t>
+      </w:r>
+      <w:r>
+        <w:rPr>
+          <w:rFonts w:cs="Arial"/>
+          <w:rtl/>
+          <w:lang w:bidi="fa-IR"/>
+        </w:rPr>
+        <w:t xml:space="preserve"> زنده (جدول/کارت با </w:t>
+      </w:r>
+      <w:r>
+        <w:rPr>
+          <w:lang w:bidi="fa-IR"/>
+        </w:rPr>
+        <w:t>WebSocket</w:t>
+      </w:r>
+      <w:r>
+        <w:rPr>
+          <w:rFonts w:cs="Arial"/>
+          <w:rtl/>
+          <w:lang w:bidi="fa-IR"/>
+        </w:rPr>
+        <w:t>)</w:t>
+      </w:r>
+    </w:p>
+    <w:p>
+      <w:pPr>
+        <w:bidi/>
+        <w:rPr>
+          <w:lang w:bidi="fa-IR"/>
+        </w:rPr>
+      </w:pPr>
+      <w:r>
+        <w:rPr>
+          <w:rFonts w:cs="Arial"/>
+          <w:rtl/>
+          <w:lang w:bidi="fa-IR"/>
+        </w:rPr>
+        <w:t xml:space="preserve">3. پنل آلارم با دکمه </w:t>
+      </w:r>
+      <w:r>
+        <w:rPr>
+          <w:lang w:bidi="fa-IR"/>
+        </w:rPr>
+        <w:t>Ack</w:t>
+      </w:r>
+    </w:p>
+    <w:p>
+      <w:pPr>
+        <w:bidi/>
+        <w:rPr>
+          <w:lang w:bidi="fa-IR"/>
+        </w:rPr>
+      </w:pPr>
+      <w:r>
+        <w:rPr>
+          <w:rFonts w:cs="Arial"/>
+          <w:rtl/>
+          <w:lang w:bidi="fa-IR"/>
+        </w:rPr>
+        <w:lastRenderedPageBreak/>
+        <w:t xml:space="preserve">4. نمودار </w:t>
+      </w:r>
+      <w:r>
+        <w:rPr>
+          <w:lang w:bidi="fa-IR"/>
+        </w:rPr>
+        <w:t>Trend</w:t>
+      </w:r>
+      <w:r>
+        <w:rPr>
+          <w:rFonts w:cs="Arial"/>
+          <w:rtl/>
+          <w:lang w:bidi="fa-IR"/>
+        </w:rPr>
+        <w:t xml:space="preserve"> (تار</w:t>
+      </w:r>
+      <w:r>
+        <w:rPr>
+          <w:rFonts w:cs="Arial" w:hint="cs"/>
+          <w:rtl/>
+          <w:lang w:bidi="fa-IR"/>
+        </w:rPr>
+        <w:t>ی</w:t>
+      </w:r>
+      <w:r>
+        <w:rPr>
+          <w:rFonts w:cs="Arial" w:hint="eastAsia"/>
+          <w:rtl/>
+          <w:lang w:bidi="fa-IR"/>
+        </w:rPr>
+        <w:t>خچه</w:t>
+      </w:r>
+      <w:r>
+        <w:rPr>
+          <w:rFonts w:cs="Arial"/>
+          <w:rtl/>
+          <w:lang w:bidi="fa-IR"/>
+        </w:rPr>
+        <w:t xml:space="preserve"> با </w:t>
+      </w:r>
+      <w:r>
+        <w:rPr>
+          <w:lang w:bidi="fa-IR"/>
+        </w:rPr>
+        <w:t>REST</w:t>
+      </w:r>
+      <w:r>
+        <w:rPr>
+          <w:rFonts w:cs="Arial"/>
+          <w:rtl/>
+          <w:lang w:bidi="fa-IR"/>
+        </w:rPr>
+        <w:t>)</w:t>
+      </w:r>
+    </w:p>
+    <w:p>
+      <w:pPr>
+        <w:bidi/>
+        <w:rPr>
+          <w:lang w:bidi="fa-IR"/>
+        </w:rPr>
+      </w:pPr>
+      <w:r>
+        <w:rPr>
+          <w:rFonts w:cs="Arial"/>
+          <w:rtl/>
+          <w:lang w:bidi="fa-IR"/>
+        </w:rPr>
+        <w:t>5. مد</w:t>
+      </w:r>
+      <w:r>
+        <w:rPr>
+          <w:rFonts w:cs="Arial" w:hint="cs"/>
+          <w:rtl/>
+          <w:lang w:bidi="fa-IR"/>
+        </w:rPr>
+        <w:t>ی</w:t>
+      </w:r>
+      <w:r>
+        <w:rPr>
+          <w:rFonts w:cs="Arial" w:hint="eastAsia"/>
+          <w:rtl/>
+          <w:lang w:bidi="fa-IR"/>
+        </w:rPr>
+        <w:t>ر</w:t>
+      </w:r>
+      <w:r>
+        <w:rPr>
+          <w:rFonts w:cs="Arial" w:hint="cs"/>
+          <w:rtl/>
+          <w:lang w:bidi="fa-IR"/>
+        </w:rPr>
+        <w:t>ی</w:t>
+      </w:r>
+      <w:r>
+        <w:rPr>
+          <w:rFonts w:cs="Arial" w:hint="eastAsia"/>
+          <w:rtl/>
+          <w:lang w:bidi="fa-IR"/>
+        </w:rPr>
+        <w:t>ت</w:t>
+      </w:r>
+      <w:r>
+        <w:rPr>
+          <w:rFonts w:cs="Arial"/>
+          <w:rtl/>
+          <w:lang w:bidi="fa-IR"/>
+        </w:rPr>
+        <w:t xml:space="preserve"> تگ‌ها (فرم </w:t>
+      </w:r>
+      <w:r>
+        <w:rPr>
+          <w:lang w:bidi="fa-IR"/>
+        </w:rPr>
+        <w:t>CRUD</w:t>
+      </w:r>
+      <w:r>
+        <w:rPr>
+          <w:rFonts w:cs="Arial"/>
+          <w:rtl/>
+          <w:lang w:bidi="fa-IR"/>
+        </w:rPr>
+        <w:t>)</w:t>
+      </w:r>
+    </w:p>
+    <w:p>
+      <w:pPr>
+        <w:bidi/>
+        <w:rPr>
+          <w:lang w:bidi="fa-IR"/>
+        </w:rPr>
+      </w:pPr>
+      <w:r>
+        <w:rPr>
+          <w:rFonts w:cs="Arial"/>
+          <w:rtl/>
+          <w:lang w:bidi="fa-IR"/>
+        </w:rPr>
+        <w:t>6. وضع</w:t>
+      </w:r>
+      <w:r>
+        <w:rPr>
+          <w:rFonts w:cs="Arial" w:hint="cs"/>
+          <w:rtl/>
+          <w:lang w:bidi="fa-IR"/>
+        </w:rPr>
+        <w:t>ی</w:t>
+      </w:r>
+      <w:r>
+        <w:rPr>
+          <w:rFonts w:cs="Arial" w:hint="eastAsia"/>
+          <w:rtl/>
+          <w:lang w:bidi="fa-IR"/>
+        </w:rPr>
+        <w:t>ت</w:t>
+      </w:r>
+      <w:r>
+        <w:rPr>
+          <w:rFonts w:cs="Arial"/>
+          <w:rtl/>
+          <w:lang w:bidi="fa-IR"/>
+        </w:rPr>
+        <w:t xml:space="preserve"> درا</w:t>
+      </w:r>
+      <w:r>
+        <w:rPr>
+          <w:rFonts w:cs="Arial" w:hint="cs"/>
+          <w:rtl/>
+          <w:lang w:bidi="fa-IR"/>
+        </w:rPr>
+        <w:t>ی</w:t>
+      </w:r>
+      <w:r>
+        <w:rPr>
+          <w:rFonts w:cs="Arial" w:hint="eastAsia"/>
+          <w:rtl/>
+          <w:lang w:bidi="fa-IR"/>
+        </w:rPr>
+        <w:t>ورها</w:t>
+      </w:r>
+      <w:r>
+        <w:rPr>
+          <w:rFonts w:cs="Arial"/>
+          <w:rtl/>
+          <w:lang w:bidi="fa-IR"/>
+        </w:rPr>
+        <w:t xml:space="preserve"> (</w:t>
+      </w:r>
+      <w:r>
+        <w:rPr>
+          <w:lang w:bidi="fa-IR"/>
+        </w:rPr>
+        <w:t>start/stop/reload</w:t>
+      </w:r>
+      <w:r>
+        <w:rPr>
+          <w:rFonts w:cs="Arial"/>
+          <w:rtl/>
+          <w:lang w:bidi="fa-IR"/>
+        </w:rPr>
+        <w:t>)</w:t>
+      </w:r>
+    </w:p>
+    <w:p>
+      <w:pPr>
+        <w:bidi/>
+        <w:rPr>
+          <w:lang w:bidi="fa-IR"/>
+        </w:rPr>
+      </w:pPr>
+      <w:r>
+        <w:rPr>
+          <w:rFonts w:cs="Arial"/>
+          <w:rtl/>
+          <w:lang w:bidi="fa-IR"/>
+        </w:rPr>
+        <w:t xml:space="preserve">7. صفحه گزارش‌ها (دانلود </w:t>
+      </w:r>
+      <w:r>
+        <w:rPr>
+          <w:lang w:bidi="fa-IR"/>
+        </w:rPr>
+        <w:t>CSV</w:t>
+      </w:r>
+      <w:r>
+        <w:rPr>
+          <w:rFonts w:cs="Arial"/>
+          <w:rtl/>
+          <w:lang w:bidi="fa-IR"/>
+        </w:rPr>
+        <w:t>)</w:t>
+      </w:r>
+    </w:p>
+    <w:p>
+      <w:pPr>
+        <w:bidi/>
+        <w:rPr>
+          <w:lang w:bidi="fa-IR"/>
+        </w:rPr>
+      </w:pPr>
+      <w:r>
+        <w:rPr>
+          <w:rFonts w:cs="Arial"/>
+          <w:rtl/>
+          <w:lang w:bidi="fa-IR"/>
+        </w:rPr>
+        <w:t>8. مد</w:t>
+      </w:r>
+      <w:r>
+        <w:rPr>
+          <w:rFonts w:cs="Arial" w:hint="cs"/>
+          <w:rtl/>
+          <w:lang w:bidi="fa-IR"/>
+        </w:rPr>
+        <w:t>ی</w:t>
+      </w:r>
+      <w:r>
+        <w:rPr>
+          <w:rFonts w:cs="Arial" w:hint="eastAsia"/>
+          <w:rtl/>
+          <w:lang w:bidi="fa-IR"/>
+        </w:rPr>
+        <w:t>ر</w:t>
+      </w:r>
+      <w:r>
+        <w:rPr>
+          <w:rFonts w:cs="Arial" w:hint="cs"/>
+          <w:rtl/>
+          <w:lang w:bidi="fa-IR"/>
+        </w:rPr>
+        <w:t>ی</w:t>
+      </w:r>
+      <w:r>
+        <w:rPr>
+          <w:rFonts w:cs="Arial" w:hint="eastAsia"/>
+          <w:rtl/>
+          <w:lang w:bidi="fa-IR"/>
+        </w:rPr>
+        <w:t>ت</w:t>
+      </w:r>
+      <w:r>
+        <w:rPr>
+          <w:rFonts w:cs="Arial"/>
+          <w:rtl/>
+          <w:lang w:bidi="fa-IR"/>
+        </w:rPr>
+        <w:t xml:space="preserve"> کاربران (</w:t>
+      </w:r>
+      <w:r>
+        <w:rPr>
+          <w:lang w:bidi="fa-IR"/>
+        </w:rPr>
+        <w:t>admin</w:t>
+      </w:r>
+      <w:r>
+        <w:rPr>
+          <w:rFonts w:cs="Arial"/>
+          <w:rtl/>
+          <w:lang w:bidi="fa-IR"/>
+        </w:rPr>
+        <w:t>)</w:t>
+      </w:r>
+    </w:p>
+    <w:p>
+      <w:pPr>
+        <w:bidi/>
+        <w:rPr>
+          <w:lang w:bidi="fa-IR"/>
+        </w:rPr>
+      </w:pPr>
+      <w:r>
+        <w:rPr>
+          <w:rFonts w:cs="Arial"/>
+          <w:rtl/>
+          <w:lang w:bidi="fa-IR"/>
+        </w:rPr>
+        <w:t xml:space="preserve">9. رندر داشبورد </w:t>
+      </w:r>
+      <w:r>
+        <w:rPr>
+          <w:lang w:bidi="fa-IR"/>
+        </w:rPr>
+        <w:t>QML</w:t>
+      </w:r>
+      <w:r>
+        <w:rPr>
+          <w:rFonts w:cs="Arial"/>
+          <w:rtl/>
+          <w:lang w:bidi="fa-IR"/>
+        </w:rPr>
+        <w:t xml:space="preserve"> (مرحله بعد)</w:t>
+      </w:r>
+    </w:p>
+    <w:p>
+      <w:pPr>
+        <w:bidi/>
+        <w:rPr>
+          <w:lang w:bidi="fa-IR"/>
+        </w:rPr>
+      </w:pPr>
+    </w:p>
+    <w:p>
+      <w:pPr>
+        <w:bidi/>
+        <w:rPr>
+          <w:lang w:bidi="fa-IR"/>
+        </w:rPr>
+      </w:pPr>
+      <w:r>
+        <w:rPr>
+          <w:rFonts w:cs="Arial"/>
+          <w:rtl/>
+          <w:lang w:bidi="fa-IR"/>
+        </w:rPr>
+        <w:t>## قوان</w:t>
+      </w:r>
+      <w:r>
+        <w:rPr>
+          <w:rFonts w:cs="Arial" w:hint="cs"/>
+          <w:rtl/>
+          <w:lang w:bidi="fa-IR"/>
+        </w:rPr>
+        <w:t>ی</w:t>
+      </w:r>
+      <w:r>
+        <w:rPr>
+          <w:rFonts w:cs="Arial" w:hint="eastAsia"/>
+          <w:rtl/>
+          <w:lang w:bidi="fa-IR"/>
+        </w:rPr>
+        <w:t>ن</w:t>
+      </w:r>
+    </w:p>
+    <w:p>
+      <w:pPr>
+        <w:bidi/>
+        <w:rPr>
+          <w:lang w:bidi="fa-IR"/>
+        </w:rPr>
+      </w:pPr>
+      <w:r>
+        <w:rPr>
+          <w:rFonts w:cs="Arial"/>
+          <w:rtl/>
+          <w:lang w:bidi="fa-IR"/>
+        </w:rPr>
+        <w:t>- بک‌اند را تغ</w:t>
+      </w:r>
+      <w:r>
+        <w:rPr>
+          <w:rFonts w:cs="Arial" w:hint="cs"/>
+          <w:rtl/>
+          <w:lang w:bidi="fa-IR"/>
+        </w:rPr>
+        <w:t>یی</w:t>
+      </w:r>
+      <w:r>
+        <w:rPr>
+          <w:rFonts w:cs="Arial" w:hint="eastAsia"/>
+          <w:rtl/>
+          <w:lang w:bidi="fa-IR"/>
+        </w:rPr>
+        <w:t>ر</w:t>
+      </w:r>
+      <w:r>
+        <w:rPr>
+          <w:rFonts w:cs="Arial"/>
+          <w:rtl/>
+          <w:lang w:bidi="fa-IR"/>
+        </w:rPr>
+        <w:t xml:space="preserve"> نده؛ اگر </w:t>
+      </w:r>
+      <w:r>
+        <w:rPr>
+          <w:lang w:bidi="fa-IR"/>
+        </w:rPr>
+        <w:t>API</w:t>
+      </w:r>
+      <w:r>
+        <w:rPr>
+          <w:rFonts w:cs="Arial"/>
+          <w:rtl/>
+          <w:lang w:bidi="fa-IR"/>
+        </w:rPr>
+        <w:t xml:space="preserve"> کم بود، فهرست کن تا من در بک‌اند اضافه کنم.</w:t>
+      </w:r>
+    </w:p>
+    <w:p>
+      <w:pPr>
+        <w:bidi/>
+        <w:rPr>
+          <w:lang w:bidi="fa-IR"/>
+        </w:rPr>
+      </w:pPr>
+      <w:r>
+        <w:rPr>
+          <w:rFonts w:cs="Arial"/>
+          <w:rtl/>
+          <w:lang w:bidi="fa-IR"/>
+        </w:rPr>
+        <w:t xml:space="preserve">- داده زنده فقط از </w:t>
+      </w:r>
+      <w:r>
+        <w:rPr>
+          <w:lang w:bidi="fa-IR"/>
+        </w:rPr>
+        <w:t>WebSocket</w:t>
+      </w:r>
+      <w:r>
+        <w:rPr>
+          <w:rFonts w:cs="Arial"/>
+          <w:rtl/>
+          <w:lang w:bidi="fa-IR"/>
+        </w:rPr>
+        <w:t>، عمل</w:t>
+      </w:r>
+      <w:r>
+        <w:rPr>
+          <w:rFonts w:cs="Arial" w:hint="cs"/>
+          <w:rtl/>
+          <w:lang w:bidi="fa-IR"/>
+        </w:rPr>
+        <w:t>ی</w:t>
+      </w:r>
+      <w:r>
+        <w:rPr>
+          <w:rFonts w:cs="Arial" w:hint="eastAsia"/>
+          <w:rtl/>
+          <w:lang w:bidi="fa-IR"/>
+        </w:rPr>
+        <w:t>ات</w:t>
+      </w:r>
+      <w:r>
+        <w:rPr>
+          <w:rFonts w:cs="Arial"/>
+          <w:rtl/>
+          <w:lang w:bidi="fa-IR"/>
+        </w:rPr>
+        <w:t xml:space="preserve"> </w:t>
+      </w:r>
+      <w:r>
+        <w:rPr>
+          <w:lang w:bidi="fa-IR"/>
+        </w:rPr>
+        <w:t>CRUD</w:t>
+      </w:r>
+      <w:r>
+        <w:rPr>
+          <w:rFonts w:cs="Arial"/>
+          <w:rtl/>
+          <w:lang w:bidi="fa-IR"/>
+        </w:rPr>
+        <w:t xml:space="preserve"> فقط از </w:t>
+      </w:r>
+      <w:r>
+        <w:rPr>
+          <w:lang w:bidi="fa-IR"/>
+        </w:rPr>
+        <w:t>REST</w:t>
+      </w:r>
+      <w:r>
+        <w:rPr>
+          <w:rFonts w:cs="Arial"/>
+          <w:rtl/>
+          <w:lang w:bidi="fa-IR"/>
+        </w:rPr>
+        <w:t>.</w:t>
+      </w:r>
+    </w:p>
+    <w:p>
+      <w:pPr>
+        <w:bidi/>
+        <w:rPr>
+          <w:lang w:bidi="fa-IR"/>
+        </w:rPr>
+      </w:pPr>
+      <w:r>
+        <w:rPr>
+          <w:rFonts w:cs="Arial"/>
+          <w:rtl/>
+          <w:lang w:bidi="fa-IR"/>
+        </w:rPr>
+        <w:t xml:space="preserve">- اول ساختار پروژه </w:t>
+      </w:r>
+      <w:r>
+        <w:rPr>
+          <w:lang w:bidi="fa-IR"/>
+        </w:rPr>
+        <w:t>UI</w:t>
+      </w:r>
+      <w:r>
+        <w:rPr>
+          <w:rFonts w:cs="Arial"/>
+          <w:rtl/>
+          <w:lang w:bidi="fa-IR"/>
+        </w:rPr>
+        <w:t xml:space="preserve"> (پوشه‌ها، صفحات </w:t>
+      </w:r>
+      <w:r>
+        <w:rPr>
+          <w:lang w:bidi="fa-IR"/>
+        </w:rPr>
+        <w:t>QML</w:t>
+      </w:r>
+      <w:r>
+        <w:rPr>
+          <w:rFonts w:cs="Arial"/>
+          <w:rtl/>
+          <w:lang w:bidi="fa-IR"/>
+        </w:rPr>
+        <w:t>، مدل‌ها) را پ</w:t>
+      </w:r>
+      <w:r>
+        <w:rPr>
+          <w:rFonts w:cs="Arial" w:hint="cs"/>
+          <w:rtl/>
+          <w:lang w:bidi="fa-IR"/>
+        </w:rPr>
+        <w:t>ی</w:t>
+      </w:r>
+      <w:r>
+        <w:rPr>
+          <w:rFonts w:cs="Arial" w:hint="eastAsia"/>
+          <w:rtl/>
+          <w:lang w:bidi="fa-IR"/>
+        </w:rPr>
+        <w:t>شنهاد</w:t>
+      </w:r>
+      <w:r>
+        <w:rPr>
+          <w:rFonts w:cs="Arial"/>
+          <w:rtl/>
+          <w:lang w:bidi="fa-IR"/>
+        </w:rPr>
+        <w:t xml:space="preserve"> بده، بعد مرحله‌به‌مرحله پ</w:t>
+      </w:r>
+      <w:r>
+        <w:rPr>
+          <w:rFonts w:cs="Arial" w:hint="cs"/>
+          <w:rtl/>
+          <w:lang w:bidi="fa-IR"/>
+        </w:rPr>
+        <w:t>ی</w:t>
+      </w:r>
+      <w:r>
+        <w:rPr>
+          <w:rFonts w:cs="Arial" w:hint="eastAsia"/>
+          <w:rtl/>
+          <w:lang w:bidi="fa-IR"/>
+        </w:rPr>
+        <w:t>اده‌ساز</w:t>
+      </w:r>
+      <w:r>
+        <w:rPr>
+          <w:rFonts w:cs="Arial" w:hint="cs"/>
+          <w:rtl/>
+          <w:lang w:bidi="fa-IR"/>
+        </w:rPr>
+        <w:t>ی</w:t>
+      </w:r>
+      <w:r>
+        <w:rPr>
+          <w:rFonts w:cs="Arial"/>
+          <w:rtl/>
+          <w:lang w:bidi="fa-IR"/>
+        </w:rPr>
+        <w:t xml:space="preserve"> کن.</w:t>
+      </w:r>
+    </w:p>
+    <w:p>
+      <w:pPr>
+        <w:bidi/>
+        <w:rPr>
+          <w:rFonts w:hint="cs"/>
+          <w:lang w:bidi="fa-IR"/>
+        </w:rPr>
+      </w:pPr>
+      <w:r>
+        <w:rPr>
+          <w:rFonts w:cs="Arial"/>
+          <w:rtl/>
+          <w:lang w:bidi="fa-IR"/>
+        </w:rPr>
+        <w:t>- فا</w:t>
+      </w:r>
+      <w:r>
+        <w:rPr>
+          <w:rFonts w:cs="Arial" w:hint="cs"/>
+          <w:rtl/>
+          <w:lang w:bidi="fa-IR"/>
+        </w:rPr>
+        <w:t>ی</w:t>
+      </w:r>
+      <w:r>
+        <w:rPr>
+          <w:rFonts w:cs="Arial" w:hint="eastAsia"/>
+          <w:rtl/>
+          <w:lang w:bidi="fa-IR"/>
+        </w:rPr>
+        <w:t>ل‌ها</w:t>
+      </w:r>
+      <w:r>
+        <w:rPr>
+          <w:rFonts w:cs="Arial" w:hint="cs"/>
+          <w:rtl/>
+          <w:lang w:bidi="fa-IR"/>
+        </w:rPr>
+        <w:t>ی</w:t>
+      </w:r>
+      <w:r>
+        <w:rPr>
+          <w:rFonts w:cs="Arial"/>
+          <w:rtl/>
+          <w:lang w:bidi="fa-IR"/>
+        </w:rPr>
+        <w:t xml:space="preserve"> پ</w:t>
+      </w:r>
+      <w:r>
+        <w:rPr>
+          <w:rFonts w:cs="Arial" w:hint="cs"/>
+          <w:rtl/>
+          <w:lang w:bidi="fa-IR"/>
+        </w:rPr>
+        <w:t>ی</w:t>
+      </w:r>
+      <w:r>
+        <w:rPr>
+          <w:rFonts w:cs="Arial" w:hint="eastAsia"/>
+          <w:rtl/>
+          <w:lang w:bidi="fa-IR"/>
+        </w:rPr>
+        <w:t>وست</w:t>
+      </w:r>
+      <w:r>
+        <w:rPr>
+          <w:rFonts w:cs="Arial"/>
+          <w:rtl/>
+          <w:lang w:bidi="fa-IR"/>
+        </w:rPr>
+        <w:t xml:space="preserve"> (</w:t>
+      </w:r>
+      <w:r>
+        <w:rPr>
+          <w:lang w:bidi="fa-IR"/>
+        </w:rPr>
+        <w:t>tag_core_docs.html</w:t>
+      </w:r>
+      <w:r>
+        <w:rPr>
+          <w:rFonts w:cs="Arial"/>
+          <w:rtl/>
+          <w:lang w:bidi="fa-IR"/>
+        </w:rPr>
+        <w:t xml:space="preserve"> و </w:t>
+      </w:r>
+      <w:r>
+        <w:rPr>
+          <w:lang w:bidi="fa-IR"/>
+        </w:rPr>
+        <w:t>Models.h</w:t>
+      </w:r>
+      <w:r>
+        <w:rPr>
+          <w:rFonts w:cs="Arial"/>
+          <w:rtl/>
+          <w:lang w:bidi="fa-IR"/>
+        </w:rPr>
+        <w:t>) را اول بخوان، بعد پ</w:t>
+      </w:r>
+      <w:r>
+        <w:rPr>
+          <w:rFonts w:cs="Arial" w:hint="cs"/>
+          <w:rtl/>
+          <w:lang w:bidi="fa-IR"/>
+        </w:rPr>
+        <w:t>ی</w:t>
+      </w:r>
+      <w:r>
+        <w:rPr>
+          <w:rFonts w:cs="Arial" w:hint="eastAsia"/>
+          <w:rtl/>
+          <w:lang w:bidi="fa-IR"/>
+        </w:rPr>
+        <w:t>شنهاد</w:t>
+      </w:r>
+      <w:r>
+        <w:rPr>
+          <w:rFonts w:cs="Arial"/>
+          <w:rtl/>
+          <w:lang w:bidi="fa-IR"/>
+        </w:rPr>
+        <w:t xml:space="preserve"> معمار</w:t>
+      </w:r>
+      <w:r>
+        <w:rPr>
+          <w:rFonts w:cs="Arial" w:hint="cs"/>
+          <w:rtl/>
+          <w:lang w:bidi="fa-IR"/>
+        </w:rPr>
+        <w:t>ی</w:t>
+      </w:r>
+      <w:r>
+        <w:rPr>
+          <w:rFonts w:cs="Arial"/>
+          <w:rtl/>
+          <w:lang w:bidi="fa-IR"/>
+        </w:rPr>
+        <w:t xml:space="preserve"> </w:t>
+      </w:r>
+      <w:r>
+        <w:rPr>
+          <w:lang w:bidi="fa-IR"/>
+        </w:rPr>
+        <w:t>UI</w:t>
+      </w:r>
+      <w:r>
+        <w:rPr>
+          <w:rFonts w:cs="Arial"/>
+          <w:rtl/>
+          <w:lang w:bidi="fa-IR"/>
+        </w:rPr>
+        <w:t xml:space="preserve"> را بده.</w:t>
+      </w:r>
+      <w:bookmarkStart w:id="0" w:name="_GoBack"/>
+      <w:bookmarkEnd w:id="0"/>
     </w:p>
     <w:sectPr>
       <w:pgSz w:w="12240" w:h="15840"/>
@@ -8552,7 +12337,7 @@
 </file>
 
 <file path=customXml/itemProps1.xml><?xml version="1.0" encoding="utf-8"?>
-<ds:datastoreItem xmlns:ds="http://schemas.openxmlformats.org/officeDocument/2006/customXml" ds:itemID="{C8DD77F3-D093-4A8F-8A0E-8129686A10F5}">
+<ds:datastoreItem xmlns:ds="http://schemas.openxmlformats.org/officeDocument/2006/customXml" ds:itemID="{B229CEBB-60F1-442A-BB61-DB48A57347F0}">
   <ds:schemaRefs>
     <ds:schemaRef ds:uri="http://schemas.openxmlformats.org/officeDocument/2006/bibliography"/>
   </ds:schemaRefs>

</xml_diff>